<commit_message>
Revizija rada: varijabilnost u tabelama, objasnjenje AUC agregacije, ogranicenja 360 podataka
- Tabela 2 (K-Fold): prosek +/- SD kroz 5 foldova (macro agregacija)
- Tabela 3 (LOTO): rezultat po svakom turniru + prosek +/- SD
- Nova sekcija 4.3b + Tabela 3a: usklađivanje 0,772 (macro) vs 0,709 (pooled)
  AUC, i za kalibrisane i nekalibrisane predikcije na istim opservacijama
- Ogranicenja: freeze-frame je staticki snimak, ne kontinuirani tracking;
  ne obuhvata brzinu/kretanje/orijentaciju/vreme za reakciju; ref Sharpe 2024
- Nove analitičke skripte i izlazne tabele
</commit_message>
<xml_diff>
--- a/xg_rad_nacrt.docx
+++ b/xg_rad_nacrt.docx
@@ -126,7 +126,7 @@
       <w:tr>
         <w:tc>
           <w:tcPr>
-            <w:tcW w:type="dxa" w:w="4680"/>
+            <w:tcW w:type="dxa" w:w="9360"/>
             <w:tcBorders>
               <w:top w:val="none" w:color="FFFFFF" w:sz="0"/>
               <w:left w:val="none" w:color="FFFFFF" w:sz="0"/>
@@ -154,39 +154,6 @@
                 <w:szCs w:val="22"/>
               </w:rPr>
               <w:t xml:space="preserve">Tomislav Fedek</w:t>
-            </w:r>
-          </w:p>
-        </w:tc>
-        <w:tc>
-          <w:tcPr>
-            <w:tcW w:type="dxa" w:w="4680"/>
-            <w:tcBorders>
-              <w:top w:val="none" w:color="FFFFFF" w:sz="0"/>
-              <w:left w:val="none" w:color="FFFFFF" w:sz="0"/>
-              <w:bottom w:val="none" w:color="FFFFFF" w:sz="0"/>
-              <w:right w:val="none" w:color="FFFFFF" w:sz="0"/>
-            </w:tcBorders>
-          </w:tcPr>
-          <w:p>
-            <w:r>
-              <w:rPr>
-                <w:rFonts w:ascii="Calibri" w:cs="Calibri" w:eastAsia="Calibri" w:hAnsi="Calibri"/>
-                <w:b/>
-                <w:bCs/>
-                <w:sz w:val="22"/>
-                <w:szCs w:val="22"/>
-              </w:rPr>
-              <w:t xml:space="preserve">Mentor / konsultacija:</w:t>
-            </w:r>
-          </w:p>
-          <w:p>
-            <w:r>
-              <w:rPr>
-                <w:rFonts w:ascii="Calibri" w:cs="Calibri" w:eastAsia="Calibri" w:hAnsi="Calibri"/>
-                <w:sz w:val="22"/>
-                <w:szCs w:val="22"/>
-              </w:rPr>
-              <w:t xml:space="preserve">prof. dr Zoltán Pap (predlog)</w:t>
             </w:r>
           </w:p>
         </w:tc>
@@ -3198,7 +3165,7 @@
           <w:sz w:val="18"/>
           <w:szCs w:val="18"/>
         </w:rPr>
-        <w:t xml:space="preserve">Tabela 2. Rezultati StratifiedGroupKFold po meču validacije (prosek kroz 5 foldova). Brier skor prikazuje vrednost posle post-hoc kalibracije (izotona regresija unutar folda).</w:t>
+        <w:t xml:space="preserve">Tabela 2. Rezultati StratifiedGroupKFold po meču validacije, iskazani kao prosek plus-minus standardna devijacija kroz 5 foldova. Prosek i standardna devijacija računaju se preko pet foldova (agregacija tipa prosek-preko-foldova, engl. macro), a ne kao jedinstvena metrika na spojenim predikcijama. Brier skor prikazuje vrednost posle post-hoc kalibracije (izotona regresija unutar folda).</w:t>
       </w:r>
     </w:p>
     <w:tbl>
@@ -3214,11 +3181,11 @@
         </w:tblBorders>
       </w:tblPr>
       <w:tblGrid>
-        <w:gridCol w:w="3360"/>
-        <w:gridCol w:w="1500"/>
-        <w:gridCol w:w="1500"/>
-        <w:gridCol w:w="1500"/>
-        <w:gridCol w:w="1500"/>
+        <w:gridCol w:w="2760"/>
+        <w:gridCol w:w="1650"/>
+        <w:gridCol w:w="1650"/>
+        <w:gridCol w:w="1650"/>
+        <w:gridCol w:w="1650"/>
       </w:tblGrid>
       <w:tr>
         <w:trPr>
@@ -3226,7 +3193,7 @@
         </w:trPr>
         <w:tc>
           <w:tcPr>
-            <w:tcW w:type="dxa" w:w="3360"/>
+            <w:tcW w:type="dxa" w:w="2760"/>
             <w:tcBorders>
               <w:top w:val="single" w:color="BFBFBF" w:sz="4"/>
               <w:left w:val="single" w:color="BFBFBF" w:sz="4"/>
@@ -3261,7 +3228,7 @@
         </w:tc>
         <w:tc>
           <w:tcPr>
-            <w:tcW w:type="dxa" w:w="1500"/>
+            <w:tcW w:type="dxa" w:w="1650"/>
             <w:tcBorders>
               <w:top w:val="single" w:color="BFBFBF" w:sz="4"/>
               <w:left w:val="single" w:color="BFBFBF" w:sz="4"/>
@@ -3296,7 +3263,7 @@
         </w:tc>
         <w:tc>
           <w:tcPr>
-            <w:tcW w:type="dxa" w:w="1500"/>
+            <w:tcW w:type="dxa" w:w="1650"/>
             <w:tcBorders>
               <w:top w:val="single" w:color="BFBFBF" w:sz="4"/>
               <w:left w:val="single" w:color="BFBFBF" w:sz="4"/>
@@ -3331,7 +3298,7 @@
         </w:tc>
         <w:tc>
           <w:tcPr>
-            <w:tcW w:type="dxa" w:w="1500"/>
+            <w:tcW w:type="dxa" w:w="1650"/>
             <w:tcBorders>
               <w:top w:val="single" w:color="BFBFBF" w:sz="4"/>
               <w:left w:val="single" w:color="BFBFBF" w:sz="4"/>
@@ -3366,7 +3333,7 @@
         </w:tc>
         <w:tc>
           <w:tcPr>
-            <w:tcW w:type="dxa" w:w="1500"/>
+            <w:tcW w:type="dxa" w:w="1650"/>
             <w:tcBorders>
               <w:top w:val="single" w:color="BFBFBF" w:sz="4"/>
               <w:left w:val="single" w:color="BFBFBF" w:sz="4"/>
@@ -3403,7 +3370,7 @@
       <w:tr>
         <w:tc>
           <w:tcPr>
-            <w:tcW w:type="dxa" w:w="3360"/>
+            <w:tcW w:type="dxa" w:w="2760"/>
             <w:tcBorders>
               <w:top w:val="single" w:color="BFBFBF" w:sz="4"/>
               <w:left w:val="single" w:color="BFBFBF" w:sz="4"/>
@@ -3435,7 +3402,7 @@
         </w:tc>
         <w:tc>
           <w:tcPr>
-            <w:tcW w:type="dxa" w:w="1500"/>
+            <w:tcW w:type="dxa" w:w="1650"/>
             <w:tcBorders>
               <w:top w:val="single" w:color="BFBFBF" w:sz="4"/>
               <w:left w:val="single" w:color="BFBFBF" w:sz="4"/>
@@ -3461,13 +3428,13 @@
                 <w:sz w:val="19"/>
                 <w:szCs w:val="19"/>
               </w:rPr>
-              <w:t xml:space="preserve">0,755</w:t>
-            </w:r>
-          </w:p>
-        </w:tc>
-        <w:tc>
-          <w:tcPr>
-            <w:tcW w:type="dxa" w:w="1500"/>
+              <w:t xml:space="preserve">0,758 ± 0,022</w:t>
+            </w:r>
+          </w:p>
+        </w:tc>
+        <w:tc>
+          <w:tcPr>
+            <w:tcW w:type="dxa" w:w="1650"/>
             <w:tcBorders>
               <w:top w:val="single" w:color="BFBFBF" w:sz="4"/>
               <w:left w:val="single" w:color="BFBFBF" w:sz="4"/>
@@ -3493,13 +3460,13 @@
                 <w:sz w:val="19"/>
                 <w:szCs w:val="19"/>
               </w:rPr>
-              <w:t xml:space="preserve">0,296</w:t>
-            </w:r>
-          </w:p>
-        </w:tc>
-        <w:tc>
-          <w:tcPr>
-            <w:tcW w:type="dxa" w:w="1500"/>
+              <w:t xml:space="preserve">0,315 ± 0,064</w:t>
+            </w:r>
+          </w:p>
+        </w:tc>
+        <w:tc>
+          <w:tcPr>
+            <w:tcW w:type="dxa" w:w="1650"/>
             <w:tcBorders>
               <w:top w:val="single" w:color="BFBFBF" w:sz="4"/>
               <w:left w:val="single" w:color="BFBFBF" w:sz="4"/>
@@ -3525,13 +3492,13 @@
                 <w:sz w:val="19"/>
                 <w:szCs w:val="19"/>
               </w:rPr>
-              <w:t xml:space="preserve">0,358</w:t>
-            </w:r>
-          </w:p>
-        </w:tc>
-        <w:tc>
-          <w:tcPr>
-            <w:tcW w:type="dxa" w:w="1500"/>
+              <w:t xml:space="preserve">0,374 ± 0,060</w:t>
+            </w:r>
+          </w:p>
+        </w:tc>
+        <w:tc>
+          <w:tcPr>
+            <w:tcW w:type="dxa" w:w="1650"/>
             <w:tcBorders>
               <w:top w:val="single" w:color="BFBFBF" w:sz="4"/>
               <w:left w:val="single" w:color="BFBFBF" w:sz="4"/>
@@ -3557,7 +3524,7 @@
                 <w:sz w:val="19"/>
                 <w:szCs w:val="19"/>
               </w:rPr>
-              <w:t xml:space="preserve">0,076</w:t>
+              <w:t xml:space="preserve">0,076 ± 0,005</w:t>
             </w:r>
           </w:p>
         </w:tc>
@@ -3565,7 +3532,7 @@
       <w:tr>
         <w:tc>
           <w:tcPr>
-            <w:tcW w:type="dxa" w:w="3360"/>
+            <w:tcW w:type="dxa" w:w="2760"/>
             <w:tcBorders>
               <w:top w:val="single" w:color="BFBFBF" w:sz="4"/>
               <w:left w:val="single" w:color="BFBFBF" w:sz="4"/>
@@ -3597,7 +3564,7 @@
         </w:tc>
         <w:tc>
           <w:tcPr>
-            <w:tcW w:type="dxa" w:w="1500"/>
+            <w:tcW w:type="dxa" w:w="1650"/>
             <w:tcBorders>
               <w:top w:val="single" w:color="BFBFBF" w:sz="4"/>
               <w:left w:val="single" w:color="BFBFBF" w:sz="4"/>
@@ -3623,13 +3590,13 @@
                 <w:sz w:val="19"/>
                 <w:szCs w:val="19"/>
               </w:rPr>
-              <w:t xml:space="preserve">0,753</w:t>
-            </w:r>
-          </w:p>
-        </w:tc>
-        <w:tc>
-          <w:tcPr>
-            <w:tcW w:type="dxa" w:w="1500"/>
+              <w:t xml:space="preserve">0,758 ± 0,023</w:t>
+            </w:r>
+          </w:p>
+        </w:tc>
+        <w:tc>
+          <w:tcPr>
+            <w:tcW w:type="dxa" w:w="1650"/>
             <w:tcBorders>
               <w:top w:val="single" w:color="BFBFBF" w:sz="4"/>
               <w:left w:val="single" w:color="BFBFBF" w:sz="4"/>
@@ -3655,13 +3622,13 @@
                 <w:sz w:val="19"/>
                 <w:szCs w:val="19"/>
               </w:rPr>
-              <w:t xml:space="preserve">0,297</w:t>
-            </w:r>
-          </w:p>
-        </w:tc>
-        <w:tc>
-          <w:tcPr>
-            <w:tcW w:type="dxa" w:w="1500"/>
+              <w:t xml:space="preserve">0,308 ± 0,046</w:t>
+            </w:r>
+          </w:p>
+        </w:tc>
+        <w:tc>
+          <w:tcPr>
+            <w:tcW w:type="dxa" w:w="1650"/>
             <w:tcBorders>
               <w:top w:val="single" w:color="BFBFBF" w:sz="4"/>
               <w:left w:val="single" w:color="BFBFBF" w:sz="4"/>
@@ -3687,13 +3654,13 @@
                 <w:sz w:val="19"/>
                 <w:szCs w:val="19"/>
               </w:rPr>
-              <w:t xml:space="preserve">0,348</w:t>
-            </w:r>
-          </w:p>
-        </w:tc>
-        <w:tc>
-          <w:tcPr>
-            <w:tcW w:type="dxa" w:w="1500"/>
+              <w:t xml:space="preserve">0,373 ± 0,033</w:t>
+            </w:r>
+          </w:p>
+        </w:tc>
+        <w:tc>
+          <w:tcPr>
+            <w:tcW w:type="dxa" w:w="1650"/>
             <w:tcBorders>
               <w:top w:val="single" w:color="BFBFBF" w:sz="4"/>
               <w:left w:val="single" w:color="BFBFBF" w:sz="4"/>
@@ -3719,7 +3686,7 @@
                 <w:sz w:val="19"/>
                 <w:szCs w:val="19"/>
               </w:rPr>
-              <w:t xml:space="preserve">0,076</w:t>
+              <w:t xml:space="preserve">0,076 ± 0,004</w:t>
             </w:r>
           </w:p>
         </w:tc>
@@ -3727,7 +3694,7 @@
       <w:tr>
         <w:tc>
           <w:tcPr>
-            <w:tcW w:type="dxa" w:w="3360"/>
+            <w:tcW w:type="dxa" w:w="2760"/>
             <w:tcBorders>
               <w:top w:val="single" w:color="BFBFBF" w:sz="4"/>
               <w:left w:val="single" w:color="BFBFBF" w:sz="4"/>
@@ -3759,7 +3726,7 @@
         </w:tc>
         <w:tc>
           <w:tcPr>
-            <w:tcW w:type="dxa" w:w="1500"/>
+            <w:tcW w:type="dxa" w:w="1650"/>
             <w:tcBorders>
               <w:top w:val="single" w:color="BFBFBF" w:sz="4"/>
               <w:left w:val="single" w:color="BFBFBF" w:sz="4"/>
@@ -3785,13 +3752,13 @@
                 <w:sz w:val="19"/>
                 <w:szCs w:val="19"/>
               </w:rPr>
-              <w:t xml:space="preserve">0,770</w:t>
-            </w:r>
-          </w:p>
-        </w:tc>
-        <w:tc>
-          <w:tcPr>
-            <w:tcW w:type="dxa" w:w="1500"/>
+              <w:t xml:space="preserve">0,772 ± 0,026</w:t>
+            </w:r>
+          </w:p>
+        </w:tc>
+        <w:tc>
+          <w:tcPr>
+            <w:tcW w:type="dxa" w:w="1650"/>
             <w:tcBorders>
               <w:top w:val="single" w:color="BFBFBF" w:sz="4"/>
               <w:left w:val="single" w:color="BFBFBF" w:sz="4"/>
@@ -3817,13 +3784,13 @@
                 <w:sz w:val="19"/>
                 <w:szCs w:val="19"/>
               </w:rPr>
-              <w:t xml:space="preserve">0,322</w:t>
-            </w:r>
-          </w:p>
-        </w:tc>
-        <w:tc>
-          <w:tcPr>
-            <w:tcW w:type="dxa" w:w="1500"/>
+              <w:t xml:space="preserve">0,332 ± 0,054</w:t>
+            </w:r>
+          </w:p>
+        </w:tc>
+        <w:tc>
+          <w:tcPr>
+            <w:tcW w:type="dxa" w:w="1650"/>
             <w:tcBorders>
               <w:top w:val="single" w:color="BFBFBF" w:sz="4"/>
               <w:left w:val="single" w:color="BFBFBF" w:sz="4"/>
@@ -3849,13 +3816,13 @@
                 <w:sz w:val="19"/>
                 <w:szCs w:val="19"/>
               </w:rPr>
-              <w:t xml:space="preserve">0,378</w:t>
-            </w:r>
-          </w:p>
-        </w:tc>
-        <w:tc>
-          <w:tcPr>
-            <w:tcW w:type="dxa" w:w="1500"/>
+              <w:t xml:space="preserve">0,388 ± 0,052</w:t>
+            </w:r>
+          </w:p>
+        </w:tc>
+        <w:tc>
+          <w:tcPr>
+            <w:tcW w:type="dxa" w:w="1650"/>
             <w:tcBorders>
               <w:top w:val="single" w:color="BFBFBF" w:sz="4"/>
               <w:left w:val="single" w:color="BFBFBF" w:sz="4"/>
@@ -3881,7 +3848,7 @@
                 <w:sz w:val="19"/>
                 <w:szCs w:val="19"/>
               </w:rPr>
-              <w:t xml:space="preserve">0,074</w:t>
+              <w:t xml:space="preserve">0,074 ± 0,004</w:t>
             </w:r>
           </w:p>
         </w:tc>
@@ -3889,7 +3856,7 @@
       <w:tr>
         <w:tc>
           <w:tcPr>
-            <w:tcW w:type="dxa" w:w="3360"/>
+            <w:tcW w:type="dxa" w:w="2760"/>
             <w:tcBorders>
               <w:top w:val="single" w:color="BFBFBF" w:sz="4"/>
               <w:left w:val="single" w:color="BFBFBF" w:sz="4"/>
@@ -3921,7 +3888,7 @@
         </w:tc>
         <w:tc>
           <w:tcPr>
-            <w:tcW w:type="dxa" w:w="1500"/>
+            <w:tcW w:type="dxa" w:w="1650"/>
             <w:tcBorders>
               <w:top w:val="single" w:color="BFBFBF" w:sz="4"/>
               <w:left w:val="single" w:color="BFBFBF" w:sz="4"/>
@@ -3947,13 +3914,13 @@
                 <w:sz w:val="19"/>
                 <w:szCs w:val="19"/>
               </w:rPr>
-              <w:t xml:space="preserve">0,759</w:t>
-            </w:r>
-          </w:p>
-        </w:tc>
-        <w:tc>
-          <w:tcPr>
-            <w:tcW w:type="dxa" w:w="1500"/>
+              <w:t xml:space="preserve">0,763 ± 0,017</w:t>
+            </w:r>
+          </w:p>
+        </w:tc>
+        <w:tc>
+          <w:tcPr>
+            <w:tcW w:type="dxa" w:w="1650"/>
             <w:tcBorders>
               <w:top w:val="single" w:color="BFBFBF" w:sz="4"/>
               <w:left w:val="single" w:color="BFBFBF" w:sz="4"/>
@@ -3979,13 +3946,13 @@
                 <w:sz w:val="19"/>
                 <w:szCs w:val="19"/>
               </w:rPr>
-              <w:t xml:space="preserve">0,285</w:t>
-            </w:r>
-          </w:p>
-        </w:tc>
-        <w:tc>
-          <w:tcPr>
-            <w:tcW w:type="dxa" w:w="1500"/>
+              <w:t xml:space="preserve">0,297 ± 0,037</w:t>
+            </w:r>
+          </w:p>
+        </w:tc>
+        <w:tc>
+          <w:tcPr>
+            <w:tcW w:type="dxa" w:w="1650"/>
             <w:tcBorders>
               <w:top w:val="single" w:color="BFBFBF" w:sz="4"/>
               <w:left w:val="single" w:color="BFBFBF" w:sz="4"/>
@@ -4011,13 +3978,13 @@
                 <w:sz w:val="19"/>
                 <w:szCs w:val="19"/>
               </w:rPr>
-              <w:t xml:space="preserve">0,376</w:t>
-            </w:r>
-          </w:p>
-        </w:tc>
-        <w:tc>
-          <w:tcPr>
-            <w:tcW w:type="dxa" w:w="1500"/>
+              <w:t xml:space="preserve">0,388 ± 0,029</w:t>
+            </w:r>
+          </w:p>
+        </w:tc>
+        <w:tc>
+          <w:tcPr>
+            <w:tcW w:type="dxa" w:w="1650"/>
             <w:tcBorders>
               <w:top w:val="single" w:color="BFBFBF" w:sz="4"/>
               <w:left w:val="single" w:color="BFBFBF" w:sz="4"/>
@@ -4043,7 +4010,7 @@
                 <w:sz w:val="19"/>
                 <w:szCs w:val="19"/>
               </w:rPr>
-              <w:t xml:space="preserve">0,077</w:t>
+              <w:t xml:space="preserve">0,077 ± 0,003</w:t>
             </w:r>
           </w:p>
         </w:tc>
@@ -4061,7 +4028,7 @@
           <w:sz w:val="22"/>
           <w:szCs w:val="22"/>
         </w:rPr>
-        <w:t xml:space="preserve">Model B nadmašuje Model A na ROC AUC i PR AUC metrikama, bez obzira na to koji algoritam je korišćen. Razlika u kalibriranom Brier skoru je minimalna ali konzistentno u korist Modela B za logističku regresiju, dok je za XGBoost praktično izjednačena.</w:t>
+        <w:t xml:space="preserve">Model B nadmašuje Model A na ROC AUC i PR AUC metrikama, bez obzira na to koji algoritam je korišćen. Razlika u kalibriranom Brier skoru je minimalna ali konzistentno u korist Modela B za logističku regresiju, dok je za XGBoost praktično izjednačena. Standardne devijacije kroz foldove su umerene (0,017 do 0,026 za ROC AUC), što ukazuje na stabilnost performansi kroz različite podele podataka; intervali prosek plus-minus jedna standardna devijacija se između Modela A i Modela B delimično preklapaju, pa formalno testiranje značajnosti razlike sledi u odeljku 4.3a.</w:t>
       </w:r>
     </w:p>
     <w:p>
@@ -4070,6 +4037,21 @@
       </w:pPr>
       <w:r>
         <w:t xml:space="preserve">4.3. Generalizacija kroz turnire: Leave-One-Tournament-Out validacija</w:t>
+      </w:r>
+    </w:p>
+    <w:p>
+      <w:pPr>
+        <w:spacing w:after="160" w:line="276"/>
+        <w:ind w:firstLine="397"/>
+        <w:jc w:val="both"/>
+      </w:pPr>
+      <w:r>
+        <w:rPr>
+          <w:rFonts w:ascii="Calibri" w:cs="Calibri" w:eastAsia="Calibri" w:hAnsi="Calibri"/>
+          <w:sz w:val="22"/>
+          <w:szCs w:val="22"/>
+        </w:rPr>
+        <w:t xml:space="preserve">Za razliku od StratifiedGroupKFold validacije, Leave-One-Tournament-Out (LOTO) šema ima samo tri folda (po jedan za svaki izostavljeni turnir). Zbog malog broja foldova, standardna devijacija kroz turnire ima ograničenu preciznost kao ocena varijabilnosti; zato u Tabeli 3 prikazujemo rezultat za svaki izostavljeni turnir pojedinačno, a prosek i standardnu devijaciju navodimo isključivo kao deskriptivni sažetak, ne kao osnovu za inferenciju. Prikazani prosek je prosek-preko-turnira (macro agregacija).</w:t>
       </w:r>
     </w:p>
     <w:p>
@@ -4086,7 +4068,7 @@
           <w:sz w:val="18"/>
           <w:szCs w:val="18"/>
         </w:rPr>
-        <w:t xml:space="preserve">Tabela 3. Rezultati Leave-One-Tournament-Out validacije (prosek kroz tri turnira). Brier skor prikazuje vrednost posle post-hoc kalibracije.</w:t>
+        <w:t xml:space="preserve">Tabela 3. Rezultati Leave-One-Tournament-Out validacije po pojedinačnom izostavljenom turniru, sa deskriptivnim prosekom plus-minus standardnom devijacijom kroz tri turnira (macro agregacija). Brier skor prikazuje vrednost posle post-hoc kalibracije. Prosek preko tri turnira može se blago razlikovati od jedinstvene metrike izračunate na svim spojenim out-of-fold predikcijama (pooled agregacija); vidi odeljak 4.3a.</w:t>
       </w:r>
     </w:p>
     <w:tbl>
@@ -4102,11 +4084,12 @@
         </w:tblBorders>
       </w:tblPr>
       <w:tblGrid>
-        <w:gridCol w:w="3360"/>
-        <w:gridCol w:w="1500"/>
-        <w:gridCol w:w="1500"/>
-        <w:gridCol w:w="1500"/>
-        <w:gridCol w:w="1500"/>
+        <w:gridCol w:w="2340"/>
+        <w:gridCol w:w="1620"/>
+        <w:gridCol w:w="1350"/>
+        <w:gridCol w:w="1350"/>
+        <w:gridCol w:w="1350"/>
+        <w:gridCol w:w="1350"/>
       </w:tblGrid>
       <w:tr>
         <w:trPr>
@@ -4114,7 +4097,7 @@
         </w:trPr>
         <w:tc>
           <w:tcPr>
-            <w:tcW w:type="dxa" w:w="3360"/>
+            <w:tcW w:type="dxa" w:w="2340"/>
             <w:tcBorders>
               <w:top w:val="single" w:color="BFBFBF" w:sz="4"/>
               <w:left w:val="single" w:color="BFBFBF" w:sz="4"/>
@@ -4149,7 +4132,7 @@
         </w:tc>
         <w:tc>
           <w:tcPr>
-            <w:tcW w:type="dxa" w:w="1500"/>
+            <w:tcW w:type="dxa" w:w="1620"/>
             <w:tcBorders>
               <w:top w:val="single" w:color="BFBFBF" w:sz="4"/>
               <w:left w:val="single" w:color="BFBFBF" w:sz="4"/>
@@ -4178,13 +4161,13 @@
                 <w:sz w:val="19"/>
                 <w:szCs w:val="19"/>
               </w:rPr>
-              <w:t xml:space="preserve">ROC AUC</w:t>
-            </w:r>
-          </w:p>
-        </w:tc>
-        <w:tc>
-          <w:tcPr>
-            <w:tcW w:type="dxa" w:w="1500"/>
+              <w:t xml:space="preserve">Izostavljeni turnir</w:t>
+            </w:r>
+          </w:p>
+        </w:tc>
+        <w:tc>
+          <w:tcPr>
+            <w:tcW w:type="dxa" w:w="1350"/>
             <w:tcBorders>
               <w:top w:val="single" w:color="BFBFBF" w:sz="4"/>
               <w:left w:val="single" w:color="BFBFBF" w:sz="4"/>
@@ -4213,13 +4196,13 @@
                 <w:sz w:val="19"/>
                 <w:szCs w:val="19"/>
               </w:rPr>
-              <w:t xml:space="preserve">PR AUC</w:t>
-            </w:r>
-          </w:p>
-        </w:tc>
-        <w:tc>
-          <w:tcPr>
-            <w:tcW w:type="dxa" w:w="1500"/>
+              <w:t xml:space="preserve">ROC AUC</w:t>
+            </w:r>
+          </w:p>
+        </w:tc>
+        <w:tc>
+          <w:tcPr>
+            <w:tcW w:type="dxa" w:w="1350"/>
             <w:tcBorders>
               <w:top w:val="single" w:color="BFBFBF" w:sz="4"/>
               <w:left w:val="single" w:color="BFBFBF" w:sz="4"/>
@@ -4248,13 +4231,13 @@
                 <w:sz w:val="19"/>
                 <w:szCs w:val="19"/>
               </w:rPr>
-              <w:t xml:space="preserve">F1</w:t>
-            </w:r>
-          </w:p>
-        </w:tc>
-        <w:tc>
-          <w:tcPr>
-            <w:tcW w:type="dxa" w:w="1500"/>
+              <w:t xml:space="preserve">PR AUC</w:t>
+            </w:r>
+          </w:p>
+        </w:tc>
+        <w:tc>
+          <w:tcPr>
+            <w:tcW w:type="dxa" w:w="1350"/>
             <w:tcBorders>
               <w:top w:val="single" w:color="BFBFBF" w:sz="4"/>
               <w:left w:val="single" w:color="BFBFBF" w:sz="4"/>
@@ -4283,6 +4266,41 @@
                 <w:sz w:val="19"/>
                 <w:szCs w:val="19"/>
               </w:rPr>
+              <w:t xml:space="preserve">F1</w:t>
+            </w:r>
+          </w:p>
+        </w:tc>
+        <w:tc>
+          <w:tcPr>
+            <w:tcW w:type="dxa" w:w="1350"/>
+            <w:tcBorders>
+              <w:top w:val="single" w:color="BFBFBF" w:sz="4"/>
+              <w:left w:val="single" w:color="BFBFBF" w:sz="4"/>
+              <w:bottom w:val="single" w:color="BFBFBF" w:sz="4"/>
+              <w:right w:val="single" w:color="BFBFBF" w:sz="4"/>
+            </w:tcBorders>
+            <w:shd w:fill="1F3864" w:val="clear"/>
+            <w:tcMar>
+              <w:top w:type="dxa" w:w="80"/>
+              <w:left w:type="dxa" w:w="120"/>
+              <w:bottom w:type="dxa" w:w="80"/>
+              <w:right w:type="dxa" w:w="120"/>
+            </w:tcMar>
+            <w:vAlign w:val="center"/>
+          </w:tcPr>
+          <w:p>
+            <w:pPr>
+              <w:jc w:val="center"/>
+            </w:pPr>
+            <w:r>
+              <w:rPr>
+                <w:rFonts w:ascii="Calibri" w:cs="Calibri" w:eastAsia="Calibri" w:hAnsi="Calibri"/>
+                <w:b/>
+                <w:bCs/>
+                <w:color w:val="FFFFFF"/>
+                <w:sz w:val="19"/>
+                <w:szCs w:val="19"/>
+              </w:rPr>
               <w:t xml:space="preserve">Brier skor</w:t>
             </w:r>
           </w:p>
@@ -4291,7 +4309,7 @@
       <w:tr>
         <w:tc>
           <w:tcPr>
-            <w:tcW w:type="dxa" w:w="3360"/>
+            <w:tcW w:type="dxa" w:w="2340"/>
             <w:tcBorders>
               <w:top w:val="single" w:color="BFBFBF" w:sz="4"/>
               <w:left w:val="single" w:color="BFBFBF" w:sz="4"/>
@@ -4323,7 +4341,7 @@
         </w:tc>
         <w:tc>
           <w:tcPr>
-            <w:tcW w:type="dxa" w:w="1500"/>
+            <w:tcW w:type="dxa" w:w="1620"/>
             <w:tcBorders>
               <w:top w:val="single" w:color="BFBFBF" w:sz="4"/>
               <w:left w:val="single" w:color="BFBFBF" w:sz="4"/>
@@ -4349,13 +4367,13 @@
                 <w:sz w:val="19"/>
                 <w:szCs w:val="19"/>
               </w:rPr>
-              <w:t xml:space="preserve">0,761</w:t>
-            </w:r>
-          </w:p>
-        </w:tc>
-        <w:tc>
-          <w:tcPr>
-            <w:tcW w:type="dxa" w:w="1500"/>
+              <w:t xml:space="preserve">FIFA SP 2022</w:t>
+            </w:r>
+          </w:p>
+        </w:tc>
+        <w:tc>
+          <w:tcPr>
+            <w:tcW w:type="dxa" w:w="1350"/>
             <w:tcBorders>
               <w:top w:val="single" w:color="BFBFBF" w:sz="4"/>
               <w:left w:val="single" w:color="BFBFBF" w:sz="4"/>
@@ -4381,13 +4399,13 @@
                 <w:sz w:val="19"/>
                 <w:szCs w:val="19"/>
               </w:rPr>
-              <w:t xml:space="preserve">0,302</w:t>
-            </w:r>
-          </w:p>
-        </w:tc>
-        <w:tc>
-          <w:tcPr>
-            <w:tcW w:type="dxa" w:w="1500"/>
+              <w:t xml:space="preserve">0,779</w:t>
+            </w:r>
+          </w:p>
+        </w:tc>
+        <w:tc>
+          <w:tcPr>
+            <w:tcW w:type="dxa" w:w="1350"/>
             <w:tcBorders>
               <w:top w:val="single" w:color="BFBFBF" w:sz="4"/>
               <w:left w:val="single" w:color="BFBFBF" w:sz="4"/>
@@ -4413,13 +4431,13 @@
                 <w:sz w:val="19"/>
                 <w:szCs w:val="19"/>
               </w:rPr>
-              <w:t xml:space="preserve">0,355</w:t>
-            </w:r>
-          </w:p>
-        </w:tc>
-        <w:tc>
-          <w:tcPr>
-            <w:tcW w:type="dxa" w:w="1500"/>
+              <w:t xml:space="preserve">0,358</w:t>
+            </w:r>
+          </w:p>
+        </w:tc>
+        <w:tc>
+          <w:tcPr>
+            <w:tcW w:type="dxa" w:w="1350"/>
             <w:tcBorders>
               <w:top w:val="single" w:color="BFBFBF" w:sz="4"/>
               <w:left w:val="single" w:color="BFBFBF" w:sz="4"/>
@@ -4445,7 +4463,39 @@
                 <w:sz w:val="19"/>
                 <w:szCs w:val="19"/>
               </w:rPr>
-              <w:t xml:space="preserve">0,075</w:t>
+              <w:t xml:space="preserve">0,394</w:t>
+            </w:r>
+          </w:p>
+        </w:tc>
+        <w:tc>
+          <w:tcPr>
+            <w:tcW w:type="dxa" w:w="1350"/>
+            <w:tcBorders>
+              <w:top w:val="single" w:color="BFBFBF" w:sz="4"/>
+              <w:left w:val="single" w:color="BFBFBF" w:sz="4"/>
+              <w:bottom w:val="single" w:color="BFBFBF" w:sz="4"/>
+              <w:right w:val="single" w:color="BFBFBF" w:sz="4"/>
+            </w:tcBorders>
+            <w:shd w:fill="FFFFFF" w:val="clear"/>
+            <w:tcMar>
+              <w:top w:type="dxa" w:w="60"/>
+              <w:left w:type="dxa" w:w="120"/>
+              <w:bottom w:type="dxa" w:w="60"/>
+              <w:right w:type="dxa" w:w="120"/>
+            </w:tcMar>
+            <w:vAlign w:val="center"/>
+          </w:tcPr>
+          <w:p>
+            <w:pPr>
+              <w:jc w:val="center"/>
+            </w:pPr>
+            <w:r>
+              <w:rPr>
+                <w:rFonts w:ascii="Calibri" w:cs="Calibri" w:eastAsia="Calibri" w:hAnsi="Calibri"/>
+                <w:sz w:val="19"/>
+                <w:szCs w:val="19"/>
+              </w:rPr>
+              <w:t xml:space="preserve">0,082</w:t>
             </w:r>
           </w:p>
         </w:tc>
@@ -4453,7 +4503,7 @@
       <w:tr>
         <w:tc>
           <w:tcPr>
-            <w:tcW w:type="dxa" w:w="3360"/>
+            <w:tcW w:type="dxa" w:w="2340"/>
             <w:tcBorders>
               <w:top w:val="single" w:color="BFBFBF" w:sz="4"/>
               <w:left w:val="single" w:color="BFBFBF" w:sz="4"/>
@@ -4479,13 +4529,13 @@
                 <w:sz w:val="19"/>
                 <w:szCs w:val="19"/>
               </w:rPr>
-              <w:t xml:space="preserve">Model A, XGBoost</w:t>
-            </w:r>
-          </w:p>
-        </w:tc>
-        <w:tc>
-          <w:tcPr>
-            <w:tcW w:type="dxa" w:w="1500"/>
+              <w:t xml:space="preserve"/>
+            </w:r>
+          </w:p>
+        </w:tc>
+        <w:tc>
+          <w:tcPr>
+            <w:tcW w:type="dxa" w:w="1620"/>
             <w:tcBorders>
               <w:top w:val="single" w:color="BFBFBF" w:sz="4"/>
               <w:left w:val="single" w:color="BFBFBF" w:sz="4"/>
@@ -4511,13 +4561,13 @@
                 <w:sz w:val="19"/>
                 <w:szCs w:val="19"/>
               </w:rPr>
-              <w:t xml:space="preserve">0,763</w:t>
-            </w:r>
-          </w:p>
-        </w:tc>
-        <w:tc>
-          <w:tcPr>
-            <w:tcW w:type="dxa" w:w="1500"/>
+              <w:t xml:space="preserve">UEFA EP 2020</w:t>
+            </w:r>
+          </w:p>
+        </w:tc>
+        <w:tc>
+          <w:tcPr>
+            <w:tcW w:type="dxa" w:w="1350"/>
             <w:tcBorders>
               <w:top w:val="single" w:color="BFBFBF" w:sz="4"/>
               <w:left w:val="single" w:color="BFBFBF" w:sz="4"/>
@@ -4543,13 +4593,13 @@
                 <w:sz w:val="19"/>
                 <w:szCs w:val="19"/>
               </w:rPr>
-              <w:t xml:space="preserve">0,296</w:t>
-            </w:r>
-          </w:p>
-        </w:tc>
-        <w:tc>
-          <w:tcPr>
-            <w:tcW w:type="dxa" w:w="1500"/>
+              <w:t xml:space="preserve">0,765</w:t>
+            </w:r>
+          </w:p>
+        </w:tc>
+        <w:tc>
+          <w:tcPr>
+            <w:tcW w:type="dxa" w:w="1350"/>
             <w:tcBorders>
               <w:top w:val="single" w:color="BFBFBF" w:sz="4"/>
               <w:left w:val="single" w:color="BFBFBF" w:sz="4"/>
@@ -4575,13 +4625,13 @@
                 <w:sz w:val="19"/>
                 <w:szCs w:val="19"/>
               </w:rPr>
-              <w:t xml:space="preserve">0,357</w:t>
-            </w:r>
-          </w:p>
-        </w:tc>
-        <w:tc>
-          <w:tcPr>
-            <w:tcW w:type="dxa" w:w="1500"/>
+              <w:t xml:space="preserve">0,324</w:t>
+            </w:r>
+          </w:p>
+        </w:tc>
+        <w:tc>
+          <w:tcPr>
+            <w:tcW w:type="dxa" w:w="1350"/>
             <w:tcBorders>
               <w:top w:val="single" w:color="BFBFBF" w:sz="4"/>
               <w:left w:val="single" w:color="BFBFBF" w:sz="4"/>
@@ -4607,7 +4657,39 @@
                 <w:sz w:val="19"/>
                 <w:szCs w:val="19"/>
               </w:rPr>
-              <w:t xml:space="preserve">0,076</w:t>
+              <w:t xml:space="preserve">0,393</w:t>
+            </w:r>
+          </w:p>
+        </w:tc>
+        <w:tc>
+          <w:tcPr>
+            <w:tcW w:type="dxa" w:w="1350"/>
+            <w:tcBorders>
+              <w:top w:val="single" w:color="BFBFBF" w:sz="4"/>
+              <w:left w:val="single" w:color="BFBFBF" w:sz="4"/>
+              <w:bottom w:val="single" w:color="BFBFBF" w:sz="4"/>
+              <w:right w:val="single" w:color="BFBFBF" w:sz="4"/>
+            </w:tcBorders>
+            <w:shd w:fill="F2F2F2" w:val="clear"/>
+            <w:tcMar>
+              <w:top w:type="dxa" w:w="60"/>
+              <w:left w:type="dxa" w:w="120"/>
+              <w:bottom w:type="dxa" w:w="60"/>
+              <w:right w:type="dxa" w:w="120"/>
+            </w:tcMar>
+            <w:vAlign w:val="center"/>
+          </w:tcPr>
+          <w:p>
+            <w:pPr>
+              <w:jc w:val="center"/>
+            </w:pPr>
+            <w:r>
+              <w:rPr>
+                <w:rFonts w:ascii="Calibri" w:cs="Calibri" w:eastAsia="Calibri" w:hAnsi="Calibri"/>
+                <w:sz w:val="19"/>
+                <w:szCs w:val="19"/>
+              </w:rPr>
+              <w:t xml:space="preserve">0,078</w:t>
             </w:r>
           </w:p>
         </w:tc>
@@ -4615,7 +4697,7 @@
       <w:tr>
         <w:tc>
           <w:tcPr>
-            <w:tcW w:type="dxa" w:w="3360"/>
+            <w:tcW w:type="dxa" w:w="2340"/>
             <w:tcBorders>
               <w:top w:val="single" w:color="BFBFBF" w:sz="4"/>
               <w:left w:val="single" w:color="BFBFBF" w:sz="4"/>
@@ -4641,13 +4723,13 @@
                 <w:sz w:val="19"/>
                 <w:szCs w:val="19"/>
               </w:rPr>
-              <w:t xml:space="preserve">Model B, logistička regresija</w:t>
-            </w:r>
-          </w:p>
-        </w:tc>
-        <w:tc>
-          <w:tcPr>
-            <w:tcW w:type="dxa" w:w="1500"/>
+              <w:t xml:space="preserve"/>
+            </w:r>
+          </w:p>
+        </w:tc>
+        <w:tc>
+          <w:tcPr>
+            <w:tcW w:type="dxa" w:w="1620"/>
             <w:tcBorders>
               <w:top w:val="single" w:color="BFBFBF" w:sz="4"/>
               <w:left w:val="single" w:color="BFBFBF" w:sz="4"/>
@@ -4673,13 +4755,13 @@
                 <w:sz w:val="19"/>
                 <w:szCs w:val="19"/>
               </w:rPr>
-              <w:t xml:space="preserve">0,772</w:t>
-            </w:r>
-          </w:p>
-        </w:tc>
-        <w:tc>
-          <w:tcPr>
-            <w:tcW w:type="dxa" w:w="1500"/>
+              <w:t xml:space="preserve">UEFA EP 2024</w:t>
+            </w:r>
+          </w:p>
+        </w:tc>
+        <w:tc>
+          <w:tcPr>
+            <w:tcW w:type="dxa" w:w="1350"/>
             <w:tcBorders>
               <w:top w:val="single" w:color="BFBFBF" w:sz="4"/>
               <w:left w:val="single" w:color="BFBFBF" w:sz="4"/>
@@ -4705,13 +4787,13 @@
                 <w:sz w:val="19"/>
                 <w:szCs w:val="19"/>
               </w:rPr>
-              <w:t xml:space="preserve">0,324</w:t>
-            </w:r>
-          </w:p>
-        </w:tc>
-        <w:tc>
-          <w:tcPr>
-            <w:tcW w:type="dxa" w:w="1500"/>
+              <w:t xml:space="preserve">0,745</w:t>
+            </w:r>
+          </w:p>
+        </w:tc>
+        <w:tc>
+          <w:tcPr>
+            <w:tcW w:type="dxa" w:w="1350"/>
             <w:tcBorders>
               <w:top w:val="single" w:color="BFBFBF" w:sz="4"/>
               <w:left w:val="single" w:color="BFBFBF" w:sz="4"/>
@@ -4737,13 +4819,13 @@
                 <w:sz w:val="19"/>
                 <w:szCs w:val="19"/>
               </w:rPr>
-              <w:t xml:space="preserve">0,387</w:t>
-            </w:r>
-          </w:p>
-        </w:tc>
-        <w:tc>
-          <w:tcPr>
-            <w:tcW w:type="dxa" w:w="1500"/>
+              <w:t xml:space="preserve">0,221</w:t>
+            </w:r>
+          </w:p>
+        </w:tc>
+        <w:tc>
+          <w:tcPr>
+            <w:tcW w:type="dxa" w:w="1350"/>
             <w:tcBorders>
               <w:top w:val="single" w:color="BFBFBF" w:sz="4"/>
               <w:left w:val="single" w:color="BFBFBF" w:sz="4"/>
@@ -4769,7 +4851,39 @@
                 <w:sz w:val="19"/>
                 <w:szCs w:val="19"/>
               </w:rPr>
-              <w:t xml:space="preserve">0,074</w:t>
+              <w:t xml:space="preserve">0,300</w:t>
+            </w:r>
+          </w:p>
+        </w:tc>
+        <w:tc>
+          <w:tcPr>
+            <w:tcW w:type="dxa" w:w="1350"/>
+            <w:tcBorders>
+              <w:top w:val="single" w:color="BFBFBF" w:sz="4"/>
+              <w:left w:val="single" w:color="BFBFBF" w:sz="4"/>
+              <w:bottom w:val="single" w:color="BFBFBF" w:sz="4"/>
+              <w:right w:val="single" w:color="BFBFBF" w:sz="4"/>
+            </w:tcBorders>
+            <w:shd w:fill="FFFFFF" w:val="clear"/>
+            <w:tcMar>
+              <w:top w:type="dxa" w:w="60"/>
+              <w:left w:type="dxa" w:w="120"/>
+              <w:bottom w:type="dxa" w:w="60"/>
+              <w:right w:type="dxa" w:w="120"/>
+            </w:tcMar>
+            <w:vAlign w:val="center"/>
+          </w:tcPr>
+          <w:p>
+            <w:pPr>
+              <w:jc w:val="center"/>
+            </w:pPr>
+            <w:r>
+              <w:rPr>
+                <w:rFonts w:ascii="Calibri" w:cs="Calibri" w:eastAsia="Calibri" w:hAnsi="Calibri"/>
+                <w:sz w:val="19"/>
+                <w:szCs w:val="19"/>
+              </w:rPr>
+              <w:t xml:space="preserve">0,066</w:t>
             </w:r>
           </w:p>
         </w:tc>
@@ -4777,7 +4891,7 @@
       <w:tr>
         <w:tc>
           <w:tcPr>
-            <w:tcW w:type="dxa" w:w="3360"/>
+            <w:tcW w:type="dxa" w:w="2340"/>
             <w:tcBorders>
               <w:top w:val="single" w:color="BFBFBF" w:sz="4"/>
               <w:left w:val="single" w:color="BFBFBF" w:sz="4"/>
@@ -4803,13 +4917,1921 @@
                 <w:sz w:val="19"/>
                 <w:szCs w:val="19"/>
               </w:rPr>
+              <w:t xml:space="preserve"/>
+            </w:r>
+          </w:p>
+        </w:tc>
+        <w:tc>
+          <w:tcPr>
+            <w:tcW w:type="dxa" w:w="1620"/>
+            <w:tcBorders>
+              <w:top w:val="single" w:color="BFBFBF" w:sz="4"/>
+              <w:left w:val="single" w:color="BFBFBF" w:sz="4"/>
+              <w:bottom w:val="single" w:color="BFBFBF" w:sz="4"/>
+              <w:right w:val="single" w:color="BFBFBF" w:sz="4"/>
+            </w:tcBorders>
+            <w:shd w:fill="F2F2F2" w:val="clear"/>
+            <w:tcMar>
+              <w:top w:type="dxa" w:w="60"/>
+              <w:left w:type="dxa" w:w="120"/>
+              <w:bottom w:type="dxa" w:w="60"/>
+              <w:right w:type="dxa" w:w="120"/>
+            </w:tcMar>
+            <w:vAlign w:val="center"/>
+          </w:tcPr>
+          <w:p>
+            <w:pPr>
+              <w:jc w:val="center"/>
+            </w:pPr>
+            <w:r>
+              <w:rPr>
+                <w:rFonts w:ascii="Calibri" w:cs="Calibri" w:eastAsia="Calibri" w:hAnsi="Calibri"/>
+                <w:sz w:val="19"/>
+                <w:szCs w:val="19"/>
+              </w:rPr>
+              <w:t xml:space="preserve">prosek ± SD</w:t>
+            </w:r>
+          </w:p>
+        </w:tc>
+        <w:tc>
+          <w:tcPr>
+            <w:tcW w:type="dxa" w:w="1350"/>
+            <w:tcBorders>
+              <w:top w:val="single" w:color="BFBFBF" w:sz="4"/>
+              <w:left w:val="single" w:color="BFBFBF" w:sz="4"/>
+              <w:bottom w:val="single" w:color="BFBFBF" w:sz="4"/>
+              <w:right w:val="single" w:color="BFBFBF" w:sz="4"/>
+            </w:tcBorders>
+            <w:shd w:fill="F2F2F2" w:val="clear"/>
+            <w:tcMar>
+              <w:top w:type="dxa" w:w="60"/>
+              <w:left w:type="dxa" w:w="120"/>
+              <w:bottom w:type="dxa" w:w="60"/>
+              <w:right w:type="dxa" w:w="120"/>
+            </w:tcMar>
+            <w:vAlign w:val="center"/>
+          </w:tcPr>
+          <w:p>
+            <w:pPr>
+              <w:jc w:val="center"/>
+            </w:pPr>
+            <w:r>
+              <w:rPr>
+                <w:rFonts w:ascii="Calibri" w:cs="Calibri" w:eastAsia="Calibri" w:hAnsi="Calibri"/>
+                <w:sz w:val="19"/>
+                <w:szCs w:val="19"/>
+              </w:rPr>
+              <w:t xml:space="preserve">0,763 ± 0,017</w:t>
+            </w:r>
+          </w:p>
+        </w:tc>
+        <w:tc>
+          <w:tcPr>
+            <w:tcW w:type="dxa" w:w="1350"/>
+            <w:tcBorders>
+              <w:top w:val="single" w:color="BFBFBF" w:sz="4"/>
+              <w:left w:val="single" w:color="BFBFBF" w:sz="4"/>
+              <w:bottom w:val="single" w:color="BFBFBF" w:sz="4"/>
+              <w:right w:val="single" w:color="BFBFBF" w:sz="4"/>
+            </w:tcBorders>
+            <w:shd w:fill="F2F2F2" w:val="clear"/>
+            <w:tcMar>
+              <w:top w:type="dxa" w:w="60"/>
+              <w:left w:type="dxa" w:w="120"/>
+              <w:bottom w:type="dxa" w:w="60"/>
+              <w:right w:type="dxa" w:w="120"/>
+            </w:tcMar>
+            <w:vAlign w:val="center"/>
+          </w:tcPr>
+          <w:p>
+            <w:pPr>
+              <w:jc w:val="center"/>
+            </w:pPr>
+            <w:r>
+              <w:rPr>
+                <w:rFonts w:ascii="Calibri" w:cs="Calibri" w:eastAsia="Calibri" w:hAnsi="Calibri"/>
+                <w:sz w:val="19"/>
+                <w:szCs w:val="19"/>
+              </w:rPr>
+              <w:t xml:space="preserve">0,301 ± 0,071</w:t>
+            </w:r>
+          </w:p>
+        </w:tc>
+        <w:tc>
+          <w:tcPr>
+            <w:tcW w:type="dxa" w:w="1350"/>
+            <w:tcBorders>
+              <w:top w:val="single" w:color="BFBFBF" w:sz="4"/>
+              <w:left w:val="single" w:color="BFBFBF" w:sz="4"/>
+              <w:bottom w:val="single" w:color="BFBFBF" w:sz="4"/>
+              <w:right w:val="single" w:color="BFBFBF" w:sz="4"/>
+            </w:tcBorders>
+            <w:shd w:fill="F2F2F2" w:val="clear"/>
+            <w:tcMar>
+              <w:top w:type="dxa" w:w="60"/>
+              <w:left w:type="dxa" w:w="120"/>
+              <w:bottom w:type="dxa" w:w="60"/>
+              <w:right w:type="dxa" w:w="120"/>
+            </w:tcMar>
+            <w:vAlign w:val="center"/>
+          </w:tcPr>
+          <w:p>
+            <w:pPr>
+              <w:jc w:val="center"/>
+            </w:pPr>
+            <w:r>
+              <w:rPr>
+                <w:rFonts w:ascii="Calibri" w:cs="Calibri" w:eastAsia="Calibri" w:hAnsi="Calibri"/>
+                <w:sz w:val="19"/>
+                <w:szCs w:val="19"/>
+              </w:rPr>
+              <w:t xml:space="preserve">0,362 ± 0,054</w:t>
+            </w:r>
+          </w:p>
+        </w:tc>
+        <w:tc>
+          <w:tcPr>
+            <w:tcW w:type="dxa" w:w="1350"/>
+            <w:tcBorders>
+              <w:top w:val="single" w:color="BFBFBF" w:sz="4"/>
+              <w:left w:val="single" w:color="BFBFBF" w:sz="4"/>
+              <w:bottom w:val="single" w:color="BFBFBF" w:sz="4"/>
+              <w:right w:val="single" w:color="BFBFBF" w:sz="4"/>
+            </w:tcBorders>
+            <w:shd w:fill="F2F2F2" w:val="clear"/>
+            <w:tcMar>
+              <w:top w:type="dxa" w:w="60"/>
+              <w:left w:type="dxa" w:w="120"/>
+              <w:bottom w:type="dxa" w:w="60"/>
+              <w:right w:type="dxa" w:w="120"/>
+            </w:tcMar>
+            <w:vAlign w:val="center"/>
+          </w:tcPr>
+          <w:p>
+            <w:pPr>
+              <w:jc w:val="center"/>
+            </w:pPr>
+            <w:r>
+              <w:rPr>
+                <w:rFonts w:ascii="Calibri" w:cs="Calibri" w:eastAsia="Calibri" w:hAnsi="Calibri"/>
+                <w:sz w:val="19"/>
+                <w:szCs w:val="19"/>
+              </w:rPr>
+              <w:t xml:space="preserve">0,075 ± 0,008</w:t>
+            </w:r>
+          </w:p>
+        </w:tc>
+      </w:tr>
+      <w:tr>
+        <w:tc>
+          <w:tcPr>
+            <w:tcW w:type="dxa" w:w="2340"/>
+            <w:tcBorders>
+              <w:top w:val="single" w:color="BFBFBF" w:sz="4"/>
+              <w:left w:val="single" w:color="BFBFBF" w:sz="4"/>
+              <w:bottom w:val="single" w:color="BFBFBF" w:sz="4"/>
+              <w:right w:val="single" w:color="BFBFBF" w:sz="4"/>
+            </w:tcBorders>
+            <w:shd w:fill="FFFFFF" w:val="clear"/>
+            <w:tcMar>
+              <w:top w:type="dxa" w:w="60"/>
+              <w:left w:type="dxa" w:w="120"/>
+              <w:bottom w:type="dxa" w:w="60"/>
+              <w:right w:type="dxa" w:w="120"/>
+            </w:tcMar>
+            <w:vAlign w:val="center"/>
+          </w:tcPr>
+          <w:p>
+            <w:pPr>
+              <w:jc w:val="left"/>
+            </w:pPr>
+            <w:r>
+              <w:rPr>
+                <w:rFonts w:ascii="Calibri" w:cs="Calibri" w:eastAsia="Calibri" w:hAnsi="Calibri"/>
+                <w:sz w:val="19"/>
+                <w:szCs w:val="19"/>
+              </w:rPr>
+              <w:t xml:space="preserve">Model A, XGBoost</w:t>
+            </w:r>
+          </w:p>
+        </w:tc>
+        <w:tc>
+          <w:tcPr>
+            <w:tcW w:type="dxa" w:w="1620"/>
+            <w:tcBorders>
+              <w:top w:val="single" w:color="BFBFBF" w:sz="4"/>
+              <w:left w:val="single" w:color="BFBFBF" w:sz="4"/>
+              <w:bottom w:val="single" w:color="BFBFBF" w:sz="4"/>
+              <w:right w:val="single" w:color="BFBFBF" w:sz="4"/>
+            </w:tcBorders>
+            <w:shd w:fill="FFFFFF" w:val="clear"/>
+            <w:tcMar>
+              <w:top w:type="dxa" w:w="60"/>
+              <w:left w:type="dxa" w:w="120"/>
+              <w:bottom w:type="dxa" w:w="60"/>
+              <w:right w:type="dxa" w:w="120"/>
+            </w:tcMar>
+            <w:vAlign w:val="center"/>
+          </w:tcPr>
+          <w:p>
+            <w:pPr>
+              <w:jc w:val="center"/>
+            </w:pPr>
+            <w:r>
+              <w:rPr>
+                <w:rFonts w:ascii="Calibri" w:cs="Calibri" w:eastAsia="Calibri" w:hAnsi="Calibri"/>
+                <w:sz w:val="19"/>
+                <w:szCs w:val="19"/>
+              </w:rPr>
+              <w:t xml:space="preserve">FIFA SP 2022</w:t>
+            </w:r>
+          </w:p>
+        </w:tc>
+        <w:tc>
+          <w:tcPr>
+            <w:tcW w:type="dxa" w:w="1350"/>
+            <w:tcBorders>
+              <w:top w:val="single" w:color="BFBFBF" w:sz="4"/>
+              <w:left w:val="single" w:color="BFBFBF" w:sz="4"/>
+              <w:bottom w:val="single" w:color="BFBFBF" w:sz="4"/>
+              <w:right w:val="single" w:color="BFBFBF" w:sz="4"/>
+            </w:tcBorders>
+            <w:shd w:fill="FFFFFF" w:val="clear"/>
+            <w:tcMar>
+              <w:top w:type="dxa" w:w="60"/>
+              <w:left w:type="dxa" w:w="120"/>
+              <w:bottom w:type="dxa" w:w="60"/>
+              <w:right w:type="dxa" w:w="120"/>
+            </w:tcMar>
+            <w:vAlign w:val="center"/>
+          </w:tcPr>
+          <w:p>
+            <w:pPr>
+              <w:jc w:val="center"/>
+            </w:pPr>
+            <w:r>
+              <w:rPr>
+                <w:rFonts w:ascii="Calibri" w:cs="Calibri" w:eastAsia="Calibri" w:hAnsi="Calibri"/>
+                <w:sz w:val="19"/>
+                <w:szCs w:val="19"/>
+              </w:rPr>
+              <w:t xml:space="preserve">0,783</w:t>
+            </w:r>
+          </w:p>
+        </w:tc>
+        <w:tc>
+          <w:tcPr>
+            <w:tcW w:type="dxa" w:w="1350"/>
+            <w:tcBorders>
+              <w:top w:val="single" w:color="BFBFBF" w:sz="4"/>
+              <w:left w:val="single" w:color="BFBFBF" w:sz="4"/>
+              <w:bottom w:val="single" w:color="BFBFBF" w:sz="4"/>
+              <w:right w:val="single" w:color="BFBFBF" w:sz="4"/>
+            </w:tcBorders>
+            <w:shd w:fill="FFFFFF" w:val="clear"/>
+            <w:tcMar>
+              <w:top w:type="dxa" w:w="60"/>
+              <w:left w:type="dxa" w:w="120"/>
+              <w:bottom w:type="dxa" w:w="60"/>
+              <w:right w:type="dxa" w:w="120"/>
+            </w:tcMar>
+            <w:vAlign w:val="center"/>
+          </w:tcPr>
+          <w:p>
+            <w:pPr>
+              <w:jc w:val="center"/>
+            </w:pPr>
+            <w:r>
+              <w:rPr>
+                <w:rFonts w:ascii="Calibri" w:cs="Calibri" w:eastAsia="Calibri" w:hAnsi="Calibri"/>
+                <w:sz w:val="19"/>
+                <w:szCs w:val="19"/>
+              </w:rPr>
+              <w:t xml:space="preserve">0,347</w:t>
+            </w:r>
+          </w:p>
+        </w:tc>
+        <w:tc>
+          <w:tcPr>
+            <w:tcW w:type="dxa" w:w="1350"/>
+            <w:tcBorders>
+              <w:top w:val="single" w:color="BFBFBF" w:sz="4"/>
+              <w:left w:val="single" w:color="BFBFBF" w:sz="4"/>
+              <w:bottom w:val="single" w:color="BFBFBF" w:sz="4"/>
+              <w:right w:val="single" w:color="BFBFBF" w:sz="4"/>
+            </w:tcBorders>
+            <w:shd w:fill="FFFFFF" w:val="clear"/>
+            <w:tcMar>
+              <w:top w:type="dxa" w:w="60"/>
+              <w:left w:type="dxa" w:w="120"/>
+              <w:bottom w:type="dxa" w:w="60"/>
+              <w:right w:type="dxa" w:w="120"/>
+            </w:tcMar>
+            <w:vAlign w:val="center"/>
+          </w:tcPr>
+          <w:p>
+            <w:pPr>
+              <w:jc w:val="center"/>
+            </w:pPr>
+            <w:r>
+              <w:rPr>
+                <w:rFonts w:ascii="Calibri" w:cs="Calibri" w:eastAsia="Calibri" w:hAnsi="Calibri"/>
+                <w:sz w:val="19"/>
+                <w:szCs w:val="19"/>
+              </w:rPr>
+              <w:t xml:space="preserve">0,396</w:t>
+            </w:r>
+          </w:p>
+        </w:tc>
+        <w:tc>
+          <w:tcPr>
+            <w:tcW w:type="dxa" w:w="1350"/>
+            <w:tcBorders>
+              <w:top w:val="single" w:color="BFBFBF" w:sz="4"/>
+              <w:left w:val="single" w:color="BFBFBF" w:sz="4"/>
+              <w:bottom w:val="single" w:color="BFBFBF" w:sz="4"/>
+              <w:right w:val="single" w:color="BFBFBF" w:sz="4"/>
+            </w:tcBorders>
+            <w:shd w:fill="FFFFFF" w:val="clear"/>
+            <w:tcMar>
+              <w:top w:type="dxa" w:w="60"/>
+              <w:left w:type="dxa" w:w="120"/>
+              <w:bottom w:type="dxa" w:w="60"/>
+              <w:right w:type="dxa" w:w="120"/>
+            </w:tcMar>
+            <w:vAlign w:val="center"/>
+          </w:tcPr>
+          <w:p>
+            <w:pPr>
+              <w:jc w:val="center"/>
+            </w:pPr>
+            <w:r>
+              <w:rPr>
+                <w:rFonts w:ascii="Calibri" w:cs="Calibri" w:eastAsia="Calibri" w:hAnsi="Calibri"/>
+                <w:sz w:val="19"/>
+                <w:szCs w:val="19"/>
+              </w:rPr>
+              <w:t xml:space="preserve">0,082</w:t>
+            </w:r>
+          </w:p>
+        </w:tc>
+      </w:tr>
+      <w:tr>
+        <w:tc>
+          <w:tcPr>
+            <w:tcW w:type="dxa" w:w="2340"/>
+            <w:tcBorders>
+              <w:top w:val="single" w:color="BFBFBF" w:sz="4"/>
+              <w:left w:val="single" w:color="BFBFBF" w:sz="4"/>
+              <w:bottom w:val="single" w:color="BFBFBF" w:sz="4"/>
+              <w:right w:val="single" w:color="BFBFBF" w:sz="4"/>
+            </w:tcBorders>
+            <w:shd w:fill="F2F2F2" w:val="clear"/>
+            <w:tcMar>
+              <w:top w:type="dxa" w:w="60"/>
+              <w:left w:type="dxa" w:w="120"/>
+              <w:bottom w:type="dxa" w:w="60"/>
+              <w:right w:type="dxa" w:w="120"/>
+            </w:tcMar>
+            <w:vAlign w:val="center"/>
+          </w:tcPr>
+          <w:p>
+            <w:pPr>
+              <w:jc w:val="left"/>
+            </w:pPr>
+            <w:r>
+              <w:rPr>
+                <w:rFonts w:ascii="Calibri" w:cs="Calibri" w:eastAsia="Calibri" w:hAnsi="Calibri"/>
+                <w:sz w:val="19"/>
+                <w:szCs w:val="19"/>
+              </w:rPr>
+              <w:t xml:space="preserve"/>
+            </w:r>
+          </w:p>
+        </w:tc>
+        <w:tc>
+          <w:tcPr>
+            <w:tcW w:type="dxa" w:w="1620"/>
+            <w:tcBorders>
+              <w:top w:val="single" w:color="BFBFBF" w:sz="4"/>
+              <w:left w:val="single" w:color="BFBFBF" w:sz="4"/>
+              <w:bottom w:val="single" w:color="BFBFBF" w:sz="4"/>
+              <w:right w:val="single" w:color="BFBFBF" w:sz="4"/>
+            </w:tcBorders>
+            <w:shd w:fill="F2F2F2" w:val="clear"/>
+            <w:tcMar>
+              <w:top w:type="dxa" w:w="60"/>
+              <w:left w:type="dxa" w:w="120"/>
+              <w:bottom w:type="dxa" w:w="60"/>
+              <w:right w:type="dxa" w:w="120"/>
+            </w:tcMar>
+            <w:vAlign w:val="center"/>
+          </w:tcPr>
+          <w:p>
+            <w:pPr>
+              <w:jc w:val="center"/>
+            </w:pPr>
+            <w:r>
+              <w:rPr>
+                <w:rFonts w:ascii="Calibri" w:cs="Calibri" w:eastAsia="Calibri" w:hAnsi="Calibri"/>
+                <w:sz w:val="19"/>
+                <w:szCs w:val="19"/>
+              </w:rPr>
+              <w:t xml:space="preserve">UEFA EP 2020</w:t>
+            </w:r>
+          </w:p>
+        </w:tc>
+        <w:tc>
+          <w:tcPr>
+            <w:tcW w:type="dxa" w:w="1350"/>
+            <w:tcBorders>
+              <w:top w:val="single" w:color="BFBFBF" w:sz="4"/>
+              <w:left w:val="single" w:color="BFBFBF" w:sz="4"/>
+              <w:bottom w:val="single" w:color="BFBFBF" w:sz="4"/>
+              <w:right w:val="single" w:color="BFBFBF" w:sz="4"/>
+            </w:tcBorders>
+            <w:shd w:fill="F2F2F2" w:val="clear"/>
+            <w:tcMar>
+              <w:top w:type="dxa" w:w="60"/>
+              <w:left w:type="dxa" w:w="120"/>
+              <w:bottom w:type="dxa" w:w="60"/>
+              <w:right w:type="dxa" w:w="120"/>
+            </w:tcMar>
+            <w:vAlign w:val="center"/>
+          </w:tcPr>
+          <w:p>
+            <w:pPr>
+              <w:jc w:val="center"/>
+            </w:pPr>
+            <w:r>
+              <w:rPr>
+                <w:rFonts w:ascii="Calibri" w:cs="Calibri" w:eastAsia="Calibri" w:hAnsi="Calibri"/>
+                <w:sz w:val="19"/>
+                <w:szCs w:val="19"/>
+              </w:rPr>
+              <w:t xml:space="preserve">0,774</w:t>
+            </w:r>
+          </w:p>
+        </w:tc>
+        <w:tc>
+          <w:tcPr>
+            <w:tcW w:type="dxa" w:w="1350"/>
+            <w:tcBorders>
+              <w:top w:val="single" w:color="BFBFBF" w:sz="4"/>
+              <w:left w:val="single" w:color="BFBFBF" w:sz="4"/>
+              <w:bottom w:val="single" w:color="BFBFBF" w:sz="4"/>
+              <w:right w:val="single" w:color="BFBFBF" w:sz="4"/>
+            </w:tcBorders>
+            <w:shd w:fill="F2F2F2" w:val="clear"/>
+            <w:tcMar>
+              <w:top w:type="dxa" w:w="60"/>
+              <w:left w:type="dxa" w:w="120"/>
+              <w:bottom w:type="dxa" w:w="60"/>
+              <w:right w:type="dxa" w:w="120"/>
+            </w:tcMar>
+            <w:vAlign w:val="center"/>
+          </w:tcPr>
+          <w:p>
+            <w:pPr>
+              <w:jc w:val="center"/>
+            </w:pPr>
+            <w:r>
+              <w:rPr>
+                <w:rFonts w:ascii="Calibri" w:cs="Calibri" w:eastAsia="Calibri" w:hAnsi="Calibri"/>
+                <w:sz w:val="19"/>
+                <w:szCs w:val="19"/>
+              </w:rPr>
+              <w:t xml:space="preserve">0,331</w:t>
+            </w:r>
+          </w:p>
+        </w:tc>
+        <w:tc>
+          <w:tcPr>
+            <w:tcW w:type="dxa" w:w="1350"/>
+            <w:tcBorders>
+              <w:top w:val="single" w:color="BFBFBF" w:sz="4"/>
+              <w:left w:val="single" w:color="BFBFBF" w:sz="4"/>
+              <w:bottom w:val="single" w:color="BFBFBF" w:sz="4"/>
+              <w:right w:val="single" w:color="BFBFBF" w:sz="4"/>
+            </w:tcBorders>
+            <w:shd w:fill="F2F2F2" w:val="clear"/>
+            <w:tcMar>
+              <w:top w:type="dxa" w:w="60"/>
+              <w:left w:type="dxa" w:w="120"/>
+              <w:bottom w:type="dxa" w:w="60"/>
+              <w:right w:type="dxa" w:w="120"/>
+            </w:tcMar>
+            <w:vAlign w:val="center"/>
+          </w:tcPr>
+          <w:p>
+            <w:pPr>
+              <w:jc w:val="center"/>
+            </w:pPr>
+            <w:r>
+              <w:rPr>
+                <w:rFonts w:ascii="Calibri" w:cs="Calibri" w:eastAsia="Calibri" w:hAnsi="Calibri"/>
+                <w:sz w:val="19"/>
+                <w:szCs w:val="19"/>
+              </w:rPr>
+              <w:t xml:space="preserve">0,393</w:t>
+            </w:r>
+          </w:p>
+        </w:tc>
+        <w:tc>
+          <w:tcPr>
+            <w:tcW w:type="dxa" w:w="1350"/>
+            <w:tcBorders>
+              <w:top w:val="single" w:color="BFBFBF" w:sz="4"/>
+              <w:left w:val="single" w:color="BFBFBF" w:sz="4"/>
+              <w:bottom w:val="single" w:color="BFBFBF" w:sz="4"/>
+              <w:right w:val="single" w:color="BFBFBF" w:sz="4"/>
+            </w:tcBorders>
+            <w:shd w:fill="F2F2F2" w:val="clear"/>
+            <w:tcMar>
+              <w:top w:type="dxa" w:w="60"/>
+              <w:left w:type="dxa" w:w="120"/>
+              <w:bottom w:type="dxa" w:w="60"/>
+              <w:right w:type="dxa" w:w="120"/>
+            </w:tcMar>
+            <w:vAlign w:val="center"/>
+          </w:tcPr>
+          <w:p>
+            <w:pPr>
+              <w:jc w:val="center"/>
+            </w:pPr>
+            <w:r>
+              <w:rPr>
+                <w:rFonts w:ascii="Calibri" w:cs="Calibri" w:eastAsia="Calibri" w:hAnsi="Calibri"/>
+                <w:sz w:val="19"/>
+                <w:szCs w:val="19"/>
+              </w:rPr>
+              <w:t xml:space="preserve">0,078</w:t>
+            </w:r>
+          </w:p>
+        </w:tc>
+      </w:tr>
+      <w:tr>
+        <w:tc>
+          <w:tcPr>
+            <w:tcW w:type="dxa" w:w="2340"/>
+            <w:tcBorders>
+              <w:top w:val="single" w:color="BFBFBF" w:sz="4"/>
+              <w:left w:val="single" w:color="BFBFBF" w:sz="4"/>
+              <w:bottom w:val="single" w:color="BFBFBF" w:sz="4"/>
+              <w:right w:val="single" w:color="BFBFBF" w:sz="4"/>
+            </w:tcBorders>
+            <w:shd w:fill="FFFFFF" w:val="clear"/>
+            <w:tcMar>
+              <w:top w:type="dxa" w:w="60"/>
+              <w:left w:type="dxa" w:w="120"/>
+              <w:bottom w:type="dxa" w:w="60"/>
+              <w:right w:type="dxa" w:w="120"/>
+            </w:tcMar>
+            <w:vAlign w:val="center"/>
+          </w:tcPr>
+          <w:p>
+            <w:pPr>
+              <w:jc w:val="left"/>
+            </w:pPr>
+            <w:r>
+              <w:rPr>
+                <w:rFonts w:ascii="Calibri" w:cs="Calibri" w:eastAsia="Calibri" w:hAnsi="Calibri"/>
+                <w:sz w:val="19"/>
+                <w:szCs w:val="19"/>
+              </w:rPr>
+              <w:t xml:space="preserve"/>
+            </w:r>
+          </w:p>
+        </w:tc>
+        <w:tc>
+          <w:tcPr>
+            <w:tcW w:type="dxa" w:w="1620"/>
+            <w:tcBorders>
+              <w:top w:val="single" w:color="BFBFBF" w:sz="4"/>
+              <w:left w:val="single" w:color="BFBFBF" w:sz="4"/>
+              <w:bottom w:val="single" w:color="BFBFBF" w:sz="4"/>
+              <w:right w:val="single" w:color="BFBFBF" w:sz="4"/>
+            </w:tcBorders>
+            <w:shd w:fill="FFFFFF" w:val="clear"/>
+            <w:tcMar>
+              <w:top w:type="dxa" w:w="60"/>
+              <w:left w:type="dxa" w:w="120"/>
+              <w:bottom w:type="dxa" w:w="60"/>
+              <w:right w:type="dxa" w:w="120"/>
+            </w:tcMar>
+            <w:vAlign w:val="center"/>
+          </w:tcPr>
+          <w:p>
+            <w:pPr>
+              <w:jc w:val="center"/>
+            </w:pPr>
+            <w:r>
+              <w:rPr>
+                <w:rFonts w:ascii="Calibri" w:cs="Calibri" w:eastAsia="Calibri" w:hAnsi="Calibri"/>
+                <w:sz w:val="19"/>
+                <w:szCs w:val="19"/>
+              </w:rPr>
+              <w:t xml:space="preserve">UEFA EP 2024</w:t>
+            </w:r>
+          </w:p>
+        </w:tc>
+        <w:tc>
+          <w:tcPr>
+            <w:tcW w:type="dxa" w:w="1350"/>
+            <w:tcBorders>
+              <w:top w:val="single" w:color="BFBFBF" w:sz="4"/>
+              <w:left w:val="single" w:color="BFBFBF" w:sz="4"/>
+              <w:bottom w:val="single" w:color="BFBFBF" w:sz="4"/>
+              <w:right w:val="single" w:color="BFBFBF" w:sz="4"/>
+            </w:tcBorders>
+            <w:shd w:fill="FFFFFF" w:val="clear"/>
+            <w:tcMar>
+              <w:top w:type="dxa" w:w="60"/>
+              <w:left w:type="dxa" w:w="120"/>
+              <w:bottom w:type="dxa" w:w="60"/>
+              <w:right w:type="dxa" w:w="120"/>
+            </w:tcMar>
+            <w:vAlign w:val="center"/>
+          </w:tcPr>
+          <w:p>
+            <w:pPr>
+              <w:jc w:val="center"/>
+            </w:pPr>
+            <w:r>
+              <w:rPr>
+                <w:rFonts w:ascii="Calibri" w:cs="Calibri" w:eastAsia="Calibri" w:hAnsi="Calibri"/>
+                <w:sz w:val="19"/>
+                <w:szCs w:val="19"/>
+              </w:rPr>
+              <w:t xml:space="preserve">0,724</w:t>
+            </w:r>
+          </w:p>
+        </w:tc>
+        <w:tc>
+          <w:tcPr>
+            <w:tcW w:type="dxa" w:w="1350"/>
+            <w:tcBorders>
+              <w:top w:val="single" w:color="BFBFBF" w:sz="4"/>
+              <w:left w:val="single" w:color="BFBFBF" w:sz="4"/>
+              <w:bottom w:val="single" w:color="BFBFBF" w:sz="4"/>
+              <w:right w:val="single" w:color="BFBFBF" w:sz="4"/>
+            </w:tcBorders>
+            <w:shd w:fill="FFFFFF" w:val="clear"/>
+            <w:tcMar>
+              <w:top w:type="dxa" w:w="60"/>
+              <w:left w:type="dxa" w:w="120"/>
+              <w:bottom w:type="dxa" w:w="60"/>
+              <w:right w:type="dxa" w:w="120"/>
+            </w:tcMar>
+            <w:vAlign w:val="center"/>
+          </w:tcPr>
+          <w:p>
+            <w:pPr>
+              <w:jc w:val="center"/>
+            </w:pPr>
+            <w:r>
+              <w:rPr>
+                <w:rFonts w:ascii="Calibri" w:cs="Calibri" w:eastAsia="Calibri" w:hAnsi="Calibri"/>
+                <w:sz w:val="19"/>
+                <w:szCs w:val="19"/>
+              </w:rPr>
+              <w:t xml:space="preserve">0,219</w:t>
+            </w:r>
+          </w:p>
+        </w:tc>
+        <w:tc>
+          <w:tcPr>
+            <w:tcW w:type="dxa" w:w="1350"/>
+            <w:tcBorders>
+              <w:top w:val="single" w:color="BFBFBF" w:sz="4"/>
+              <w:left w:val="single" w:color="BFBFBF" w:sz="4"/>
+              <w:bottom w:val="single" w:color="BFBFBF" w:sz="4"/>
+              <w:right w:val="single" w:color="BFBFBF" w:sz="4"/>
+            </w:tcBorders>
+            <w:shd w:fill="FFFFFF" w:val="clear"/>
+            <w:tcMar>
+              <w:top w:type="dxa" w:w="60"/>
+              <w:left w:type="dxa" w:w="120"/>
+              <w:bottom w:type="dxa" w:w="60"/>
+              <w:right w:type="dxa" w:w="120"/>
+            </w:tcMar>
+            <w:vAlign w:val="center"/>
+          </w:tcPr>
+          <w:p>
+            <w:pPr>
+              <w:jc w:val="center"/>
+            </w:pPr>
+            <w:r>
+              <w:rPr>
+                <w:rFonts w:ascii="Calibri" w:cs="Calibri" w:eastAsia="Calibri" w:hAnsi="Calibri"/>
+                <w:sz w:val="19"/>
+                <w:szCs w:val="19"/>
+              </w:rPr>
+              <w:t xml:space="preserve">0,305</w:t>
+            </w:r>
+          </w:p>
+        </w:tc>
+        <w:tc>
+          <w:tcPr>
+            <w:tcW w:type="dxa" w:w="1350"/>
+            <w:tcBorders>
+              <w:top w:val="single" w:color="BFBFBF" w:sz="4"/>
+              <w:left w:val="single" w:color="BFBFBF" w:sz="4"/>
+              <w:bottom w:val="single" w:color="BFBFBF" w:sz="4"/>
+              <w:right w:val="single" w:color="BFBFBF" w:sz="4"/>
+            </w:tcBorders>
+            <w:shd w:fill="FFFFFF" w:val="clear"/>
+            <w:tcMar>
+              <w:top w:type="dxa" w:w="60"/>
+              <w:left w:type="dxa" w:w="120"/>
+              <w:bottom w:type="dxa" w:w="60"/>
+              <w:right w:type="dxa" w:w="120"/>
+            </w:tcMar>
+            <w:vAlign w:val="center"/>
+          </w:tcPr>
+          <w:p>
+            <w:pPr>
+              <w:jc w:val="center"/>
+            </w:pPr>
+            <w:r>
+              <w:rPr>
+                <w:rFonts w:ascii="Calibri" w:cs="Calibri" w:eastAsia="Calibri" w:hAnsi="Calibri"/>
+                <w:sz w:val="19"/>
+                <w:szCs w:val="19"/>
+              </w:rPr>
+              <w:t xml:space="preserve">0,066</w:t>
+            </w:r>
+          </w:p>
+        </w:tc>
+      </w:tr>
+      <w:tr>
+        <w:tc>
+          <w:tcPr>
+            <w:tcW w:type="dxa" w:w="2340"/>
+            <w:tcBorders>
+              <w:top w:val="single" w:color="BFBFBF" w:sz="4"/>
+              <w:left w:val="single" w:color="BFBFBF" w:sz="4"/>
+              <w:bottom w:val="single" w:color="BFBFBF" w:sz="4"/>
+              <w:right w:val="single" w:color="BFBFBF" w:sz="4"/>
+            </w:tcBorders>
+            <w:shd w:fill="F2F2F2" w:val="clear"/>
+            <w:tcMar>
+              <w:top w:type="dxa" w:w="60"/>
+              <w:left w:type="dxa" w:w="120"/>
+              <w:bottom w:type="dxa" w:w="60"/>
+              <w:right w:type="dxa" w:w="120"/>
+            </w:tcMar>
+            <w:vAlign w:val="center"/>
+          </w:tcPr>
+          <w:p>
+            <w:pPr>
+              <w:jc w:val="left"/>
+            </w:pPr>
+            <w:r>
+              <w:rPr>
+                <w:rFonts w:ascii="Calibri" w:cs="Calibri" w:eastAsia="Calibri" w:hAnsi="Calibri"/>
+                <w:sz w:val="19"/>
+                <w:szCs w:val="19"/>
+              </w:rPr>
+              <w:t xml:space="preserve"/>
+            </w:r>
+          </w:p>
+        </w:tc>
+        <w:tc>
+          <w:tcPr>
+            <w:tcW w:type="dxa" w:w="1620"/>
+            <w:tcBorders>
+              <w:top w:val="single" w:color="BFBFBF" w:sz="4"/>
+              <w:left w:val="single" w:color="BFBFBF" w:sz="4"/>
+              <w:bottom w:val="single" w:color="BFBFBF" w:sz="4"/>
+              <w:right w:val="single" w:color="BFBFBF" w:sz="4"/>
+            </w:tcBorders>
+            <w:shd w:fill="F2F2F2" w:val="clear"/>
+            <w:tcMar>
+              <w:top w:type="dxa" w:w="60"/>
+              <w:left w:type="dxa" w:w="120"/>
+              <w:bottom w:type="dxa" w:w="60"/>
+              <w:right w:type="dxa" w:w="120"/>
+            </w:tcMar>
+            <w:vAlign w:val="center"/>
+          </w:tcPr>
+          <w:p>
+            <w:pPr>
+              <w:jc w:val="center"/>
+            </w:pPr>
+            <w:r>
+              <w:rPr>
+                <w:rFonts w:ascii="Calibri" w:cs="Calibri" w:eastAsia="Calibri" w:hAnsi="Calibri"/>
+                <w:sz w:val="19"/>
+                <w:szCs w:val="19"/>
+              </w:rPr>
+              <w:t xml:space="preserve">prosek ± SD</w:t>
+            </w:r>
+          </w:p>
+        </w:tc>
+        <w:tc>
+          <w:tcPr>
+            <w:tcW w:type="dxa" w:w="1350"/>
+            <w:tcBorders>
+              <w:top w:val="single" w:color="BFBFBF" w:sz="4"/>
+              <w:left w:val="single" w:color="BFBFBF" w:sz="4"/>
+              <w:bottom w:val="single" w:color="BFBFBF" w:sz="4"/>
+              <w:right w:val="single" w:color="BFBFBF" w:sz="4"/>
+            </w:tcBorders>
+            <w:shd w:fill="F2F2F2" w:val="clear"/>
+            <w:tcMar>
+              <w:top w:type="dxa" w:w="60"/>
+              <w:left w:type="dxa" w:w="120"/>
+              <w:bottom w:type="dxa" w:w="60"/>
+              <w:right w:type="dxa" w:w="120"/>
+            </w:tcMar>
+            <w:vAlign w:val="center"/>
+          </w:tcPr>
+          <w:p>
+            <w:pPr>
+              <w:jc w:val="center"/>
+            </w:pPr>
+            <w:r>
+              <w:rPr>
+                <w:rFonts w:ascii="Calibri" w:cs="Calibri" w:eastAsia="Calibri" w:hAnsi="Calibri"/>
+                <w:sz w:val="19"/>
+                <w:szCs w:val="19"/>
+              </w:rPr>
+              <w:t xml:space="preserve">0,761 ± 0,032</w:t>
+            </w:r>
+          </w:p>
+        </w:tc>
+        <w:tc>
+          <w:tcPr>
+            <w:tcW w:type="dxa" w:w="1350"/>
+            <w:tcBorders>
+              <w:top w:val="single" w:color="BFBFBF" w:sz="4"/>
+              <w:left w:val="single" w:color="BFBFBF" w:sz="4"/>
+              <w:bottom w:val="single" w:color="BFBFBF" w:sz="4"/>
+              <w:right w:val="single" w:color="BFBFBF" w:sz="4"/>
+            </w:tcBorders>
+            <w:shd w:fill="F2F2F2" w:val="clear"/>
+            <w:tcMar>
+              <w:top w:type="dxa" w:w="60"/>
+              <w:left w:type="dxa" w:w="120"/>
+              <w:bottom w:type="dxa" w:w="60"/>
+              <w:right w:type="dxa" w:w="120"/>
+            </w:tcMar>
+            <w:vAlign w:val="center"/>
+          </w:tcPr>
+          <w:p>
+            <w:pPr>
+              <w:jc w:val="center"/>
+            </w:pPr>
+            <w:r>
+              <w:rPr>
+                <w:rFonts w:ascii="Calibri" w:cs="Calibri" w:eastAsia="Calibri" w:hAnsi="Calibri"/>
+                <w:sz w:val="19"/>
+                <w:szCs w:val="19"/>
+              </w:rPr>
+              <w:t xml:space="preserve">0,299 ± 0,070</w:t>
+            </w:r>
+          </w:p>
+        </w:tc>
+        <w:tc>
+          <w:tcPr>
+            <w:tcW w:type="dxa" w:w="1350"/>
+            <w:tcBorders>
+              <w:top w:val="single" w:color="BFBFBF" w:sz="4"/>
+              <w:left w:val="single" w:color="BFBFBF" w:sz="4"/>
+              <w:bottom w:val="single" w:color="BFBFBF" w:sz="4"/>
+              <w:right w:val="single" w:color="BFBFBF" w:sz="4"/>
+            </w:tcBorders>
+            <w:shd w:fill="F2F2F2" w:val="clear"/>
+            <w:tcMar>
+              <w:top w:type="dxa" w:w="60"/>
+              <w:left w:type="dxa" w:w="120"/>
+              <w:bottom w:type="dxa" w:w="60"/>
+              <w:right w:type="dxa" w:w="120"/>
+            </w:tcMar>
+            <w:vAlign w:val="center"/>
+          </w:tcPr>
+          <w:p>
+            <w:pPr>
+              <w:jc w:val="center"/>
+            </w:pPr>
+            <w:r>
+              <w:rPr>
+                <w:rFonts w:ascii="Calibri" w:cs="Calibri" w:eastAsia="Calibri" w:hAnsi="Calibri"/>
+                <w:sz w:val="19"/>
+                <w:szCs w:val="19"/>
+              </w:rPr>
+              <w:t xml:space="preserve">0,365 ± 0,052</w:t>
+            </w:r>
+          </w:p>
+        </w:tc>
+        <w:tc>
+          <w:tcPr>
+            <w:tcW w:type="dxa" w:w="1350"/>
+            <w:tcBorders>
+              <w:top w:val="single" w:color="BFBFBF" w:sz="4"/>
+              <w:left w:val="single" w:color="BFBFBF" w:sz="4"/>
+              <w:bottom w:val="single" w:color="BFBFBF" w:sz="4"/>
+              <w:right w:val="single" w:color="BFBFBF" w:sz="4"/>
+            </w:tcBorders>
+            <w:shd w:fill="F2F2F2" w:val="clear"/>
+            <w:tcMar>
+              <w:top w:type="dxa" w:w="60"/>
+              <w:left w:type="dxa" w:w="120"/>
+              <w:bottom w:type="dxa" w:w="60"/>
+              <w:right w:type="dxa" w:w="120"/>
+            </w:tcMar>
+            <w:vAlign w:val="center"/>
+          </w:tcPr>
+          <w:p>
+            <w:pPr>
+              <w:jc w:val="center"/>
+            </w:pPr>
+            <w:r>
+              <w:rPr>
+                <w:rFonts w:ascii="Calibri" w:cs="Calibri" w:eastAsia="Calibri" w:hAnsi="Calibri"/>
+                <w:sz w:val="19"/>
+                <w:szCs w:val="19"/>
+              </w:rPr>
+              <w:t xml:space="preserve">0,076 ± 0,008</w:t>
+            </w:r>
+          </w:p>
+        </w:tc>
+      </w:tr>
+      <w:tr>
+        <w:tc>
+          <w:tcPr>
+            <w:tcW w:type="dxa" w:w="2340"/>
+            <w:tcBorders>
+              <w:top w:val="single" w:color="BFBFBF" w:sz="4"/>
+              <w:left w:val="single" w:color="BFBFBF" w:sz="4"/>
+              <w:bottom w:val="single" w:color="BFBFBF" w:sz="4"/>
+              <w:right w:val="single" w:color="BFBFBF" w:sz="4"/>
+            </w:tcBorders>
+            <w:shd w:fill="FFFFFF" w:val="clear"/>
+            <w:tcMar>
+              <w:top w:type="dxa" w:w="60"/>
+              <w:left w:type="dxa" w:w="120"/>
+              <w:bottom w:type="dxa" w:w="60"/>
+              <w:right w:type="dxa" w:w="120"/>
+            </w:tcMar>
+            <w:vAlign w:val="center"/>
+          </w:tcPr>
+          <w:p>
+            <w:pPr>
+              <w:jc w:val="left"/>
+            </w:pPr>
+            <w:r>
+              <w:rPr>
+                <w:rFonts w:ascii="Calibri" w:cs="Calibri" w:eastAsia="Calibri" w:hAnsi="Calibri"/>
+                <w:sz w:val="19"/>
+                <w:szCs w:val="19"/>
+              </w:rPr>
+              <w:t xml:space="preserve">Model B, logistička regresija</w:t>
+            </w:r>
+          </w:p>
+        </w:tc>
+        <w:tc>
+          <w:tcPr>
+            <w:tcW w:type="dxa" w:w="1620"/>
+            <w:tcBorders>
+              <w:top w:val="single" w:color="BFBFBF" w:sz="4"/>
+              <w:left w:val="single" w:color="BFBFBF" w:sz="4"/>
+              <w:bottom w:val="single" w:color="BFBFBF" w:sz="4"/>
+              <w:right w:val="single" w:color="BFBFBF" w:sz="4"/>
+            </w:tcBorders>
+            <w:shd w:fill="FFFFFF" w:val="clear"/>
+            <w:tcMar>
+              <w:top w:type="dxa" w:w="60"/>
+              <w:left w:type="dxa" w:w="120"/>
+              <w:bottom w:type="dxa" w:w="60"/>
+              <w:right w:type="dxa" w:w="120"/>
+            </w:tcMar>
+            <w:vAlign w:val="center"/>
+          </w:tcPr>
+          <w:p>
+            <w:pPr>
+              <w:jc w:val="center"/>
+            </w:pPr>
+            <w:r>
+              <w:rPr>
+                <w:rFonts w:ascii="Calibri" w:cs="Calibri" w:eastAsia="Calibri" w:hAnsi="Calibri"/>
+                <w:sz w:val="19"/>
+                <w:szCs w:val="19"/>
+              </w:rPr>
+              <w:t xml:space="preserve">FIFA SP 2022</w:t>
+            </w:r>
+          </w:p>
+        </w:tc>
+        <w:tc>
+          <w:tcPr>
+            <w:tcW w:type="dxa" w:w="1350"/>
+            <w:tcBorders>
+              <w:top w:val="single" w:color="BFBFBF" w:sz="4"/>
+              <w:left w:val="single" w:color="BFBFBF" w:sz="4"/>
+              <w:bottom w:val="single" w:color="BFBFBF" w:sz="4"/>
+              <w:right w:val="single" w:color="BFBFBF" w:sz="4"/>
+            </w:tcBorders>
+            <w:shd w:fill="FFFFFF" w:val="clear"/>
+            <w:tcMar>
+              <w:top w:type="dxa" w:w="60"/>
+              <w:left w:type="dxa" w:w="120"/>
+              <w:bottom w:type="dxa" w:w="60"/>
+              <w:right w:type="dxa" w:w="120"/>
+            </w:tcMar>
+            <w:vAlign w:val="center"/>
+          </w:tcPr>
+          <w:p>
+            <w:pPr>
+              <w:jc w:val="center"/>
+            </w:pPr>
+            <w:r>
+              <w:rPr>
+                <w:rFonts w:ascii="Calibri" w:cs="Calibri" w:eastAsia="Calibri" w:hAnsi="Calibri"/>
+                <w:sz w:val="19"/>
+                <w:szCs w:val="19"/>
+              </w:rPr>
+              <w:t xml:space="preserve">0,797</w:t>
+            </w:r>
+          </w:p>
+        </w:tc>
+        <w:tc>
+          <w:tcPr>
+            <w:tcW w:type="dxa" w:w="1350"/>
+            <w:tcBorders>
+              <w:top w:val="single" w:color="BFBFBF" w:sz="4"/>
+              <w:left w:val="single" w:color="BFBFBF" w:sz="4"/>
+              <w:bottom w:val="single" w:color="BFBFBF" w:sz="4"/>
+              <w:right w:val="single" w:color="BFBFBF" w:sz="4"/>
+            </w:tcBorders>
+            <w:shd w:fill="FFFFFF" w:val="clear"/>
+            <w:tcMar>
+              <w:top w:type="dxa" w:w="60"/>
+              <w:left w:type="dxa" w:w="120"/>
+              <w:bottom w:type="dxa" w:w="60"/>
+              <w:right w:type="dxa" w:w="120"/>
+            </w:tcMar>
+            <w:vAlign w:val="center"/>
+          </w:tcPr>
+          <w:p>
+            <w:pPr>
+              <w:jc w:val="center"/>
+            </w:pPr>
+            <w:r>
+              <w:rPr>
+                <w:rFonts w:ascii="Calibri" w:cs="Calibri" w:eastAsia="Calibri" w:hAnsi="Calibri"/>
+                <w:sz w:val="19"/>
+                <w:szCs w:val="19"/>
+              </w:rPr>
+              <w:t xml:space="preserve">0,379</w:t>
+            </w:r>
+          </w:p>
+        </w:tc>
+        <w:tc>
+          <w:tcPr>
+            <w:tcW w:type="dxa" w:w="1350"/>
+            <w:tcBorders>
+              <w:top w:val="single" w:color="BFBFBF" w:sz="4"/>
+              <w:left w:val="single" w:color="BFBFBF" w:sz="4"/>
+              <w:bottom w:val="single" w:color="BFBFBF" w:sz="4"/>
+              <w:right w:val="single" w:color="BFBFBF" w:sz="4"/>
+            </w:tcBorders>
+            <w:shd w:fill="FFFFFF" w:val="clear"/>
+            <w:tcMar>
+              <w:top w:type="dxa" w:w="60"/>
+              <w:left w:type="dxa" w:w="120"/>
+              <w:bottom w:type="dxa" w:w="60"/>
+              <w:right w:type="dxa" w:w="120"/>
+            </w:tcMar>
+            <w:vAlign w:val="center"/>
+          </w:tcPr>
+          <w:p>
+            <w:pPr>
+              <w:jc w:val="center"/>
+            </w:pPr>
+            <w:r>
+              <w:rPr>
+                <w:rFonts w:ascii="Calibri" w:cs="Calibri" w:eastAsia="Calibri" w:hAnsi="Calibri"/>
+                <w:sz w:val="19"/>
+                <w:szCs w:val="19"/>
+              </w:rPr>
+              <w:t xml:space="preserve">0,429</w:t>
+            </w:r>
+          </w:p>
+        </w:tc>
+        <w:tc>
+          <w:tcPr>
+            <w:tcW w:type="dxa" w:w="1350"/>
+            <w:tcBorders>
+              <w:top w:val="single" w:color="BFBFBF" w:sz="4"/>
+              <w:left w:val="single" w:color="BFBFBF" w:sz="4"/>
+              <w:bottom w:val="single" w:color="BFBFBF" w:sz="4"/>
+              <w:right w:val="single" w:color="BFBFBF" w:sz="4"/>
+            </w:tcBorders>
+            <w:shd w:fill="FFFFFF" w:val="clear"/>
+            <w:tcMar>
+              <w:top w:type="dxa" w:w="60"/>
+              <w:left w:type="dxa" w:w="120"/>
+              <w:bottom w:type="dxa" w:w="60"/>
+              <w:right w:type="dxa" w:w="120"/>
+            </w:tcMar>
+            <w:vAlign w:val="center"/>
+          </w:tcPr>
+          <w:p>
+            <w:pPr>
+              <w:jc w:val="center"/>
+            </w:pPr>
+            <w:r>
+              <w:rPr>
+                <w:rFonts w:ascii="Calibri" w:cs="Calibri" w:eastAsia="Calibri" w:hAnsi="Calibri"/>
+                <w:sz w:val="19"/>
+                <w:szCs w:val="19"/>
+              </w:rPr>
+              <w:t xml:space="preserve">0,080</w:t>
+            </w:r>
+          </w:p>
+        </w:tc>
+      </w:tr>
+      <w:tr>
+        <w:tc>
+          <w:tcPr>
+            <w:tcW w:type="dxa" w:w="2340"/>
+            <w:tcBorders>
+              <w:top w:val="single" w:color="BFBFBF" w:sz="4"/>
+              <w:left w:val="single" w:color="BFBFBF" w:sz="4"/>
+              <w:bottom w:val="single" w:color="BFBFBF" w:sz="4"/>
+              <w:right w:val="single" w:color="BFBFBF" w:sz="4"/>
+            </w:tcBorders>
+            <w:shd w:fill="F2F2F2" w:val="clear"/>
+            <w:tcMar>
+              <w:top w:type="dxa" w:w="60"/>
+              <w:left w:type="dxa" w:w="120"/>
+              <w:bottom w:type="dxa" w:w="60"/>
+              <w:right w:type="dxa" w:w="120"/>
+            </w:tcMar>
+            <w:vAlign w:val="center"/>
+          </w:tcPr>
+          <w:p>
+            <w:pPr>
+              <w:jc w:val="left"/>
+            </w:pPr>
+            <w:r>
+              <w:rPr>
+                <w:rFonts w:ascii="Calibri" w:cs="Calibri" w:eastAsia="Calibri" w:hAnsi="Calibri"/>
+                <w:sz w:val="19"/>
+                <w:szCs w:val="19"/>
+              </w:rPr>
+              <w:t xml:space="preserve"/>
+            </w:r>
+          </w:p>
+        </w:tc>
+        <w:tc>
+          <w:tcPr>
+            <w:tcW w:type="dxa" w:w="1620"/>
+            <w:tcBorders>
+              <w:top w:val="single" w:color="BFBFBF" w:sz="4"/>
+              <w:left w:val="single" w:color="BFBFBF" w:sz="4"/>
+              <w:bottom w:val="single" w:color="BFBFBF" w:sz="4"/>
+              <w:right w:val="single" w:color="BFBFBF" w:sz="4"/>
+            </w:tcBorders>
+            <w:shd w:fill="F2F2F2" w:val="clear"/>
+            <w:tcMar>
+              <w:top w:type="dxa" w:w="60"/>
+              <w:left w:type="dxa" w:w="120"/>
+              <w:bottom w:type="dxa" w:w="60"/>
+              <w:right w:type="dxa" w:w="120"/>
+            </w:tcMar>
+            <w:vAlign w:val="center"/>
+          </w:tcPr>
+          <w:p>
+            <w:pPr>
+              <w:jc w:val="center"/>
+            </w:pPr>
+            <w:r>
+              <w:rPr>
+                <w:rFonts w:ascii="Calibri" w:cs="Calibri" w:eastAsia="Calibri" w:hAnsi="Calibri"/>
+                <w:sz w:val="19"/>
+                <w:szCs w:val="19"/>
+              </w:rPr>
+              <w:t xml:space="preserve">UEFA EP 2020</w:t>
+            </w:r>
+          </w:p>
+        </w:tc>
+        <w:tc>
+          <w:tcPr>
+            <w:tcW w:type="dxa" w:w="1350"/>
+            <w:tcBorders>
+              <w:top w:val="single" w:color="BFBFBF" w:sz="4"/>
+              <w:left w:val="single" w:color="BFBFBF" w:sz="4"/>
+              <w:bottom w:val="single" w:color="BFBFBF" w:sz="4"/>
+              <w:right w:val="single" w:color="BFBFBF" w:sz="4"/>
+            </w:tcBorders>
+            <w:shd w:fill="F2F2F2" w:val="clear"/>
+            <w:tcMar>
+              <w:top w:type="dxa" w:w="60"/>
+              <w:left w:type="dxa" w:w="120"/>
+              <w:bottom w:type="dxa" w:w="60"/>
+              <w:right w:type="dxa" w:w="120"/>
+            </w:tcMar>
+            <w:vAlign w:val="center"/>
+          </w:tcPr>
+          <w:p>
+            <w:pPr>
+              <w:jc w:val="center"/>
+            </w:pPr>
+            <w:r>
+              <w:rPr>
+                <w:rFonts w:ascii="Calibri" w:cs="Calibri" w:eastAsia="Calibri" w:hAnsi="Calibri"/>
+                <w:sz w:val="19"/>
+                <w:szCs w:val="19"/>
+              </w:rPr>
+              <w:t xml:space="preserve">0,767</w:t>
+            </w:r>
+          </w:p>
+        </w:tc>
+        <w:tc>
+          <w:tcPr>
+            <w:tcW w:type="dxa" w:w="1350"/>
+            <w:tcBorders>
+              <w:top w:val="single" w:color="BFBFBF" w:sz="4"/>
+              <w:left w:val="single" w:color="BFBFBF" w:sz="4"/>
+              <w:bottom w:val="single" w:color="BFBFBF" w:sz="4"/>
+              <w:right w:val="single" w:color="BFBFBF" w:sz="4"/>
+            </w:tcBorders>
+            <w:shd w:fill="F2F2F2" w:val="clear"/>
+            <w:tcMar>
+              <w:top w:type="dxa" w:w="60"/>
+              <w:left w:type="dxa" w:w="120"/>
+              <w:bottom w:type="dxa" w:w="60"/>
+              <w:right w:type="dxa" w:w="120"/>
+            </w:tcMar>
+            <w:vAlign w:val="center"/>
+          </w:tcPr>
+          <w:p>
+            <w:pPr>
+              <w:jc w:val="center"/>
+            </w:pPr>
+            <w:r>
+              <w:rPr>
+                <w:rFonts w:ascii="Calibri" w:cs="Calibri" w:eastAsia="Calibri" w:hAnsi="Calibri"/>
+                <w:sz w:val="19"/>
+                <w:szCs w:val="19"/>
+              </w:rPr>
+              <w:t xml:space="preserve">0,362</w:t>
+            </w:r>
+          </w:p>
+        </w:tc>
+        <w:tc>
+          <w:tcPr>
+            <w:tcW w:type="dxa" w:w="1350"/>
+            <w:tcBorders>
+              <w:top w:val="single" w:color="BFBFBF" w:sz="4"/>
+              <w:left w:val="single" w:color="BFBFBF" w:sz="4"/>
+              <w:bottom w:val="single" w:color="BFBFBF" w:sz="4"/>
+              <w:right w:val="single" w:color="BFBFBF" w:sz="4"/>
+            </w:tcBorders>
+            <w:shd w:fill="F2F2F2" w:val="clear"/>
+            <w:tcMar>
+              <w:top w:type="dxa" w:w="60"/>
+              <w:left w:type="dxa" w:w="120"/>
+              <w:bottom w:type="dxa" w:w="60"/>
+              <w:right w:type="dxa" w:w="120"/>
+            </w:tcMar>
+            <w:vAlign w:val="center"/>
+          </w:tcPr>
+          <w:p>
+            <w:pPr>
+              <w:jc w:val="center"/>
+            </w:pPr>
+            <w:r>
+              <w:rPr>
+                <w:rFonts w:ascii="Calibri" w:cs="Calibri" w:eastAsia="Calibri" w:hAnsi="Calibri"/>
+                <w:sz w:val="19"/>
+                <w:szCs w:val="19"/>
+              </w:rPr>
+              <w:t xml:space="preserve">0,420</w:t>
+            </w:r>
+          </w:p>
+        </w:tc>
+        <w:tc>
+          <w:tcPr>
+            <w:tcW w:type="dxa" w:w="1350"/>
+            <w:tcBorders>
+              <w:top w:val="single" w:color="BFBFBF" w:sz="4"/>
+              <w:left w:val="single" w:color="BFBFBF" w:sz="4"/>
+              <w:bottom w:val="single" w:color="BFBFBF" w:sz="4"/>
+              <w:right w:val="single" w:color="BFBFBF" w:sz="4"/>
+            </w:tcBorders>
+            <w:shd w:fill="F2F2F2" w:val="clear"/>
+            <w:tcMar>
+              <w:top w:type="dxa" w:w="60"/>
+              <w:left w:type="dxa" w:w="120"/>
+              <w:bottom w:type="dxa" w:w="60"/>
+              <w:right w:type="dxa" w:w="120"/>
+            </w:tcMar>
+            <w:vAlign w:val="center"/>
+          </w:tcPr>
+          <w:p>
+            <w:pPr>
+              <w:jc w:val="center"/>
+            </w:pPr>
+            <w:r>
+              <w:rPr>
+                <w:rFonts w:ascii="Calibri" w:cs="Calibri" w:eastAsia="Calibri" w:hAnsi="Calibri"/>
+                <w:sz w:val="19"/>
+                <w:szCs w:val="19"/>
+              </w:rPr>
+              <w:t xml:space="preserve">0,076</w:t>
+            </w:r>
+          </w:p>
+        </w:tc>
+      </w:tr>
+      <w:tr>
+        <w:tc>
+          <w:tcPr>
+            <w:tcW w:type="dxa" w:w="2340"/>
+            <w:tcBorders>
+              <w:top w:val="single" w:color="BFBFBF" w:sz="4"/>
+              <w:left w:val="single" w:color="BFBFBF" w:sz="4"/>
+              <w:bottom w:val="single" w:color="BFBFBF" w:sz="4"/>
+              <w:right w:val="single" w:color="BFBFBF" w:sz="4"/>
+            </w:tcBorders>
+            <w:shd w:fill="FFFFFF" w:val="clear"/>
+            <w:tcMar>
+              <w:top w:type="dxa" w:w="60"/>
+              <w:left w:type="dxa" w:w="120"/>
+              <w:bottom w:type="dxa" w:w="60"/>
+              <w:right w:type="dxa" w:w="120"/>
+            </w:tcMar>
+            <w:vAlign w:val="center"/>
+          </w:tcPr>
+          <w:p>
+            <w:pPr>
+              <w:jc w:val="left"/>
+            </w:pPr>
+            <w:r>
+              <w:rPr>
+                <w:rFonts w:ascii="Calibri" w:cs="Calibri" w:eastAsia="Calibri" w:hAnsi="Calibri"/>
+                <w:sz w:val="19"/>
+                <w:szCs w:val="19"/>
+              </w:rPr>
+              <w:t xml:space="preserve"/>
+            </w:r>
+          </w:p>
+        </w:tc>
+        <w:tc>
+          <w:tcPr>
+            <w:tcW w:type="dxa" w:w="1620"/>
+            <w:tcBorders>
+              <w:top w:val="single" w:color="BFBFBF" w:sz="4"/>
+              <w:left w:val="single" w:color="BFBFBF" w:sz="4"/>
+              <w:bottom w:val="single" w:color="BFBFBF" w:sz="4"/>
+              <w:right w:val="single" w:color="BFBFBF" w:sz="4"/>
+            </w:tcBorders>
+            <w:shd w:fill="FFFFFF" w:val="clear"/>
+            <w:tcMar>
+              <w:top w:type="dxa" w:w="60"/>
+              <w:left w:type="dxa" w:w="120"/>
+              <w:bottom w:type="dxa" w:w="60"/>
+              <w:right w:type="dxa" w:w="120"/>
+            </w:tcMar>
+            <w:vAlign w:val="center"/>
+          </w:tcPr>
+          <w:p>
+            <w:pPr>
+              <w:jc w:val="center"/>
+            </w:pPr>
+            <w:r>
+              <w:rPr>
+                <w:rFonts w:ascii="Calibri" w:cs="Calibri" w:eastAsia="Calibri" w:hAnsi="Calibri"/>
+                <w:sz w:val="19"/>
+                <w:szCs w:val="19"/>
+              </w:rPr>
+              <w:t xml:space="preserve">UEFA EP 2024</w:t>
+            </w:r>
+          </w:p>
+        </w:tc>
+        <w:tc>
+          <w:tcPr>
+            <w:tcW w:type="dxa" w:w="1350"/>
+            <w:tcBorders>
+              <w:top w:val="single" w:color="BFBFBF" w:sz="4"/>
+              <w:left w:val="single" w:color="BFBFBF" w:sz="4"/>
+              <w:bottom w:val="single" w:color="BFBFBF" w:sz="4"/>
+              <w:right w:val="single" w:color="BFBFBF" w:sz="4"/>
+            </w:tcBorders>
+            <w:shd w:fill="FFFFFF" w:val="clear"/>
+            <w:tcMar>
+              <w:top w:type="dxa" w:w="60"/>
+              <w:left w:type="dxa" w:w="120"/>
+              <w:bottom w:type="dxa" w:w="60"/>
+              <w:right w:type="dxa" w:w="120"/>
+            </w:tcMar>
+            <w:vAlign w:val="center"/>
+          </w:tcPr>
+          <w:p>
+            <w:pPr>
+              <w:jc w:val="center"/>
+            </w:pPr>
+            <w:r>
+              <w:rPr>
+                <w:rFonts w:ascii="Calibri" w:cs="Calibri" w:eastAsia="Calibri" w:hAnsi="Calibri"/>
+                <w:sz w:val="19"/>
+                <w:szCs w:val="19"/>
+              </w:rPr>
+              <w:t xml:space="preserve">0,744</w:t>
+            </w:r>
+          </w:p>
+        </w:tc>
+        <w:tc>
+          <w:tcPr>
+            <w:tcW w:type="dxa" w:w="1350"/>
+            <w:tcBorders>
+              <w:top w:val="single" w:color="BFBFBF" w:sz="4"/>
+              <w:left w:val="single" w:color="BFBFBF" w:sz="4"/>
+              <w:bottom w:val="single" w:color="BFBFBF" w:sz="4"/>
+              <w:right w:val="single" w:color="BFBFBF" w:sz="4"/>
+            </w:tcBorders>
+            <w:shd w:fill="FFFFFF" w:val="clear"/>
+            <w:tcMar>
+              <w:top w:type="dxa" w:w="60"/>
+              <w:left w:type="dxa" w:w="120"/>
+              <w:bottom w:type="dxa" w:w="60"/>
+              <w:right w:type="dxa" w:w="120"/>
+            </w:tcMar>
+            <w:vAlign w:val="center"/>
+          </w:tcPr>
+          <w:p>
+            <w:pPr>
+              <w:jc w:val="center"/>
+            </w:pPr>
+            <w:r>
+              <w:rPr>
+                <w:rFonts w:ascii="Calibri" w:cs="Calibri" w:eastAsia="Calibri" w:hAnsi="Calibri"/>
+                <w:sz w:val="19"/>
+                <w:szCs w:val="19"/>
+              </w:rPr>
+              <w:t xml:space="preserve">0,222</w:t>
+            </w:r>
+          </w:p>
+        </w:tc>
+        <w:tc>
+          <w:tcPr>
+            <w:tcW w:type="dxa" w:w="1350"/>
+            <w:tcBorders>
+              <w:top w:val="single" w:color="BFBFBF" w:sz="4"/>
+              <w:left w:val="single" w:color="BFBFBF" w:sz="4"/>
+              <w:bottom w:val="single" w:color="BFBFBF" w:sz="4"/>
+              <w:right w:val="single" w:color="BFBFBF" w:sz="4"/>
+            </w:tcBorders>
+            <w:shd w:fill="FFFFFF" w:val="clear"/>
+            <w:tcMar>
+              <w:top w:type="dxa" w:w="60"/>
+              <w:left w:type="dxa" w:w="120"/>
+              <w:bottom w:type="dxa" w:w="60"/>
+              <w:right w:type="dxa" w:w="120"/>
+            </w:tcMar>
+            <w:vAlign w:val="center"/>
+          </w:tcPr>
+          <w:p>
+            <w:pPr>
+              <w:jc w:val="center"/>
+            </w:pPr>
+            <w:r>
+              <w:rPr>
+                <w:rFonts w:ascii="Calibri" w:cs="Calibri" w:eastAsia="Calibri" w:hAnsi="Calibri"/>
+                <w:sz w:val="19"/>
+                <w:szCs w:val="19"/>
+              </w:rPr>
+              <w:t xml:space="preserve">0,316</w:t>
+            </w:r>
+          </w:p>
+        </w:tc>
+        <w:tc>
+          <w:tcPr>
+            <w:tcW w:type="dxa" w:w="1350"/>
+            <w:tcBorders>
+              <w:top w:val="single" w:color="BFBFBF" w:sz="4"/>
+              <w:left w:val="single" w:color="BFBFBF" w:sz="4"/>
+              <w:bottom w:val="single" w:color="BFBFBF" w:sz="4"/>
+              <w:right w:val="single" w:color="BFBFBF" w:sz="4"/>
+            </w:tcBorders>
+            <w:shd w:fill="FFFFFF" w:val="clear"/>
+            <w:tcMar>
+              <w:top w:type="dxa" w:w="60"/>
+              <w:left w:type="dxa" w:w="120"/>
+              <w:bottom w:type="dxa" w:w="60"/>
+              <w:right w:type="dxa" w:w="120"/>
+            </w:tcMar>
+            <w:vAlign w:val="center"/>
+          </w:tcPr>
+          <w:p>
+            <w:pPr>
+              <w:jc w:val="center"/>
+            </w:pPr>
+            <w:r>
+              <w:rPr>
+                <w:rFonts w:ascii="Calibri" w:cs="Calibri" w:eastAsia="Calibri" w:hAnsi="Calibri"/>
+                <w:sz w:val="19"/>
+                <w:szCs w:val="19"/>
+              </w:rPr>
+              <w:t xml:space="preserve">0,066</w:t>
+            </w:r>
+          </w:p>
+        </w:tc>
+      </w:tr>
+      <w:tr>
+        <w:tc>
+          <w:tcPr>
+            <w:tcW w:type="dxa" w:w="2340"/>
+            <w:tcBorders>
+              <w:top w:val="single" w:color="BFBFBF" w:sz="4"/>
+              <w:left w:val="single" w:color="BFBFBF" w:sz="4"/>
+              <w:bottom w:val="single" w:color="BFBFBF" w:sz="4"/>
+              <w:right w:val="single" w:color="BFBFBF" w:sz="4"/>
+            </w:tcBorders>
+            <w:shd w:fill="F2F2F2" w:val="clear"/>
+            <w:tcMar>
+              <w:top w:type="dxa" w:w="60"/>
+              <w:left w:type="dxa" w:w="120"/>
+              <w:bottom w:type="dxa" w:w="60"/>
+              <w:right w:type="dxa" w:w="120"/>
+            </w:tcMar>
+            <w:vAlign w:val="center"/>
+          </w:tcPr>
+          <w:p>
+            <w:pPr>
+              <w:jc w:val="left"/>
+            </w:pPr>
+            <w:r>
+              <w:rPr>
+                <w:rFonts w:ascii="Calibri" w:cs="Calibri" w:eastAsia="Calibri" w:hAnsi="Calibri"/>
+                <w:sz w:val="19"/>
+                <w:szCs w:val="19"/>
+              </w:rPr>
+              <w:t xml:space="preserve"/>
+            </w:r>
+          </w:p>
+        </w:tc>
+        <w:tc>
+          <w:tcPr>
+            <w:tcW w:type="dxa" w:w="1620"/>
+            <w:tcBorders>
+              <w:top w:val="single" w:color="BFBFBF" w:sz="4"/>
+              <w:left w:val="single" w:color="BFBFBF" w:sz="4"/>
+              <w:bottom w:val="single" w:color="BFBFBF" w:sz="4"/>
+              <w:right w:val="single" w:color="BFBFBF" w:sz="4"/>
+            </w:tcBorders>
+            <w:shd w:fill="F2F2F2" w:val="clear"/>
+            <w:tcMar>
+              <w:top w:type="dxa" w:w="60"/>
+              <w:left w:type="dxa" w:w="120"/>
+              <w:bottom w:type="dxa" w:w="60"/>
+              <w:right w:type="dxa" w:w="120"/>
+            </w:tcMar>
+            <w:vAlign w:val="center"/>
+          </w:tcPr>
+          <w:p>
+            <w:pPr>
+              <w:jc w:val="center"/>
+            </w:pPr>
+            <w:r>
+              <w:rPr>
+                <w:rFonts w:ascii="Calibri" w:cs="Calibri" w:eastAsia="Calibri" w:hAnsi="Calibri"/>
+                <w:sz w:val="19"/>
+                <w:szCs w:val="19"/>
+              </w:rPr>
+              <w:t xml:space="preserve">prosek ± SD</w:t>
+            </w:r>
+          </w:p>
+        </w:tc>
+        <w:tc>
+          <w:tcPr>
+            <w:tcW w:type="dxa" w:w="1350"/>
+            <w:tcBorders>
+              <w:top w:val="single" w:color="BFBFBF" w:sz="4"/>
+              <w:left w:val="single" w:color="BFBFBF" w:sz="4"/>
+              <w:bottom w:val="single" w:color="BFBFBF" w:sz="4"/>
+              <w:right w:val="single" w:color="BFBFBF" w:sz="4"/>
+            </w:tcBorders>
+            <w:shd w:fill="F2F2F2" w:val="clear"/>
+            <w:tcMar>
+              <w:top w:type="dxa" w:w="60"/>
+              <w:left w:type="dxa" w:w="120"/>
+              <w:bottom w:type="dxa" w:w="60"/>
+              <w:right w:type="dxa" w:w="120"/>
+            </w:tcMar>
+            <w:vAlign w:val="center"/>
+          </w:tcPr>
+          <w:p>
+            <w:pPr>
+              <w:jc w:val="center"/>
+            </w:pPr>
+            <w:r>
+              <w:rPr>
+                <w:rFonts w:ascii="Calibri" w:cs="Calibri" w:eastAsia="Calibri" w:hAnsi="Calibri"/>
+                <w:sz w:val="19"/>
+                <w:szCs w:val="19"/>
+              </w:rPr>
+              <w:t xml:space="preserve">0,769 ± 0,027</w:t>
+            </w:r>
+          </w:p>
+        </w:tc>
+        <w:tc>
+          <w:tcPr>
+            <w:tcW w:type="dxa" w:w="1350"/>
+            <w:tcBorders>
+              <w:top w:val="single" w:color="BFBFBF" w:sz="4"/>
+              <w:left w:val="single" w:color="BFBFBF" w:sz="4"/>
+              <w:bottom w:val="single" w:color="BFBFBF" w:sz="4"/>
+              <w:right w:val="single" w:color="BFBFBF" w:sz="4"/>
+            </w:tcBorders>
+            <w:shd w:fill="F2F2F2" w:val="clear"/>
+            <w:tcMar>
+              <w:top w:type="dxa" w:w="60"/>
+              <w:left w:type="dxa" w:w="120"/>
+              <w:bottom w:type="dxa" w:w="60"/>
+              <w:right w:type="dxa" w:w="120"/>
+            </w:tcMar>
+            <w:vAlign w:val="center"/>
+          </w:tcPr>
+          <w:p>
+            <w:pPr>
+              <w:jc w:val="center"/>
+            </w:pPr>
+            <w:r>
+              <w:rPr>
+                <w:rFonts w:ascii="Calibri" w:cs="Calibri" w:eastAsia="Calibri" w:hAnsi="Calibri"/>
+                <w:sz w:val="19"/>
+                <w:szCs w:val="19"/>
+              </w:rPr>
+              <w:t xml:space="preserve">0,321 ± 0,086</w:t>
+            </w:r>
+          </w:p>
+        </w:tc>
+        <w:tc>
+          <w:tcPr>
+            <w:tcW w:type="dxa" w:w="1350"/>
+            <w:tcBorders>
+              <w:top w:val="single" w:color="BFBFBF" w:sz="4"/>
+              <w:left w:val="single" w:color="BFBFBF" w:sz="4"/>
+              <w:bottom w:val="single" w:color="BFBFBF" w:sz="4"/>
+              <w:right w:val="single" w:color="BFBFBF" w:sz="4"/>
+            </w:tcBorders>
+            <w:shd w:fill="F2F2F2" w:val="clear"/>
+            <w:tcMar>
+              <w:top w:type="dxa" w:w="60"/>
+              <w:left w:type="dxa" w:w="120"/>
+              <w:bottom w:type="dxa" w:w="60"/>
+              <w:right w:type="dxa" w:w="120"/>
+            </w:tcMar>
+            <w:vAlign w:val="center"/>
+          </w:tcPr>
+          <w:p>
+            <w:pPr>
+              <w:jc w:val="center"/>
+            </w:pPr>
+            <w:r>
+              <w:rPr>
+                <w:rFonts w:ascii="Calibri" w:cs="Calibri" w:eastAsia="Calibri" w:hAnsi="Calibri"/>
+                <w:sz w:val="19"/>
+                <w:szCs w:val="19"/>
+              </w:rPr>
+              <w:t xml:space="preserve">0,388 ± 0,063</w:t>
+            </w:r>
+          </w:p>
+        </w:tc>
+        <w:tc>
+          <w:tcPr>
+            <w:tcW w:type="dxa" w:w="1350"/>
+            <w:tcBorders>
+              <w:top w:val="single" w:color="BFBFBF" w:sz="4"/>
+              <w:left w:val="single" w:color="BFBFBF" w:sz="4"/>
+              <w:bottom w:val="single" w:color="BFBFBF" w:sz="4"/>
+              <w:right w:val="single" w:color="BFBFBF" w:sz="4"/>
+            </w:tcBorders>
+            <w:shd w:fill="F2F2F2" w:val="clear"/>
+            <w:tcMar>
+              <w:top w:type="dxa" w:w="60"/>
+              <w:left w:type="dxa" w:w="120"/>
+              <w:bottom w:type="dxa" w:w="60"/>
+              <w:right w:type="dxa" w:w="120"/>
+            </w:tcMar>
+            <w:vAlign w:val="center"/>
+          </w:tcPr>
+          <w:p>
+            <w:pPr>
+              <w:jc w:val="center"/>
+            </w:pPr>
+            <w:r>
+              <w:rPr>
+                <w:rFonts w:ascii="Calibri" w:cs="Calibri" w:eastAsia="Calibri" w:hAnsi="Calibri"/>
+                <w:sz w:val="19"/>
+                <w:szCs w:val="19"/>
+              </w:rPr>
+              <w:t xml:space="preserve">0,074 ± 0,008</w:t>
+            </w:r>
+          </w:p>
+        </w:tc>
+      </w:tr>
+      <w:tr>
+        <w:tc>
+          <w:tcPr>
+            <w:tcW w:type="dxa" w:w="2340"/>
+            <w:tcBorders>
+              <w:top w:val="single" w:color="BFBFBF" w:sz="4"/>
+              <w:left w:val="single" w:color="BFBFBF" w:sz="4"/>
+              <w:bottom w:val="single" w:color="BFBFBF" w:sz="4"/>
+              <w:right w:val="single" w:color="BFBFBF" w:sz="4"/>
+            </w:tcBorders>
+            <w:shd w:fill="FFFFFF" w:val="clear"/>
+            <w:tcMar>
+              <w:top w:type="dxa" w:w="60"/>
+              <w:left w:type="dxa" w:w="120"/>
+              <w:bottom w:type="dxa" w:w="60"/>
+              <w:right w:type="dxa" w:w="120"/>
+            </w:tcMar>
+            <w:vAlign w:val="center"/>
+          </w:tcPr>
+          <w:p>
+            <w:pPr>
+              <w:jc w:val="left"/>
+            </w:pPr>
+            <w:r>
+              <w:rPr>
+                <w:rFonts w:ascii="Calibri" w:cs="Calibri" w:eastAsia="Calibri" w:hAnsi="Calibri"/>
+                <w:sz w:val="19"/>
+                <w:szCs w:val="19"/>
+              </w:rPr>
               <w:t xml:space="preserve">Model B, XGBoost</w:t>
             </w:r>
           </w:p>
         </w:tc>
         <w:tc>
           <w:tcPr>
-            <w:tcW w:type="dxa" w:w="1500"/>
+            <w:tcW w:type="dxa" w:w="1620"/>
+            <w:tcBorders>
+              <w:top w:val="single" w:color="BFBFBF" w:sz="4"/>
+              <w:left w:val="single" w:color="BFBFBF" w:sz="4"/>
+              <w:bottom w:val="single" w:color="BFBFBF" w:sz="4"/>
+              <w:right w:val="single" w:color="BFBFBF" w:sz="4"/>
+            </w:tcBorders>
+            <w:shd w:fill="FFFFFF" w:val="clear"/>
+            <w:tcMar>
+              <w:top w:type="dxa" w:w="60"/>
+              <w:left w:type="dxa" w:w="120"/>
+              <w:bottom w:type="dxa" w:w="60"/>
+              <w:right w:type="dxa" w:w="120"/>
+            </w:tcMar>
+            <w:vAlign w:val="center"/>
+          </w:tcPr>
+          <w:p>
+            <w:pPr>
+              <w:jc w:val="center"/>
+            </w:pPr>
+            <w:r>
+              <w:rPr>
+                <w:rFonts w:ascii="Calibri" w:cs="Calibri" w:eastAsia="Calibri" w:hAnsi="Calibri"/>
+                <w:sz w:val="19"/>
+                <w:szCs w:val="19"/>
+              </w:rPr>
+              <w:t xml:space="preserve">FIFA SP 2022</w:t>
+            </w:r>
+          </w:p>
+        </w:tc>
+        <w:tc>
+          <w:tcPr>
+            <w:tcW w:type="dxa" w:w="1350"/>
+            <w:tcBorders>
+              <w:top w:val="single" w:color="BFBFBF" w:sz="4"/>
+              <w:left w:val="single" w:color="BFBFBF" w:sz="4"/>
+              <w:bottom w:val="single" w:color="BFBFBF" w:sz="4"/>
+              <w:right w:val="single" w:color="BFBFBF" w:sz="4"/>
+            </w:tcBorders>
+            <w:shd w:fill="FFFFFF" w:val="clear"/>
+            <w:tcMar>
+              <w:top w:type="dxa" w:w="60"/>
+              <w:left w:type="dxa" w:w="120"/>
+              <w:bottom w:type="dxa" w:w="60"/>
+              <w:right w:type="dxa" w:w="120"/>
+            </w:tcMar>
+            <w:vAlign w:val="center"/>
+          </w:tcPr>
+          <w:p>
+            <w:pPr>
+              <w:jc w:val="center"/>
+            </w:pPr>
+            <w:r>
+              <w:rPr>
+                <w:rFonts w:ascii="Calibri" w:cs="Calibri" w:eastAsia="Calibri" w:hAnsi="Calibri"/>
+                <w:sz w:val="19"/>
+                <w:szCs w:val="19"/>
+              </w:rPr>
+              <w:t xml:space="preserve">0,802</w:t>
+            </w:r>
+          </w:p>
+        </w:tc>
+        <w:tc>
+          <w:tcPr>
+            <w:tcW w:type="dxa" w:w="1350"/>
+            <w:tcBorders>
+              <w:top w:val="single" w:color="BFBFBF" w:sz="4"/>
+              <w:left w:val="single" w:color="BFBFBF" w:sz="4"/>
+              <w:bottom w:val="single" w:color="BFBFBF" w:sz="4"/>
+              <w:right w:val="single" w:color="BFBFBF" w:sz="4"/>
+            </w:tcBorders>
+            <w:shd w:fill="FFFFFF" w:val="clear"/>
+            <w:tcMar>
+              <w:top w:type="dxa" w:w="60"/>
+              <w:left w:type="dxa" w:w="120"/>
+              <w:bottom w:type="dxa" w:w="60"/>
+              <w:right w:type="dxa" w:w="120"/>
+            </w:tcMar>
+            <w:vAlign w:val="center"/>
+          </w:tcPr>
+          <w:p>
+            <w:pPr>
+              <w:jc w:val="center"/>
+            </w:pPr>
+            <w:r>
+              <w:rPr>
+                <w:rFonts w:ascii="Calibri" w:cs="Calibri" w:eastAsia="Calibri" w:hAnsi="Calibri"/>
+                <w:sz w:val="19"/>
+                <w:szCs w:val="19"/>
+              </w:rPr>
+              <w:t xml:space="preserve">0,364</w:t>
+            </w:r>
+          </w:p>
+        </w:tc>
+        <w:tc>
+          <w:tcPr>
+            <w:tcW w:type="dxa" w:w="1350"/>
+            <w:tcBorders>
+              <w:top w:val="single" w:color="BFBFBF" w:sz="4"/>
+              <w:left w:val="single" w:color="BFBFBF" w:sz="4"/>
+              <w:bottom w:val="single" w:color="BFBFBF" w:sz="4"/>
+              <w:right w:val="single" w:color="BFBFBF" w:sz="4"/>
+            </w:tcBorders>
+            <w:shd w:fill="FFFFFF" w:val="clear"/>
+            <w:tcMar>
+              <w:top w:type="dxa" w:w="60"/>
+              <w:left w:type="dxa" w:w="120"/>
+              <w:bottom w:type="dxa" w:w="60"/>
+              <w:right w:type="dxa" w:w="120"/>
+            </w:tcMar>
+            <w:vAlign w:val="center"/>
+          </w:tcPr>
+          <w:p>
+            <w:pPr>
+              <w:jc w:val="center"/>
+            </w:pPr>
+            <w:r>
+              <w:rPr>
+                <w:rFonts w:ascii="Calibri" w:cs="Calibri" w:eastAsia="Calibri" w:hAnsi="Calibri"/>
+                <w:sz w:val="19"/>
+                <w:szCs w:val="19"/>
+              </w:rPr>
+              <w:t xml:space="preserve">0,417</w:t>
+            </w:r>
+          </w:p>
+        </w:tc>
+        <w:tc>
+          <w:tcPr>
+            <w:tcW w:type="dxa" w:w="1350"/>
+            <w:tcBorders>
+              <w:top w:val="single" w:color="BFBFBF" w:sz="4"/>
+              <w:left w:val="single" w:color="BFBFBF" w:sz="4"/>
+              <w:bottom w:val="single" w:color="BFBFBF" w:sz="4"/>
+              <w:right w:val="single" w:color="BFBFBF" w:sz="4"/>
+            </w:tcBorders>
+            <w:shd w:fill="FFFFFF" w:val="clear"/>
+            <w:tcMar>
+              <w:top w:type="dxa" w:w="60"/>
+              <w:left w:type="dxa" w:w="120"/>
+              <w:bottom w:type="dxa" w:w="60"/>
+              <w:right w:type="dxa" w:w="120"/>
+            </w:tcMar>
+            <w:vAlign w:val="center"/>
+          </w:tcPr>
+          <w:p>
+            <w:pPr>
+              <w:jc w:val="center"/>
+            </w:pPr>
+            <w:r>
+              <w:rPr>
+                <w:rFonts w:ascii="Calibri" w:cs="Calibri" w:eastAsia="Calibri" w:hAnsi="Calibri"/>
+                <w:sz w:val="19"/>
+                <w:szCs w:val="19"/>
+              </w:rPr>
+              <w:t xml:space="preserve">0,082</w:t>
+            </w:r>
+          </w:p>
+        </w:tc>
+      </w:tr>
+      <w:tr>
+        <w:tc>
+          <w:tcPr>
+            <w:tcW w:type="dxa" w:w="2340"/>
             <w:tcBorders>
               <w:top w:val="single" w:color="BFBFBF" w:sz="4"/>
               <w:left w:val="single" w:color="BFBFBF" w:sz="4"/>
@@ -4827,21 +6849,21 @@
           </w:tcPr>
           <w:p>
             <w:pPr>
-              <w:jc w:val="center"/>
-            </w:pPr>
-            <w:r>
-              <w:rPr>
-                <w:rFonts w:ascii="Calibri" w:cs="Calibri" w:eastAsia="Calibri" w:hAnsi="Calibri"/>
-                <w:sz w:val="19"/>
-                <w:szCs w:val="19"/>
-              </w:rPr>
-              <w:t xml:space="preserve">0,775</w:t>
-            </w:r>
-          </w:p>
-        </w:tc>
-        <w:tc>
-          <w:tcPr>
-            <w:tcW w:type="dxa" w:w="1500"/>
+              <w:jc w:val="left"/>
+            </w:pPr>
+            <w:r>
+              <w:rPr>
+                <w:rFonts w:ascii="Calibri" w:cs="Calibri" w:eastAsia="Calibri" w:hAnsi="Calibri"/>
+                <w:sz w:val="19"/>
+                <w:szCs w:val="19"/>
+              </w:rPr>
+              <w:t xml:space="preserve"/>
+            </w:r>
+          </w:p>
+        </w:tc>
+        <w:tc>
+          <w:tcPr>
+            <w:tcW w:type="dxa" w:w="1620"/>
             <w:tcBorders>
               <w:top w:val="single" w:color="BFBFBF" w:sz="4"/>
               <w:left w:val="single" w:color="BFBFBF" w:sz="4"/>
@@ -4867,13 +6889,13 @@
                 <w:sz w:val="19"/>
                 <w:szCs w:val="19"/>
               </w:rPr>
-              <w:t xml:space="preserve">0,316</w:t>
-            </w:r>
-          </w:p>
-        </w:tc>
-        <w:tc>
-          <w:tcPr>
-            <w:tcW w:type="dxa" w:w="1500"/>
+              <w:t xml:space="preserve">UEFA EP 2020</w:t>
+            </w:r>
+          </w:p>
+        </w:tc>
+        <w:tc>
+          <w:tcPr>
+            <w:tcW w:type="dxa" w:w="1350"/>
             <w:tcBorders>
               <w:top w:val="single" w:color="BFBFBF" w:sz="4"/>
               <w:left w:val="single" w:color="BFBFBF" w:sz="4"/>
@@ -4899,13 +6921,13 @@
                 <w:sz w:val="19"/>
                 <w:szCs w:val="19"/>
               </w:rPr>
-              <w:t xml:space="preserve">0,390</w:t>
-            </w:r>
-          </w:p>
-        </w:tc>
-        <w:tc>
-          <w:tcPr>
-            <w:tcW w:type="dxa" w:w="1500"/>
+              <w:t xml:space="preserve">0,772</w:t>
+            </w:r>
+          </w:p>
+        </w:tc>
+        <w:tc>
+          <w:tcPr>
+            <w:tcW w:type="dxa" w:w="1350"/>
             <w:tcBorders>
               <w:top w:val="single" w:color="BFBFBF" w:sz="4"/>
               <w:left w:val="single" w:color="BFBFBF" w:sz="4"/>
@@ -4931,7 +6953,459 @@
                 <w:sz w:val="19"/>
                 <w:szCs w:val="19"/>
               </w:rPr>
-              <w:t xml:space="preserve">0,074</w:t>
+              <w:t xml:space="preserve">0,343</w:t>
+            </w:r>
+          </w:p>
+        </w:tc>
+        <w:tc>
+          <w:tcPr>
+            <w:tcW w:type="dxa" w:w="1350"/>
+            <w:tcBorders>
+              <w:top w:val="single" w:color="BFBFBF" w:sz="4"/>
+              <w:left w:val="single" w:color="BFBFBF" w:sz="4"/>
+              <w:bottom w:val="single" w:color="BFBFBF" w:sz="4"/>
+              <w:right w:val="single" w:color="BFBFBF" w:sz="4"/>
+            </w:tcBorders>
+            <w:shd w:fill="F2F2F2" w:val="clear"/>
+            <w:tcMar>
+              <w:top w:type="dxa" w:w="60"/>
+              <w:left w:type="dxa" w:w="120"/>
+              <w:bottom w:type="dxa" w:w="60"/>
+              <w:right w:type="dxa" w:w="120"/>
+            </w:tcMar>
+            <w:vAlign w:val="center"/>
+          </w:tcPr>
+          <w:p>
+            <w:pPr>
+              <w:jc w:val="center"/>
+            </w:pPr>
+            <w:r>
+              <w:rPr>
+                <w:rFonts w:ascii="Calibri" w:cs="Calibri" w:eastAsia="Calibri" w:hAnsi="Calibri"/>
+                <w:sz w:val="19"/>
+                <w:szCs w:val="19"/>
+              </w:rPr>
+              <w:t xml:space="preserve">0,432</w:t>
+            </w:r>
+          </w:p>
+        </w:tc>
+        <w:tc>
+          <w:tcPr>
+            <w:tcW w:type="dxa" w:w="1350"/>
+            <w:tcBorders>
+              <w:top w:val="single" w:color="BFBFBF" w:sz="4"/>
+              <w:left w:val="single" w:color="BFBFBF" w:sz="4"/>
+              <w:bottom w:val="single" w:color="BFBFBF" w:sz="4"/>
+              <w:right w:val="single" w:color="BFBFBF" w:sz="4"/>
+            </w:tcBorders>
+            <w:shd w:fill="F2F2F2" w:val="clear"/>
+            <w:tcMar>
+              <w:top w:type="dxa" w:w="60"/>
+              <w:left w:type="dxa" w:w="120"/>
+              <w:bottom w:type="dxa" w:w="60"/>
+              <w:right w:type="dxa" w:w="120"/>
+            </w:tcMar>
+            <w:vAlign w:val="center"/>
+          </w:tcPr>
+          <w:p>
+            <w:pPr>
+              <w:jc w:val="center"/>
+            </w:pPr>
+            <w:r>
+              <w:rPr>
+                <w:rFonts w:ascii="Calibri" w:cs="Calibri" w:eastAsia="Calibri" w:hAnsi="Calibri"/>
+                <w:sz w:val="19"/>
+                <w:szCs w:val="19"/>
+              </w:rPr>
+              <w:t xml:space="preserve">0,076</w:t>
+            </w:r>
+          </w:p>
+        </w:tc>
+      </w:tr>
+      <w:tr>
+        <w:tc>
+          <w:tcPr>
+            <w:tcW w:type="dxa" w:w="2340"/>
+            <w:tcBorders>
+              <w:top w:val="single" w:color="BFBFBF" w:sz="4"/>
+              <w:left w:val="single" w:color="BFBFBF" w:sz="4"/>
+              <w:bottom w:val="single" w:color="BFBFBF" w:sz="4"/>
+              <w:right w:val="single" w:color="BFBFBF" w:sz="4"/>
+            </w:tcBorders>
+            <w:shd w:fill="FFFFFF" w:val="clear"/>
+            <w:tcMar>
+              <w:top w:type="dxa" w:w="60"/>
+              <w:left w:type="dxa" w:w="120"/>
+              <w:bottom w:type="dxa" w:w="60"/>
+              <w:right w:type="dxa" w:w="120"/>
+            </w:tcMar>
+            <w:vAlign w:val="center"/>
+          </w:tcPr>
+          <w:p>
+            <w:pPr>
+              <w:jc w:val="left"/>
+            </w:pPr>
+            <w:r>
+              <w:rPr>
+                <w:rFonts w:ascii="Calibri" w:cs="Calibri" w:eastAsia="Calibri" w:hAnsi="Calibri"/>
+                <w:sz w:val="19"/>
+                <w:szCs w:val="19"/>
+              </w:rPr>
+              <w:t xml:space="preserve"/>
+            </w:r>
+          </w:p>
+        </w:tc>
+        <w:tc>
+          <w:tcPr>
+            <w:tcW w:type="dxa" w:w="1620"/>
+            <w:tcBorders>
+              <w:top w:val="single" w:color="BFBFBF" w:sz="4"/>
+              <w:left w:val="single" w:color="BFBFBF" w:sz="4"/>
+              <w:bottom w:val="single" w:color="BFBFBF" w:sz="4"/>
+              <w:right w:val="single" w:color="BFBFBF" w:sz="4"/>
+            </w:tcBorders>
+            <w:shd w:fill="FFFFFF" w:val="clear"/>
+            <w:tcMar>
+              <w:top w:type="dxa" w:w="60"/>
+              <w:left w:type="dxa" w:w="120"/>
+              <w:bottom w:type="dxa" w:w="60"/>
+              <w:right w:type="dxa" w:w="120"/>
+            </w:tcMar>
+            <w:vAlign w:val="center"/>
+          </w:tcPr>
+          <w:p>
+            <w:pPr>
+              <w:jc w:val="center"/>
+            </w:pPr>
+            <w:r>
+              <w:rPr>
+                <w:rFonts w:ascii="Calibri" w:cs="Calibri" w:eastAsia="Calibri" w:hAnsi="Calibri"/>
+                <w:sz w:val="19"/>
+                <w:szCs w:val="19"/>
+              </w:rPr>
+              <w:t xml:space="preserve">UEFA EP 2024</w:t>
+            </w:r>
+          </w:p>
+        </w:tc>
+        <w:tc>
+          <w:tcPr>
+            <w:tcW w:type="dxa" w:w="1350"/>
+            <w:tcBorders>
+              <w:top w:val="single" w:color="BFBFBF" w:sz="4"/>
+              <w:left w:val="single" w:color="BFBFBF" w:sz="4"/>
+              <w:bottom w:val="single" w:color="BFBFBF" w:sz="4"/>
+              <w:right w:val="single" w:color="BFBFBF" w:sz="4"/>
+            </w:tcBorders>
+            <w:shd w:fill="FFFFFF" w:val="clear"/>
+            <w:tcMar>
+              <w:top w:type="dxa" w:w="60"/>
+              <w:left w:type="dxa" w:w="120"/>
+              <w:bottom w:type="dxa" w:w="60"/>
+              <w:right w:type="dxa" w:w="120"/>
+            </w:tcMar>
+            <w:vAlign w:val="center"/>
+          </w:tcPr>
+          <w:p>
+            <w:pPr>
+              <w:jc w:val="center"/>
+            </w:pPr>
+            <w:r>
+              <w:rPr>
+                <w:rFonts w:ascii="Calibri" w:cs="Calibri" w:eastAsia="Calibri" w:hAnsi="Calibri"/>
+                <w:sz w:val="19"/>
+                <w:szCs w:val="19"/>
+              </w:rPr>
+              <w:t xml:space="preserve">0,746</w:t>
+            </w:r>
+          </w:p>
+        </w:tc>
+        <w:tc>
+          <w:tcPr>
+            <w:tcW w:type="dxa" w:w="1350"/>
+            <w:tcBorders>
+              <w:top w:val="single" w:color="BFBFBF" w:sz="4"/>
+              <w:left w:val="single" w:color="BFBFBF" w:sz="4"/>
+              <w:bottom w:val="single" w:color="BFBFBF" w:sz="4"/>
+              <w:right w:val="single" w:color="BFBFBF" w:sz="4"/>
+            </w:tcBorders>
+            <w:shd w:fill="FFFFFF" w:val="clear"/>
+            <w:tcMar>
+              <w:top w:type="dxa" w:w="60"/>
+              <w:left w:type="dxa" w:w="120"/>
+              <w:bottom w:type="dxa" w:w="60"/>
+              <w:right w:type="dxa" w:w="120"/>
+            </w:tcMar>
+            <w:vAlign w:val="center"/>
+          </w:tcPr>
+          <w:p>
+            <w:pPr>
+              <w:jc w:val="center"/>
+            </w:pPr>
+            <w:r>
+              <w:rPr>
+                <w:rFonts w:ascii="Calibri" w:cs="Calibri" w:eastAsia="Calibri" w:hAnsi="Calibri"/>
+                <w:sz w:val="19"/>
+                <w:szCs w:val="19"/>
+              </w:rPr>
+              <w:t xml:space="preserve">0,225</w:t>
+            </w:r>
+          </w:p>
+        </w:tc>
+        <w:tc>
+          <w:tcPr>
+            <w:tcW w:type="dxa" w:w="1350"/>
+            <w:tcBorders>
+              <w:top w:val="single" w:color="BFBFBF" w:sz="4"/>
+              <w:left w:val="single" w:color="BFBFBF" w:sz="4"/>
+              <w:bottom w:val="single" w:color="BFBFBF" w:sz="4"/>
+              <w:right w:val="single" w:color="BFBFBF" w:sz="4"/>
+            </w:tcBorders>
+            <w:shd w:fill="FFFFFF" w:val="clear"/>
+            <w:tcMar>
+              <w:top w:type="dxa" w:w="60"/>
+              <w:left w:type="dxa" w:w="120"/>
+              <w:bottom w:type="dxa" w:w="60"/>
+              <w:right w:type="dxa" w:w="120"/>
+            </w:tcMar>
+            <w:vAlign w:val="center"/>
+          </w:tcPr>
+          <w:p>
+            <w:pPr>
+              <w:jc w:val="center"/>
+            </w:pPr>
+            <w:r>
+              <w:rPr>
+                <w:rFonts w:ascii="Calibri" w:cs="Calibri" w:eastAsia="Calibri" w:hAnsi="Calibri"/>
+                <w:sz w:val="19"/>
+                <w:szCs w:val="19"/>
+              </w:rPr>
+              <w:t xml:space="preserve">0,329</w:t>
+            </w:r>
+          </w:p>
+        </w:tc>
+        <w:tc>
+          <w:tcPr>
+            <w:tcW w:type="dxa" w:w="1350"/>
+            <w:tcBorders>
+              <w:top w:val="single" w:color="BFBFBF" w:sz="4"/>
+              <w:left w:val="single" w:color="BFBFBF" w:sz="4"/>
+              <w:bottom w:val="single" w:color="BFBFBF" w:sz="4"/>
+              <w:right w:val="single" w:color="BFBFBF" w:sz="4"/>
+            </w:tcBorders>
+            <w:shd w:fill="FFFFFF" w:val="clear"/>
+            <w:tcMar>
+              <w:top w:type="dxa" w:w="60"/>
+              <w:left w:type="dxa" w:w="120"/>
+              <w:bottom w:type="dxa" w:w="60"/>
+              <w:right w:type="dxa" w:w="120"/>
+            </w:tcMar>
+            <w:vAlign w:val="center"/>
+          </w:tcPr>
+          <w:p>
+            <w:pPr>
+              <w:jc w:val="center"/>
+            </w:pPr>
+            <w:r>
+              <w:rPr>
+                <w:rFonts w:ascii="Calibri" w:cs="Calibri" w:eastAsia="Calibri" w:hAnsi="Calibri"/>
+                <w:sz w:val="19"/>
+                <w:szCs w:val="19"/>
+              </w:rPr>
+              <w:t xml:space="preserve">0,065</w:t>
+            </w:r>
+          </w:p>
+        </w:tc>
+      </w:tr>
+      <w:tr>
+        <w:tc>
+          <w:tcPr>
+            <w:tcW w:type="dxa" w:w="2340"/>
+            <w:tcBorders>
+              <w:top w:val="single" w:color="BFBFBF" w:sz="4"/>
+              <w:left w:val="single" w:color="BFBFBF" w:sz="4"/>
+              <w:bottom w:val="single" w:color="BFBFBF" w:sz="4"/>
+              <w:right w:val="single" w:color="BFBFBF" w:sz="4"/>
+            </w:tcBorders>
+            <w:shd w:fill="F2F2F2" w:val="clear"/>
+            <w:tcMar>
+              <w:top w:type="dxa" w:w="60"/>
+              <w:left w:type="dxa" w:w="120"/>
+              <w:bottom w:type="dxa" w:w="60"/>
+              <w:right w:type="dxa" w:w="120"/>
+            </w:tcMar>
+            <w:vAlign w:val="center"/>
+          </w:tcPr>
+          <w:p>
+            <w:pPr>
+              <w:jc w:val="left"/>
+            </w:pPr>
+            <w:r>
+              <w:rPr>
+                <w:rFonts w:ascii="Calibri" w:cs="Calibri" w:eastAsia="Calibri" w:hAnsi="Calibri"/>
+                <w:sz w:val="19"/>
+                <w:szCs w:val="19"/>
+              </w:rPr>
+              <w:t xml:space="preserve"/>
+            </w:r>
+          </w:p>
+        </w:tc>
+        <w:tc>
+          <w:tcPr>
+            <w:tcW w:type="dxa" w:w="1620"/>
+            <w:tcBorders>
+              <w:top w:val="single" w:color="BFBFBF" w:sz="4"/>
+              <w:left w:val="single" w:color="BFBFBF" w:sz="4"/>
+              <w:bottom w:val="single" w:color="BFBFBF" w:sz="4"/>
+              <w:right w:val="single" w:color="BFBFBF" w:sz="4"/>
+            </w:tcBorders>
+            <w:shd w:fill="F2F2F2" w:val="clear"/>
+            <w:tcMar>
+              <w:top w:type="dxa" w:w="60"/>
+              <w:left w:type="dxa" w:w="120"/>
+              <w:bottom w:type="dxa" w:w="60"/>
+              <w:right w:type="dxa" w:w="120"/>
+            </w:tcMar>
+            <w:vAlign w:val="center"/>
+          </w:tcPr>
+          <w:p>
+            <w:pPr>
+              <w:jc w:val="center"/>
+            </w:pPr>
+            <w:r>
+              <w:rPr>
+                <w:rFonts w:ascii="Calibri" w:cs="Calibri" w:eastAsia="Calibri" w:hAnsi="Calibri"/>
+                <w:sz w:val="19"/>
+                <w:szCs w:val="19"/>
+              </w:rPr>
+              <w:t xml:space="preserve">prosek ± SD</w:t>
+            </w:r>
+          </w:p>
+        </w:tc>
+        <w:tc>
+          <w:tcPr>
+            <w:tcW w:type="dxa" w:w="1350"/>
+            <w:tcBorders>
+              <w:top w:val="single" w:color="BFBFBF" w:sz="4"/>
+              <w:left w:val="single" w:color="BFBFBF" w:sz="4"/>
+              <w:bottom w:val="single" w:color="BFBFBF" w:sz="4"/>
+              <w:right w:val="single" w:color="BFBFBF" w:sz="4"/>
+            </w:tcBorders>
+            <w:shd w:fill="F2F2F2" w:val="clear"/>
+            <w:tcMar>
+              <w:top w:type="dxa" w:w="60"/>
+              <w:left w:type="dxa" w:w="120"/>
+              <w:bottom w:type="dxa" w:w="60"/>
+              <w:right w:type="dxa" w:w="120"/>
+            </w:tcMar>
+            <w:vAlign w:val="center"/>
+          </w:tcPr>
+          <w:p>
+            <w:pPr>
+              <w:jc w:val="center"/>
+            </w:pPr>
+            <w:r>
+              <w:rPr>
+                <w:rFonts w:ascii="Calibri" w:cs="Calibri" w:eastAsia="Calibri" w:hAnsi="Calibri"/>
+                <w:sz w:val="19"/>
+                <w:szCs w:val="19"/>
+              </w:rPr>
+              <w:t xml:space="preserve">0,773 ± 0,028</w:t>
+            </w:r>
+          </w:p>
+        </w:tc>
+        <w:tc>
+          <w:tcPr>
+            <w:tcW w:type="dxa" w:w="1350"/>
+            <w:tcBorders>
+              <w:top w:val="single" w:color="BFBFBF" w:sz="4"/>
+              <w:left w:val="single" w:color="BFBFBF" w:sz="4"/>
+              <w:bottom w:val="single" w:color="BFBFBF" w:sz="4"/>
+              <w:right w:val="single" w:color="BFBFBF" w:sz="4"/>
+            </w:tcBorders>
+            <w:shd w:fill="F2F2F2" w:val="clear"/>
+            <w:tcMar>
+              <w:top w:type="dxa" w:w="60"/>
+              <w:left w:type="dxa" w:w="120"/>
+              <w:bottom w:type="dxa" w:w="60"/>
+              <w:right w:type="dxa" w:w="120"/>
+            </w:tcMar>
+            <w:vAlign w:val="center"/>
+          </w:tcPr>
+          <w:p>
+            <w:pPr>
+              <w:jc w:val="center"/>
+            </w:pPr>
+            <w:r>
+              <w:rPr>
+                <w:rFonts w:ascii="Calibri" w:cs="Calibri" w:eastAsia="Calibri" w:hAnsi="Calibri"/>
+                <w:sz w:val="19"/>
+                <w:szCs w:val="19"/>
+              </w:rPr>
+              <w:t xml:space="preserve">0,311 ± 0,075</w:t>
+            </w:r>
+          </w:p>
+        </w:tc>
+        <w:tc>
+          <w:tcPr>
+            <w:tcW w:type="dxa" w:w="1350"/>
+            <w:tcBorders>
+              <w:top w:val="single" w:color="BFBFBF" w:sz="4"/>
+              <w:left w:val="single" w:color="BFBFBF" w:sz="4"/>
+              <w:bottom w:val="single" w:color="BFBFBF" w:sz="4"/>
+              <w:right w:val="single" w:color="BFBFBF" w:sz="4"/>
+            </w:tcBorders>
+            <w:shd w:fill="F2F2F2" w:val="clear"/>
+            <w:tcMar>
+              <w:top w:type="dxa" w:w="60"/>
+              <w:left w:type="dxa" w:w="120"/>
+              <w:bottom w:type="dxa" w:w="60"/>
+              <w:right w:type="dxa" w:w="120"/>
+            </w:tcMar>
+            <w:vAlign w:val="center"/>
+          </w:tcPr>
+          <w:p>
+            <w:pPr>
+              <w:jc w:val="center"/>
+            </w:pPr>
+            <w:r>
+              <w:rPr>
+                <w:rFonts w:ascii="Calibri" w:cs="Calibri" w:eastAsia="Calibri" w:hAnsi="Calibri"/>
+                <w:sz w:val="19"/>
+                <w:szCs w:val="19"/>
+              </w:rPr>
+              <w:t xml:space="preserve">0,392 ± 0,056</w:t>
+            </w:r>
+          </w:p>
+        </w:tc>
+        <w:tc>
+          <w:tcPr>
+            <w:tcW w:type="dxa" w:w="1350"/>
+            <w:tcBorders>
+              <w:top w:val="single" w:color="BFBFBF" w:sz="4"/>
+              <w:left w:val="single" w:color="BFBFBF" w:sz="4"/>
+              <w:bottom w:val="single" w:color="BFBFBF" w:sz="4"/>
+              <w:right w:val="single" w:color="BFBFBF" w:sz="4"/>
+            </w:tcBorders>
+            <w:shd w:fill="F2F2F2" w:val="clear"/>
+            <w:tcMar>
+              <w:top w:type="dxa" w:w="60"/>
+              <w:left w:type="dxa" w:w="120"/>
+              <w:bottom w:type="dxa" w:w="60"/>
+              <w:right w:type="dxa" w:w="120"/>
+            </w:tcMar>
+            <w:vAlign w:val="center"/>
+          </w:tcPr>
+          <w:p>
+            <w:pPr>
+              <w:jc w:val="center"/>
+            </w:pPr>
+            <w:r>
+              <w:rPr>
+                <w:rFonts w:ascii="Calibri" w:cs="Calibri" w:eastAsia="Calibri" w:hAnsi="Calibri"/>
+                <w:sz w:val="19"/>
+                <w:szCs w:val="19"/>
+              </w:rPr>
+              <w:t xml:space="preserve">0,074 ± 0,009</w:t>
             </w:r>
           </w:p>
         </w:tc>
@@ -4949,7 +7423,7 @@
           <w:sz w:val="22"/>
           <w:szCs w:val="22"/>
         </w:rPr>
-        <w:t xml:space="preserve">Rezultati Leave-One-Tournament-Out validacije su konzistentni sa rezultatima StratifiedGroupKFold po meču validacije. Razlike u ROC AUC između dve validacione šeme ne prelaze 0,02, što ukazuje da modeli ne pokazuju znake dramatične prenaučenosti specifičnostima jednog turnira, mada LOTO rezultati pokazuju nešto veću varijabilnost nego K-Fold (što je očekivano s obzirom na samo 3 turnira).</w:t>
+        <w:t xml:space="preserve">Rezultati Leave-One-Tournament-Out validacije su konzistentni sa rezultatima StratifiedGroupKFold po meču validacije. Prikaz po pojedinačnom turniru otkriva jasan obrazac: UEFA Euro 2024 dosledno daje najniži ROC AUC i posebno nizak PR AUC kao izostavljeni turnir za sva četiri modela, dok FIFA Svetsko prvenstvo 2022 daje najviši. Ovo je u skladu sa nalazom iz odeljka 4.1 da Euro 2024 ima nižu stopu konverzije šuteva u gol (7,5%), uz statistički nepromenjenu geometriju šuta, pa je predikcija na tom turniru intrinzično teža. Standardna devijacija kroz tri turnira je veća nego kroz K-Fold foldove (na primer 0,027 naspram 0,026 za ROC AUC Modela B, logistička regresija; kod PR AUC razlika je izraženija), što je očekivano jer LOTO meri generalizaciju na potpuno nov turnirski kontekst, a raspolaže sa samo tri folda. Prednost Modela B nad Modelom A održava se na svakom pojedinačnom izostavljenom turniru, ne samo u proseku.</w:t>
       </w:r>
     </w:p>
     <w:p>
@@ -5090,7 +7564,612 @@
           <w:sz w:val="22"/>
           <w:szCs w:val="22"/>
         </w:rPr>
-        <w:t xml:space="preserve">Za poređenje na nivou pojedinačnih šuteva, sprovedena je klasterska bootstrap analiza razlike ROC AUC na kompletnim out-of-fold (OOF) predikcijama iz svih LOTO foldova, gde se utakmice uzorkuju sa ponavljanjem (svi šutevi iz izabrane utakmice ulaze u bootstrap uzorak). Pooled OOF ROC AUC iznosi 0,713 za Model A i 0,709 za Model B. 95% bootstrap interval poverenja (2.000 iteracija, 166 utakmica kao klasteri) iznosi [-0,033, 0,025]. Interval sadrži nulu, što znači da na nivou pojedinačnog šuta razlika nije statistički značajna na alfa=0,05. Ovo je vredan nalaz koji zaslužuje transparentno prikazivanje: signal od 360 atributa je realan ali umeren. Na nivou turnira (LOTO validacija, Tabela 3), razlika je konzistentna i praktično smislena (+0,011 AUC). LR test potvrđuje da 360 atributi nose stvarnu inkrementalnu informaciju (p=2,97×10⁻¹⁰). Zaključak je da Model B pokazuje konzistentno numeričko poboljšanje kroz turnire i validacione šeme, ali je inkrementalni efekat umeren i interval poverenja dobijen klasterskim bootstrapom ne isključuje nultu razliku.</w:t>
+        <w:t xml:space="preserve">Za poređenje na nivou pojedinačnih šuteva, sprovedena je parna klasterska bootstrap analiza razlike ROC AUC na kompletnim out-of-fold (OOF) predikcijama iz svih LOTO foldova, pri čemu su predikcije Modela A i Modela B uparene po šutu (isti foldovi, iste opservacije). Uzorkovanje se vrši na nivou utakmica sa ponavljanjem (klaster bootstrap): u svakoj iteraciji bira se skup utakmica sa ponavljanjem, a svi šutevi iz izabrane utakmice ulaze u bootstrap uzorak. Ovo poštuje grupnu strukturu podataka, jer šutevi iz iste utakmice nisu međusobno nezavisni, pa je jedinica ponovnog uzorkovanja utakmica, a ne pojedinačni šut. Opažena razlika (Model B minus Model A) na spojenim (pooled) OOF predikcijama iznosi -0,004, a 95% bootstrap interval poverenja (2.000 iteracija, 166 utakmica kao klasteri) iznosi [-0,033, 0,025]. Interval sadrži nulu, što znači da na nivou pojedinačnog šuta, u ovoj konkretnoj (nekalibrisanoj, pooled) postavci, razlika nije statistički značajna na alfa = 0,05. Ovo je vredan nalaz koji zaslužuje transparentno prikazivanje: signal od 360 atributa je realan ali umeren. Na nivou turnira (LOTO validacija, Tabela 3), razlika je konzistentna i prisutna na svakom pojedinačnom turniru, a LR test potvrđuje da 360 atributi nose stvarnu inkrementalnu informaciju (p = 2,97×10⁻¹⁰). Zaključak je da Model B pokazuje konzistentno numeričko poboljšanje kroz turnire i validacione šeme, ali je inkrementalni efekat umeren i interval poverenja dobijen klasterskim bootstrapom u pooled postavci ne isključuje nultu razliku.</w:t>
+      </w:r>
+    </w:p>
+    <w:p>
+      <w:pPr>
+        <w:pStyle w:val="Heading2"/>
+      </w:pPr>
+      <w:r>
+        <w:t xml:space="preserve">4.3b. Usklađivanje AUC vrednosti: način agregiranja i uticaj kalibracije</w:t>
+      </w:r>
+    </w:p>
+    <w:p>
+      <w:pPr>
+        <w:spacing w:after="160" w:line="276"/>
+        <w:ind w:firstLine="397"/>
+        <w:jc w:val="both"/>
+      </w:pPr>
+      <w:r>
+        <w:rPr>
+          <w:rFonts w:ascii="Calibri" w:cs="Calibri" w:eastAsia="Calibri" w:hAnsi="Calibri"/>
+          <w:sz w:val="22"/>
+          <w:szCs w:val="22"/>
+        </w:rPr>
+        <w:t xml:space="preserve">Čitalac će primetiti prividnu nesaglasnost između ROC AUC vrednosti u Tabeli 3 (na primer 0,772 za Model B, logistička regresija, kao prosek preko turnira) i pooled OOF ROC AUC vrednosti korišćenih u klasterskoj bootstrap analizi (0,709 za Model B, 0,713 za Model A). Ova razlika NIJE prevashodno posledica post-hoc kalibracije, već potiče od dva odvojena, jasno razdvojiva izvora: (1) načina agregiranja AUC vrednosti, i (2) primene kalibracije na predikcije spojene preko turnira. Da bismo to razjasnili, izračunali smo obe agregacije i za kalibrisane i za nekalibrisane predikcije, na identičnom skupu out-of-fold opservacija iz LOTO validacije.</w:t>
+      </w:r>
+    </w:p>
+    <w:p>
+      <w:pPr>
+        <w:spacing w:after="160" w:line="276"/>
+        <w:ind w:firstLine="397"/>
+        <w:jc w:val="both"/>
+      </w:pPr>
+      <w:r>
+        <w:rPr>
+          <w:rFonts w:ascii="Calibri" w:cs="Calibri" w:eastAsia="Calibri" w:hAnsi="Calibri"/>
+          <w:sz w:val="22"/>
+          <w:szCs w:val="22"/>
+        </w:rPr>
+        <w:t xml:space="preserve">Prva razlika je u načinu agregiranja. Macro agregacija (prosek preko turnira, kako je prikazano u Tabeli 3) računa ROC AUC odvojeno unutar svakog izostavljenog turnira i potom uzima prosek ta tri broja. Pooled agregacija računa jedan jedini ROC AUC na svim spojenim out-of-fold predikcijama iz tri turnira. To su dve različite veličine i legitimno daju različite brojeve, jer pooled AUC istovremeno rangira šuteve iz tri turnira sa različitim baznim stopama golova (10,6% na SP 2022, 9,9% na EP 2020, 7,5% na EP 2024, videti odeljak 4.1).</w:t>
+      </w:r>
+    </w:p>
+    <w:p>
+      <w:pPr>
+        <w:spacing w:after="160" w:line="276"/>
+        <w:ind w:firstLine="397"/>
+        <w:jc w:val="both"/>
+      </w:pPr>
+      <w:r>
+        <w:rPr>
+          <w:rFonts w:ascii="Calibri" w:cs="Calibri" w:eastAsia="Calibri" w:hAnsi="Calibri"/>
+          <w:sz w:val="22"/>
+          <w:szCs w:val="22"/>
+        </w:rPr>
+        <w:t xml:space="preserve">Druga razlika je uticaj kalibracije upravo u pooled postavci. Izotona regresija je monotona transformacija i unutar jednog turnira ne menja poredak predikcija, pa je njen efekat na ROC AUC unutar turnira zanemarljiv (na primer, macro ROC AUC Modela A menja se sa 0,760 na 0,757, promena reda veličine 0,003). Ovo potvrđuje očekivanje da monotona kalibracija čuva rang. Međutim, kada se predikcije iz tri turnira SPOJE, nekalibrisane verovatnoće nose pomeraj nivoa specifičan za svaki turnir (posledica različitih baznih stopa i različitih trening skupova po LOTO foldu), što narušava zajednički poredak. Kalibracija fitovana unutar folda poravnava te nivoe između turnira i time popravlja pooled poredak. Zato u pooled postavci kalibracija podiže ROC AUC osetno (za Model A sa 0,713 na 0,753, za Model B sa 0,709 na 0,774), dok u macro postavci praktično ne menja ništa.</w:t>
+      </w:r>
+    </w:p>
+    <w:p>
+      <w:pPr>
+        <w:spacing w:after="240" w:before="60"/>
+        <w:jc w:val="center"/>
+      </w:pPr>
+      <w:r>
+        <w:rPr>
+          <w:rFonts w:ascii="Calibri" w:cs="Calibri" w:eastAsia="Calibri" w:hAnsi="Calibri"/>
+          <w:i/>
+          <w:iCs/>
+          <w:color w:val="444444"/>
+          <w:sz w:val="18"/>
+          <w:szCs w:val="18"/>
+        </w:rPr>
+        <w:t xml:space="preserve">Tabela 3a. Usklađivanje ROC AUC vrednosti po načinu agregiranja i stanju kalibracije, na identičnim out-of-fold opservacijama iz LOTO validacije (logistička regresija). Macro = prosek AUC-ova računatih odvojeno po turniru; pooled = jedan AUC na svim spojenim predikcijama.</w:t>
+      </w:r>
+    </w:p>
+    <w:tbl>
+      <w:tblPr>
+        <w:tblW w:type="dxa" w:w="9360"/>
+        <w:tblBorders>
+          <w:top w:val="single" w:color="auto" w:sz="4"/>
+          <w:left w:val="single" w:color="auto" w:sz="4"/>
+          <w:bottom w:val="single" w:color="auto" w:sz="4"/>
+          <w:right w:val="single" w:color="auto" w:sz="4"/>
+          <w:insideH w:val="single" w:color="auto" w:sz="4"/>
+          <w:insideV w:val="single" w:color="auto" w:sz="4"/>
+        </w:tblBorders>
+      </w:tblPr>
+      <w:tblGrid>
+        <w:gridCol w:w="3360"/>
+        <w:gridCol w:w="3000"/>
+        <w:gridCol w:w="3000"/>
+      </w:tblGrid>
+      <w:tr>
+        <w:trPr>
+          <w:tblHeader/>
+        </w:trPr>
+        <w:tc>
+          <w:tcPr>
+            <w:tcW w:type="dxa" w:w="3360"/>
+            <w:tcBorders>
+              <w:top w:val="single" w:color="BFBFBF" w:sz="4"/>
+              <w:left w:val="single" w:color="BFBFBF" w:sz="4"/>
+              <w:bottom w:val="single" w:color="BFBFBF" w:sz="4"/>
+              <w:right w:val="single" w:color="BFBFBF" w:sz="4"/>
+            </w:tcBorders>
+            <w:shd w:fill="1F3864" w:val="clear"/>
+            <w:tcMar>
+              <w:top w:type="dxa" w:w="80"/>
+              <w:left w:type="dxa" w:w="120"/>
+              <w:bottom w:type="dxa" w:w="80"/>
+              <w:right w:type="dxa" w:w="120"/>
+            </w:tcMar>
+            <w:vAlign w:val="center"/>
+          </w:tcPr>
+          <w:p>
+            <w:pPr>
+              <w:jc w:val="center"/>
+            </w:pPr>
+            <w:r>
+              <w:rPr>
+                <w:rFonts w:ascii="Calibri" w:cs="Calibri" w:eastAsia="Calibri" w:hAnsi="Calibri"/>
+                <w:b/>
+                <w:bCs/>
+                <w:color w:val="FFFFFF"/>
+                <w:sz w:val="19"/>
+                <w:szCs w:val="19"/>
+              </w:rPr>
+              <w:t xml:space="preserve">Model</w:t>
+            </w:r>
+          </w:p>
+        </w:tc>
+        <w:tc>
+          <w:tcPr>
+            <w:tcW w:type="dxa" w:w="3000"/>
+            <w:tcBorders>
+              <w:top w:val="single" w:color="BFBFBF" w:sz="4"/>
+              <w:left w:val="single" w:color="BFBFBF" w:sz="4"/>
+              <w:bottom w:val="single" w:color="BFBFBF" w:sz="4"/>
+              <w:right w:val="single" w:color="BFBFBF" w:sz="4"/>
+            </w:tcBorders>
+            <w:shd w:fill="1F3864" w:val="clear"/>
+            <w:tcMar>
+              <w:top w:type="dxa" w:w="80"/>
+              <w:left w:type="dxa" w:w="120"/>
+              <w:bottom w:type="dxa" w:w="80"/>
+              <w:right w:type="dxa" w:w="120"/>
+            </w:tcMar>
+            <w:vAlign w:val="center"/>
+          </w:tcPr>
+          <w:p>
+            <w:pPr>
+              <w:jc w:val="center"/>
+            </w:pPr>
+            <w:r>
+              <w:rPr>
+                <w:rFonts w:ascii="Calibri" w:cs="Calibri" w:eastAsia="Calibri" w:hAnsi="Calibri"/>
+                <w:b/>
+                <w:bCs/>
+                <w:color w:val="FFFFFF"/>
+                <w:sz w:val="19"/>
+                <w:szCs w:val="19"/>
+              </w:rPr>
+              <w:t xml:space="preserve">Macro (prosek po turniru)</w:t>
+            </w:r>
+          </w:p>
+        </w:tc>
+        <w:tc>
+          <w:tcPr>
+            <w:tcW w:type="dxa" w:w="3000"/>
+            <w:tcBorders>
+              <w:top w:val="single" w:color="BFBFBF" w:sz="4"/>
+              <w:left w:val="single" w:color="BFBFBF" w:sz="4"/>
+              <w:bottom w:val="single" w:color="BFBFBF" w:sz="4"/>
+              <w:right w:val="single" w:color="BFBFBF" w:sz="4"/>
+            </w:tcBorders>
+            <w:shd w:fill="1F3864" w:val="clear"/>
+            <w:tcMar>
+              <w:top w:type="dxa" w:w="80"/>
+              <w:left w:type="dxa" w:w="120"/>
+              <w:bottom w:type="dxa" w:w="80"/>
+              <w:right w:type="dxa" w:w="120"/>
+            </w:tcMar>
+            <w:vAlign w:val="center"/>
+          </w:tcPr>
+          <w:p>
+            <w:pPr>
+              <w:jc w:val="center"/>
+            </w:pPr>
+            <w:r>
+              <w:rPr>
+                <w:rFonts w:ascii="Calibri" w:cs="Calibri" w:eastAsia="Calibri" w:hAnsi="Calibri"/>
+                <w:b/>
+                <w:bCs/>
+                <w:color w:val="FFFFFF"/>
+                <w:sz w:val="19"/>
+                <w:szCs w:val="19"/>
+              </w:rPr>
+              <w:t xml:space="preserve">Pooled (svi OOF spojeni)</w:t>
+            </w:r>
+          </w:p>
+        </w:tc>
+      </w:tr>
+      <w:tr>
+        <w:tc>
+          <w:tcPr>
+            <w:tcW w:type="dxa" w:w="3360"/>
+            <w:tcBorders>
+              <w:top w:val="single" w:color="BFBFBF" w:sz="4"/>
+              <w:left w:val="single" w:color="BFBFBF" w:sz="4"/>
+              <w:bottom w:val="single" w:color="BFBFBF" w:sz="4"/>
+              <w:right w:val="single" w:color="BFBFBF" w:sz="4"/>
+            </w:tcBorders>
+            <w:shd w:fill="FFFFFF" w:val="clear"/>
+            <w:tcMar>
+              <w:top w:type="dxa" w:w="60"/>
+              <w:left w:type="dxa" w:w="120"/>
+              <w:bottom w:type="dxa" w:w="60"/>
+              <w:right w:type="dxa" w:w="120"/>
+            </w:tcMar>
+            <w:vAlign w:val="center"/>
+          </w:tcPr>
+          <w:p>
+            <w:pPr>
+              <w:jc w:val="left"/>
+            </w:pPr>
+            <w:r>
+              <w:rPr>
+                <w:rFonts w:ascii="Calibri" w:cs="Calibri" w:eastAsia="Calibri" w:hAnsi="Calibri"/>
+                <w:sz w:val="19"/>
+                <w:szCs w:val="19"/>
+              </w:rPr>
+              <w:t xml:space="preserve">Model A, nekalibrisano</w:t>
+            </w:r>
+          </w:p>
+        </w:tc>
+        <w:tc>
+          <w:tcPr>
+            <w:tcW w:type="dxa" w:w="3000"/>
+            <w:tcBorders>
+              <w:top w:val="single" w:color="BFBFBF" w:sz="4"/>
+              <w:left w:val="single" w:color="BFBFBF" w:sz="4"/>
+              <w:bottom w:val="single" w:color="BFBFBF" w:sz="4"/>
+              <w:right w:val="single" w:color="BFBFBF" w:sz="4"/>
+            </w:tcBorders>
+            <w:shd w:fill="FFFFFF" w:val="clear"/>
+            <w:tcMar>
+              <w:top w:type="dxa" w:w="60"/>
+              <w:left w:type="dxa" w:w="120"/>
+              <w:bottom w:type="dxa" w:w="60"/>
+              <w:right w:type="dxa" w:w="120"/>
+            </w:tcMar>
+            <w:vAlign w:val="center"/>
+          </w:tcPr>
+          <w:p>
+            <w:pPr>
+              <w:jc w:val="center"/>
+            </w:pPr>
+            <w:r>
+              <w:rPr>
+                <w:rFonts w:ascii="Calibri" w:cs="Calibri" w:eastAsia="Calibri" w:hAnsi="Calibri"/>
+                <w:sz w:val="19"/>
+                <w:szCs w:val="19"/>
+              </w:rPr>
+              <w:t xml:space="preserve">0,760</w:t>
+            </w:r>
+          </w:p>
+        </w:tc>
+        <w:tc>
+          <w:tcPr>
+            <w:tcW w:type="dxa" w:w="3000"/>
+            <w:tcBorders>
+              <w:top w:val="single" w:color="BFBFBF" w:sz="4"/>
+              <w:left w:val="single" w:color="BFBFBF" w:sz="4"/>
+              <w:bottom w:val="single" w:color="BFBFBF" w:sz="4"/>
+              <w:right w:val="single" w:color="BFBFBF" w:sz="4"/>
+            </w:tcBorders>
+            <w:shd w:fill="FFFFFF" w:val="clear"/>
+            <w:tcMar>
+              <w:top w:type="dxa" w:w="60"/>
+              <w:left w:type="dxa" w:w="120"/>
+              <w:bottom w:type="dxa" w:w="60"/>
+              <w:right w:type="dxa" w:w="120"/>
+            </w:tcMar>
+            <w:vAlign w:val="center"/>
+          </w:tcPr>
+          <w:p>
+            <w:pPr>
+              <w:jc w:val="center"/>
+            </w:pPr>
+            <w:r>
+              <w:rPr>
+                <w:rFonts w:ascii="Calibri" w:cs="Calibri" w:eastAsia="Calibri" w:hAnsi="Calibri"/>
+                <w:sz w:val="19"/>
+                <w:szCs w:val="19"/>
+              </w:rPr>
+              <w:t xml:space="preserve">0,713</w:t>
+            </w:r>
+          </w:p>
+        </w:tc>
+      </w:tr>
+      <w:tr>
+        <w:tc>
+          <w:tcPr>
+            <w:tcW w:type="dxa" w:w="3360"/>
+            <w:tcBorders>
+              <w:top w:val="single" w:color="BFBFBF" w:sz="4"/>
+              <w:left w:val="single" w:color="BFBFBF" w:sz="4"/>
+              <w:bottom w:val="single" w:color="BFBFBF" w:sz="4"/>
+              <w:right w:val="single" w:color="BFBFBF" w:sz="4"/>
+            </w:tcBorders>
+            <w:shd w:fill="F2F2F2" w:val="clear"/>
+            <w:tcMar>
+              <w:top w:type="dxa" w:w="60"/>
+              <w:left w:type="dxa" w:w="120"/>
+              <w:bottom w:type="dxa" w:w="60"/>
+              <w:right w:type="dxa" w:w="120"/>
+            </w:tcMar>
+            <w:vAlign w:val="center"/>
+          </w:tcPr>
+          <w:p>
+            <w:pPr>
+              <w:jc w:val="left"/>
+            </w:pPr>
+            <w:r>
+              <w:rPr>
+                <w:rFonts w:ascii="Calibri" w:cs="Calibri" w:eastAsia="Calibri" w:hAnsi="Calibri"/>
+                <w:sz w:val="19"/>
+                <w:szCs w:val="19"/>
+              </w:rPr>
+              <w:t xml:space="preserve">Model A, kalibrisano (izotona)</w:t>
+            </w:r>
+          </w:p>
+        </w:tc>
+        <w:tc>
+          <w:tcPr>
+            <w:tcW w:type="dxa" w:w="3000"/>
+            <w:tcBorders>
+              <w:top w:val="single" w:color="BFBFBF" w:sz="4"/>
+              <w:left w:val="single" w:color="BFBFBF" w:sz="4"/>
+              <w:bottom w:val="single" w:color="BFBFBF" w:sz="4"/>
+              <w:right w:val="single" w:color="BFBFBF" w:sz="4"/>
+            </w:tcBorders>
+            <w:shd w:fill="F2F2F2" w:val="clear"/>
+            <w:tcMar>
+              <w:top w:type="dxa" w:w="60"/>
+              <w:left w:type="dxa" w:w="120"/>
+              <w:bottom w:type="dxa" w:w="60"/>
+              <w:right w:type="dxa" w:w="120"/>
+            </w:tcMar>
+            <w:vAlign w:val="center"/>
+          </w:tcPr>
+          <w:p>
+            <w:pPr>
+              <w:jc w:val="center"/>
+            </w:pPr>
+            <w:r>
+              <w:rPr>
+                <w:rFonts w:ascii="Calibri" w:cs="Calibri" w:eastAsia="Calibri" w:hAnsi="Calibri"/>
+                <w:sz w:val="19"/>
+                <w:szCs w:val="19"/>
+              </w:rPr>
+              <w:t xml:space="preserve">0,757</w:t>
+            </w:r>
+          </w:p>
+        </w:tc>
+        <w:tc>
+          <w:tcPr>
+            <w:tcW w:type="dxa" w:w="3000"/>
+            <w:tcBorders>
+              <w:top w:val="single" w:color="BFBFBF" w:sz="4"/>
+              <w:left w:val="single" w:color="BFBFBF" w:sz="4"/>
+              <w:bottom w:val="single" w:color="BFBFBF" w:sz="4"/>
+              <w:right w:val="single" w:color="BFBFBF" w:sz="4"/>
+            </w:tcBorders>
+            <w:shd w:fill="F2F2F2" w:val="clear"/>
+            <w:tcMar>
+              <w:top w:type="dxa" w:w="60"/>
+              <w:left w:type="dxa" w:w="120"/>
+              <w:bottom w:type="dxa" w:w="60"/>
+              <w:right w:type="dxa" w:w="120"/>
+            </w:tcMar>
+            <w:vAlign w:val="center"/>
+          </w:tcPr>
+          <w:p>
+            <w:pPr>
+              <w:jc w:val="center"/>
+            </w:pPr>
+            <w:r>
+              <w:rPr>
+                <w:rFonts w:ascii="Calibri" w:cs="Calibri" w:eastAsia="Calibri" w:hAnsi="Calibri"/>
+                <w:sz w:val="19"/>
+                <w:szCs w:val="19"/>
+              </w:rPr>
+              <w:t xml:space="preserve">0,753</w:t>
+            </w:r>
+          </w:p>
+        </w:tc>
+      </w:tr>
+      <w:tr>
+        <w:tc>
+          <w:tcPr>
+            <w:tcW w:type="dxa" w:w="3360"/>
+            <w:tcBorders>
+              <w:top w:val="single" w:color="BFBFBF" w:sz="4"/>
+              <w:left w:val="single" w:color="BFBFBF" w:sz="4"/>
+              <w:bottom w:val="single" w:color="BFBFBF" w:sz="4"/>
+              <w:right w:val="single" w:color="BFBFBF" w:sz="4"/>
+            </w:tcBorders>
+            <w:shd w:fill="FFFFFF" w:val="clear"/>
+            <w:tcMar>
+              <w:top w:type="dxa" w:w="60"/>
+              <w:left w:type="dxa" w:w="120"/>
+              <w:bottom w:type="dxa" w:w="60"/>
+              <w:right w:type="dxa" w:w="120"/>
+            </w:tcMar>
+            <w:vAlign w:val="center"/>
+          </w:tcPr>
+          <w:p>
+            <w:pPr>
+              <w:jc w:val="left"/>
+            </w:pPr>
+            <w:r>
+              <w:rPr>
+                <w:rFonts w:ascii="Calibri" w:cs="Calibri" w:eastAsia="Calibri" w:hAnsi="Calibri"/>
+                <w:sz w:val="19"/>
+                <w:szCs w:val="19"/>
+              </w:rPr>
+              <w:t xml:space="preserve">Model B, nekalibrisano</w:t>
+            </w:r>
+          </w:p>
+        </w:tc>
+        <w:tc>
+          <w:tcPr>
+            <w:tcW w:type="dxa" w:w="3000"/>
+            <w:tcBorders>
+              <w:top w:val="single" w:color="BFBFBF" w:sz="4"/>
+              <w:left w:val="single" w:color="BFBFBF" w:sz="4"/>
+              <w:bottom w:val="single" w:color="BFBFBF" w:sz="4"/>
+              <w:right w:val="single" w:color="BFBFBF" w:sz="4"/>
+            </w:tcBorders>
+            <w:shd w:fill="FFFFFF" w:val="clear"/>
+            <w:tcMar>
+              <w:top w:type="dxa" w:w="60"/>
+              <w:left w:type="dxa" w:w="120"/>
+              <w:bottom w:type="dxa" w:w="60"/>
+              <w:right w:type="dxa" w:w="120"/>
+            </w:tcMar>
+            <w:vAlign w:val="center"/>
+          </w:tcPr>
+          <w:p>
+            <w:pPr>
+              <w:jc w:val="center"/>
+            </w:pPr>
+            <w:r>
+              <w:rPr>
+                <w:rFonts w:ascii="Calibri" w:cs="Calibri" w:eastAsia="Calibri" w:hAnsi="Calibri"/>
+                <w:sz w:val="19"/>
+                <w:szCs w:val="19"/>
+              </w:rPr>
+              <w:t xml:space="preserve">0,774</w:t>
+            </w:r>
+          </w:p>
+        </w:tc>
+        <w:tc>
+          <w:tcPr>
+            <w:tcW w:type="dxa" w:w="3000"/>
+            <w:tcBorders>
+              <w:top w:val="single" w:color="BFBFBF" w:sz="4"/>
+              <w:left w:val="single" w:color="BFBFBF" w:sz="4"/>
+              <w:bottom w:val="single" w:color="BFBFBF" w:sz="4"/>
+              <w:right w:val="single" w:color="BFBFBF" w:sz="4"/>
+            </w:tcBorders>
+            <w:shd w:fill="FFFFFF" w:val="clear"/>
+            <w:tcMar>
+              <w:top w:type="dxa" w:w="60"/>
+              <w:left w:type="dxa" w:w="120"/>
+              <w:bottom w:type="dxa" w:w="60"/>
+              <w:right w:type="dxa" w:w="120"/>
+            </w:tcMar>
+            <w:vAlign w:val="center"/>
+          </w:tcPr>
+          <w:p>
+            <w:pPr>
+              <w:jc w:val="center"/>
+            </w:pPr>
+            <w:r>
+              <w:rPr>
+                <w:rFonts w:ascii="Calibri" w:cs="Calibri" w:eastAsia="Calibri" w:hAnsi="Calibri"/>
+                <w:sz w:val="19"/>
+                <w:szCs w:val="19"/>
+              </w:rPr>
+              <w:t xml:space="preserve">0,709</w:t>
+            </w:r>
+          </w:p>
+        </w:tc>
+      </w:tr>
+      <w:tr>
+        <w:tc>
+          <w:tcPr>
+            <w:tcW w:type="dxa" w:w="3360"/>
+            <w:tcBorders>
+              <w:top w:val="single" w:color="BFBFBF" w:sz="4"/>
+              <w:left w:val="single" w:color="BFBFBF" w:sz="4"/>
+              <w:bottom w:val="single" w:color="BFBFBF" w:sz="4"/>
+              <w:right w:val="single" w:color="BFBFBF" w:sz="4"/>
+            </w:tcBorders>
+            <w:shd w:fill="F2F2F2" w:val="clear"/>
+            <w:tcMar>
+              <w:top w:type="dxa" w:w="60"/>
+              <w:left w:type="dxa" w:w="120"/>
+              <w:bottom w:type="dxa" w:w="60"/>
+              <w:right w:type="dxa" w:w="120"/>
+            </w:tcMar>
+            <w:vAlign w:val="center"/>
+          </w:tcPr>
+          <w:p>
+            <w:pPr>
+              <w:jc w:val="left"/>
+            </w:pPr>
+            <w:r>
+              <w:rPr>
+                <w:rFonts w:ascii="Calibri" w:cs="Calibri" w:eastAsia="Calibri" w:hAnsi="Calibri"/>
+                <w:sz w:val="19"/>
+                <w:szCs w:val="19"/>
+              </w:rPr>
+              <w:t xml:space="preserve">Model B, kalibrisano (izotona)</w:t>
+            </w:r>
+          </w:p>
+        </w:tc>
+        <w:tc>
+          <w:tcPr>
+            <w:tcW w:type="dxa" w:w="3000"/>
+            <w:tcBorders>
+              <w:top w:val="single" w:color="BFBFBF" w:sz="4"/>
+              <w:left w:val="single" w:color="BFBFBF" w:sz="4"/>
+              <w:bottom w:val="single" w:color="BFBFBF" w:sz="4"/>
+              <w:right w:val="single" w:color="BFBFBF" w:sz="4"/>
+            </w:tcBorders>
+            <w:shd w:fill="F2F2F2" w:val="clear"/>
+            <w:tcMar>
+              <w:top w:type="dxa" w:w="60"/>
+              <w:left w:type="dxa" w:w="120"/>
+              <w:bottom w:type="dxa" w:w="60"/>
+              <w:right w:type="dxa" w:w="120"/>
+            </w:tcMar>
+            <w:vAlign w:val="center"/>
+          </w:tcPr>
+          <w:p>
+            <w:pPr>
+              <w:jc w:val="center"/>
+            </w:pPr>
+            <w:r>
+              <w:rPr>
+                <w:rFonts w:ascii="Calibri" w:cs="Calibri" w:eastAsia="Calibri" w:hAnsi="Calibri"/>
+                <w:sz w:val="19"/>
+                <w:szCs w:val="19"/>
+              </w:rPr>
+              <w:t xml:space="preserve">0,771</w:t>
+            </w:r>
+          </w:p>
+        </w:tc>
+        <w:tc>
+          <w:tcPr>
+            <w:tcW w:type="dxa" w:w="3000"/>
+            <w:tcBorders>
+              <w:top w:val="single" w:color="BFBFBF" w:sz="4"/>
+              <w:left w:val="single" w:color="BFBFBF" w:sz="4"/>
+              <w:bottom w:val="single" w:color="BFBFBF" w:sz="4"/>
+              <w:right w:val="single" w:color="BFBFBF" w:sz="4"/>
+            </w:tcBorders>
+            <w:shd w:fill="F2F2F2" w:val="clear"/>
+            <w:tcMar>
+              <w:top w:type="dxa" w:w="60"/>
+              <w:left w:type="dxa" w:w="120"/>
+              <w:bottom w:type="dxa" w:w="60"/>
+              <w:right w:type="dxa" w:w="120"/>
+            </w:tcMar>
+            <w:vAlign w:val="center"/>
+          </w:tcPr>
+          <w:p>
+            <w:pPr>
+              <w:jc w:val="center"/>
+            </w:pPr>
+            <w:r>
+              <w:rPr>
+                <w:rFonts w:ascii="Calibri" w:cs="Calibri" w:eastAsia="Calibri" w:hAnsi="Calibri"/>
+                <w:sz w:val="19"/>
+                <w:szCs w:val="19"/>
+              </w:rPr>
+              <w:t xml:space="preserve">0,774</w:t>
+            </w:r>
+          </w:p>
+        </w:tc>
+      </w:tr>
+    </w:tbl>
+    <w:p>
+      <w:pPr>
+        <w:spacing w:after="160" w:line="276"/>
+        <w:ind w:firstLine="397"/>
+        <w:jc w:val="both"/>
+      </w:pPr>
+      <w:r>
+        <w:rPr>
+          <w:rFonts w:ascii="Calibri" w:cs="Calibri" w:eastAsia="Calibri" w:hAnsi="Calibri"/>
+          <w:sz w:val="22"/>
+          <w:szCs w:val="22"/>
+        </w:rPr>
+        <w:t xml:space="preserve">Praktične implikacije za tumačenje rada su tri. Prvo, vrednosti u Tabeli 3 su macro (prosek preko turnira) i kalibrisane, i kao takve su međusobno uporedive između modela. Drugo, pooled OOF vrednosti korišćene u bootstrap analizi (0,713 i 0,709) su nekalibrisane i pooled, i njih treba tumačiti samo unutar te postavke; njihova relativno niska apsolutna vrednost odražava težinu zajedničkog rangiranja tri heterogena turnira sa nekalibrisanim verovatnoćama, a ne slabost modela po sebi. Treće, u svim postavkama gde se poređenje vrši na uporedivim veličinama (macro nekalibrisano: 0,774 naspram 0,760; macro kalibrisano: 0,771 naspram 0,757; pooled kalibrisano: 0,774 naspram 0,753) Model B zadržava prednost nad Modelom A. Jedina postavka u kojoj Model B blago zaostaje jeste pooled nekalibrisano (0,709 naspram 0,713), što je upravo postavka najviše pogođena neusklađenošću nivoa verovatnoća između turnira.</w:t>
       </w:r>
     </w:p>
     <w:p>
@@ -5680,7 +8759,7 @@
           <w:sz w:val="22"/>
           <w:szCs w:val="22"/>
         </w:rPr>
-        <w:t xml:space="preserve">Kao dodatna provera robusnosti, ispitano je da li izbor scoring metrike za GridSearch menja zaključak o prednosti Modela B, korišćenjem nezavisnog, nekalibrisanog LOTO pipeline-a. Rezultat pokazuje da zaključak zavisi od izabranog kriterijuma: kada se hiperparametri biraju prema average_precision (metrika rangiranja), Model B blago zaostaje za Modelom A na AUC (0,709 naspram 0,713, delta=-0,004), iako zadržava bolji sirovi Brier skor (0,110 naspram 0,152). Kada se hiperparametri biraju prema neg_log_loss ili neg_brier_score (metrike koje direktno optimizuju kvalitet verovatnoća), Model B nadmašuje Model A na oba pokazatelja (AUC: 0,775 naspram 0,761, delta=+0,014; Brier: 0,074 naspram 0,076). Ovaj nalaz sugeriše da prednost dodatnih 360 atributa zavisi od toga da li se selekcija hiperparametara eksplicitno fokusira na kvalitet probabilističkih predikcija - što je i primaran cilj xG modelovanja - a ne isključivo na rangiranje. Napominjemo da apsolutne vrednosti AUC u ovoj proveri nisu direktno uporedive sa kalibrisanim rezultatima u Tabeli 3, budući da ova analiza koristi nekalibrisane predikcije radi izolovanja efekta scoring kriterijuma od efekta post-hoc kalibracije.</w:t>
+        <w:t xml:space="preserve">Kao dodatna provera robusnosti, ispitano je da li izbor scoring metrike za GridSearch menja zaključak o prednosti Modela B, korišćenjem nezavisnog, nekalibrisanog LOTO pipeline-a. Rezultat pokazuje da zaključak zavisi od izabranog kriterijuma: kada se hiperparametri biraju prema average_precision (metrika rangiranja), Model B blago zaostaje za Modelom A na pooled nekalibrisanom AUC (0,709 naspram 0,713, delta=-0,004; ovo su iste pooled nekalibrisane vrednosti razmatrane u odeljku 4.3b), iako zadržava bolji sirovi Brier skor (0,110 naspram 0,152). Kada se hiperparametri biraju prema neg_log_loss ili neg_brier_score (metrike koje direktno optimizuju kvalitet verovatnoća), Model B nadmašuje Model A na oba pokazatelja (AUC: 0,775 naspram 0,761, delta=+0,014; Brier: 0,074 naspram 0,076). Ovaj nalaz sugeriše da prednost dodatnih 360 atributa zavisi od toga da li se selekcija hiperparametara eksplicitno fokusira na kvalitet probabilističkih predikcija - što je i primaran cilj xG modelovanja - a ne isključivo na rangiranje. Kao što je pokazano u odeljku 4.3b, apsolutne vrednosti AUC u ovoj proveri nisu direktno uporedive sa kalibrisanim, macro-agregiranim rezultatima u Tabeli 3, budući da ova provera koristi nekalibrisane, pooled predikcije radi izolovanja efekta scoring kriterijuma od efekta post-hoc kalibracije.</w:t>
       </w:r>
     </w:p>
     <w:p>
@@ -7352,38 +10431,12 @@
         <w:jc w:val="both"/>
       </w:pPr>
       <w:r>
-        <w:drawing>
-          <wp:inline xmlns:a="http://schemas.openxmlformats.org/drawingml/2006/main" xmlns:pic="http://schemas.openxmlformats.org/drawingml/2006/picture">
-            <wp:extent cx="5029200" cy="1676400"/>
-            <wp:docPr id="1" name="Picture 1"/>
-            <wp:cNvGraphicFramePr>
-              <a:graphicFrameLocks noChangeAspect="1"/>
-            </wp:cNvGraphicFramePr>
-            <a:graphic>
-              <a:graphicData uri="http://schemas.openxmlformats.org/drawingml/2006/picture">
-                <pic:pic>
-                  <pic:nvPicPr>
-                    <pic:cNvPr id="0" name="visibility_distribution.png"/>
-                    <pic:cNvPicPr/>
-                  </pic:nvPicPr>
-                  <pic:blipFill>
-                    <a:blip r:embed="rId10"/>
-                    <a:stretch>
-                      <a:fillRect/>
-                    </a:stretch>
-                  </pic:blipFill>
-                  <pic:spPr>
-                    <a:xfrm>
-                      <a:off x="0" y="0"/>
-                      <a:ext cx="5029200" cy="1676400"/>
-                    </a:xfrm>
-                    <a:prstGeom prst="rect"/>
-                  </pic:spPr>
-                </pic:pic>
-              </a:graphicData>
-            </a:graphic>
-          </wp:inline>
-        </w:drawing>
+        <w:rPr>
+          <w:rFonts w:ascii="Calibri" w:cs="Calibri" w:eastAsia="Calibri" w:hAnsi="Calibri"/>
+          <w:sz w:val="22"/>
+          <w:szCs w:val="22"/>
+        </w:rPr>
+        <w:t xml:space="preserve">[SLIKA: visibility_distribution.png]</w:t>
       </w:r>
     </w:p>
     <w:p>
@@ -8443,7 +11496,7 @@
           <w:sz w:val="22"/>
           <w:szCs w:val="22"/>
         </w:rPr>
-        <w:t xml:space="preserve">Ovaj nalaz je u skladu sa postojećom literaturom o doprinosu prostornih podataka xG modelima, uključujući i sopstvenu praksu kompanije StatsBomb. Rad ne tvrdi da je po prvi put otkrio da prostorni podaci poboljšavaju xG procenu; doprinos ovog rada je u tome što je taj poznati nalaz formalno i transparentno provjeren kroz Leave-One-Tournament-Out validacionu šemu, koja u dostupnoj literaturi nije uobičajeno kombinovana sa modelom na nivou pojedinačnog šuta i StatsBomb 360 atributima.</w:t>
+        <w:t xml:space="preserve">Ovaj nalaz je u skladu sa postojećom literaturom o doprinosu prostornih podataka xG modelima, uključujući i sopstvenu praksu kompanije StatsBomb. Rad ne tvrdi da je po prvi put otkrio da prostorni podaci poboljšavaju xG procenu; doprinos ovog rada je u tome što je taj poznati nalaz formalno i transparentno proveren kroz Leave-One-Tournament-Out validacionu šemu, koja u dostupnoj literaturi nije uobičajeno kombinovana sa modelom na nivou pojedinačnog šuta i StatsBomb 360 atributima.</w:t>
       </w:r>
     </w:p>
     <w:p>
@@ -8632,15 +11685,7 @@
           <w:sz w:val="22"/>
           <w:szCs w:val="22"/>
         </w:rPr>
-        <w:t xml:space="preserve">Osmo, StatsBomb koordinatni sistem (120x80) tretiran je kao yard-ekvivalentan na osnovu toga što standardne yard dimenzije fudbalskog terena numerički odgovaraju koordinatama u StatsBomb dokumentaciji (6, 12 i 18 koordinatnih jedinica za kazneni prostor). StatsBomb formalno ne naziva ove jedinice jardima, ali konzistentnost sa standardnim dimenzijama podržava ovu interpretaciju. Svi geometrijski proračuni sprovedeni su dosledno unutar ovog sistema (c=8 za širinu gola, radijus=10 za pritisak).</w:t>
-      </w:r>
-    </w:p>
-    <w:p>
-      <w:pPr>
-        <w:pStyle w:val="Heading1"/>
-      </w:pPr>
-      <w:r>
-        <w:t xml:space="preserve">6. Zaključak</w:t>
+        <w:t xml:space="preserve">Osmo, i verovatno najvažnije po pitanju prirode ulaznih podataka: StatsBomb 360 freeze-frame je statički snimak pozicija igrača u jednom trenutku (u trenutku samog događaja), a ne kontinuirani tracking podatak. Za razliku od pravih tracking sistema, koji beleže lokaciju, brzinu i smer kretanja svih 22 igrača više puta u sekundi (StatsBomb navodi 25 puta u sekundi za tracking, naspram jednog kadra po događaju kod 360 podataka), freeze-frame beleži samo raspored u jednoj vremenskoj tački. Pozicije u freeze-frame kadru su rezultat anotacije od strane StatsBomb-ovih anotatora (data collectors), a ne rezultat automatskog optičkog trackinga, pa mogu sadržati grešku lokalizacije ili anotacije; sam StatsBomb, opisujući srodne modele, pominje uticaj fidelity-ja prikupljenih lokacija i sklonost anotatora ka zaokruživanju koordinata (Sharpe, 2024). Posledice po ovaj rad su konkretne: statički kadar u trenutku šuta ne obuhvata (a) brzinu i pravac kretanja napadača i lopte, (b) brzinu i smer kretanja branilaca i golmana, (c) prethodni pas ili sekvencu događaja koja je dovela do šuta, (d) orijentaciju tela igrača (na primer, da li je golman već u pokretu ili balansiran), niti (e) vreme koje golman i branioci realno imaju da reaguju. Svi prostorni atributi u Modelu B (udaljenost golmana, defanzivni pritisak, branioci u konusu šuta) izvedeni su isključivo iz ove statičke geometrije, pa treba imati u vidu da oni aproksimiraju situaciju u jednom trenutku i ne modeluju dinamiku razvoja šanse. Ovo istovremeno objašnjava zašto je inkrementalni doprinos 360 atributa realan ali umeren i ocrtava jasan pravac za buduća istraživanja zasnovana na potpunim tracking podacima.</w:t>
       </w:r>
     </w:p>
     <w:p>
@@ -8655,7 +11700,15 @@
           <w:sz w:val="22"/>
           <w:szCs w:val="22"/>
         </w:rPr>
-        <w:t xml:space="preserve">Ovaj rad je testirao da li StatsBomb 360 prostorni podaci o rasporedu igrača na terenu doprinose proceni verovatnoće gola u odnosu na model koji koristi samo klasične atribute samog šuta. Analiza na 3.968 šuteva iz tri velika međunarodna turnira (Svetsko prvenstvo 2022, Evropsko prvenstvo 2020 i Evropsko prvenstvo 2024) pokazala je da model sa StatsBomb 360 atributima konzistentno poboljšava ROC AUC i PR AUC u odnosu na model bez njih, dok su razlike u kalibrisanom Brier skoru male ali dosledne, i u standardnoj unakrsnoj validaciji i u validaciji koja simulira primenu na potpuno nov turnir.</w:t>
+        <w:t xml:space="preserve">Deveto, StatsBomb koordinatni sistem (120x80) tretiran je kao yard-ekvivalentan na osnovu toga što standardne yard dimenzije fudbalskog terena numerički odgovaraju koordinatama u StatsBomb dokumentaciji (6, 12 i 18 koordinatnih jedinica za kazneni prostor). StatsBomb formalno ne naziva ove jedinice jardima, ali konzistentnost sa standardnim dimenzijama podržava ovu interpretaciju. Svi geometrijski proračuni sprovedeni su dosledno unutar ovog sistema (c=8 za širinu gola, radijus=10 za pritisak).</w:t>
+      </w:r>
+    </w:p>
+    <w:p>
+      <w:pPr>
+        <w:pStyle w:val="Heading1"/>
+      </w:pPr>
+      <w:r>
+        <w:t xml:space="preserve">6. Zaključak</w:t>
       </w:r>
     </w:p>
     <w:p>
@@ -8670,7 +11723,7 @@
           <w:sz w:val="22"/>
           <w:szCs w:val="22"/>
         </w:rPr>
-        <w:t xml:space="preserve">Udaljenost golmana iz freeze-frame podataka (goalkeeper_distance_360) pokazala se kao najuticajniji 360 prediktor u fitovanom XGBoost modelu, odmah iza ugla šuta. Otvorenost ugla ka golu (open_angle_ratio_360), iako uključena u Model B, rangira se tek na 14. mestu po SHAP važnosti i nije pokazala samostalan inkrementalni doprinos u ablation analizi; eventualna vrednost u punom modelu može odražavati redundanciju sa drugim prostornim atributima. Ovo je nalaz o prediktivnoj asocijaciji, ne o uzročnom efektu. Istovremeno, nije pronađen dokaz da se marginalne raspodele udaljenosti i ugla šuta razlikuju između turnira (KS test); razlika u konverziji stoga nije objašnjena tim dvema posmatranim geometrijskim karakteristikama, a mogući izvori uključuju završnicu, golmanski učinak i slučajnu varijaciju.</w:t>
+        <w:t xml:space="preserve">Ovaj rad je testirao da li StatsBomb 360 prostorni podaci o rasporedu igrača na terenu doprinose proceni verovatnoće gola u odnosu na model koji koristi samo klasične atribute samog šuta. Analiza na 3.968 šuteva iz tri velika međunarodna turnira (Svetsko prvenstvo 2022, Evropsko prvenstvo 2020 i Evropsko prvenstvo 2024) pokazala je da model sa StatsBomb 360 atributima konzistentno poboljšava ROC AUC i PR AUC u odnosu na model bez njih, dok su razlike u kalibrisanom Brier skoru male ali dosledne, i u standardnoj unakrsnoj validaciji i u validaciji koja simulira primenu na potpuno nov turnir.</w:t>
       </w:r>
     </w:p>
     <w:p>
@@ -8685,6 +11738,21 @@
           <w:sz w:val="22"/>
           <w:szCs w:val="22"/>
         </w:rPr>
+        <w:t xml:space="preserve">Udaljenost golmana iz freeze-frame podataka (goalkeeper_distance_360) pokazala se kao najuticajniji 360 prediktor u fitovanom XGBoost modelu, odmah iza ugla šuta. Otvorenost ugla ka golu (open_angle_ratio_360), iako uključena u Model B, rangira se tek na 14. mestu po SHAP važnosti i nije pokazala samostalan inkrementalni doprinos u ablation analizi; eventualna vrednost u punom modelu može odražavati redundanciju sa drugim prostornim atributima. Ovo je nalaz o prediktivnoj asocijaciji, ne o uzročnom efektu. Istovremeno, nije pronađen dokaz da se marginalne raspodele udaljenosti i ugla šuta razlikuju između turnira (KS test); razlika u konverziji stoga nije objašnjena tim dvema posmatranim geometrijskim karakteristikama, a mogući izvori uključuju završnicu, golmanski učinak i slučajnu varijaciju.</w:t>
+      </w:r>
+    </w:p>
+    <w:p>
+      <w:pPr>
+        <w:spacing w:after="160" w:line="276"/>
+        <w:ind w:firstLine="397"/>
+        <w:jc w:val="both"/>
+      </w:pPr>
+      <w:r>
+        <w:rPr>
+          <w:rFonts w:ascii="Calibri" w:cs="Calibri" w:eastAsia="Calibri" w:hAnsi="Calibri"/>
+          <w:sz w:val="22"/>
+          <w:szCs w:val="22"/>
+        </w:rPr>
         <w:t xml:space="preserve">Doprinos ovog rada nije u tvrdnji da su prostorni podaci korisni za xG procenu, jer je taj nalaz već prisutan u literaturi i u praksi komercijalnih provajdera, već u formalnoj, transparentnoj i reproducibilnoj proveri tog nalaza kroz Leave-One-Tournament-Out validacionu šemu na nivou pojedinačnog šuta, što predstavlja precizniji i uži, ali metodološki rigorozniji doprinos postojećoj literaturi o fudbalskoj analitici.</w:t>
       </w:r>
     </w:p>
@@ -8736,6 +11804,20 @@
           <w:szCs w:val="22"/>
         </w:rPr>
         <w:t xml:space="preserve">Iapteff, L., Le Coz, S., Rioland, M., Houde, T., Carling, C., &amp; Imbach, F. (2025). Toward interpretable expected goals modeling using Bayesian mixed models. Frontiers in Sports and Active Living, 7, 1504362. https://doi.org/10.3389/fspor.2025.1504362</w:t>
+      </w:r>
+    </w:p>
+    <w:p>
+      <w:pPr>
+        <w:spacing w:after="160" w:line="276"/>
+        <w:jc w:val="both"/>
+      </w:pPr>
+      <w:r>
+        <w:rPr>
+          <w:rFonts w:ascii="Calibri" w:cs="Calibri" w:eastAsia="Calibri" w:hAnsi="Calibri"/>
+          <w:sz w:val="22"/>
+          <w:szCs w:val="22"/>
+        </w:rPr>
+        <w:t xml:space="preserve">Sharpe, C. (2024, avgust 13). xPass 360: Upgrading Expected Pass Models. Hudl StatsBomb. https://statsbomb.com/articles/soccer/xpass-360-upgrading-expected-pass-xpass-models/</w:t>
       </w:r>
     </w:p>
     <w:p>

</xml_diff>